<commit_message>
Figure 7 calibration and validation results, hour-scale kinetics for the schedule case studies, number-filling order fix
Co-Authored-By: Claude Fable 5.1 <noreply@anthropic.com>
Claude-Session: https://claude.ai/code/session_01PjfG7i2deAXT3znmpkGkmY
</commit_message>
<xml_diff>
--- a/paper/manuscript/manuscript.docx
+++ b/paper/manuscript/manuscript.docx
@@ -68,7 +68,7 @@
         <w:pStyle w:val="Abstract"/>
       </w:pPr>
       <w:r>
-        <w:t xml:space="preserve">Non-genetic heterogeneity, and in particular expression states that are inherited across cell divisions, decides which cancer cells survive drug treatment, yet the simulators used to benchmark single-cell methods model neither cell growth nor division, and therefore cannot generate such states from first principles. We present Biomodelling.jl 2.0, a rewrite of a Julia framework for stochastic simulation of gene regulatory networks inside growing, dividing and drug-treated cell populations. The framework couples exact, hybrid and adaptive stochastic kinetics to exponential growth, volume-scaled transcription, gene replication, division with binomial partitioning and promoter inheritance, and population control; adds dose schedules, state-dependent death, growth inhibition and genetic perturbations; records every cell’s lineage; converts molecule counts into scRNA-seq, smFISH and time-lapse observations; and provides likelihood-free inference. We validate the engine against exact stationary distributions and an independent implementation, show that growth and division alone reproduce published results on cell-size scaling, partitioning noise, lineage-versus-population statistics and cell-cycle-dependent bursting, and demonstrate that a single resistance gene with slow promoter switching reproduces the signatures of drug-tolerant persisters reported in recent experiments and models: dose-dependent decay with unchanged division times, correlated fates of related cells, preserved or collapsed barcode diversity, loss of resistance when memory is disrupted during exposure, an intermediate-dose optimum for drug-induced tolerance, and stable inheritance of a selected phenotype. Used as a ground-truth generator, the framework evaluates memory-gene detection, network inference under the confounds of growth and sequencing, imputation and perturbation-prediction baselines; used as an inference engine, it recovers kinetic and drug parameters from snapshot and lineage data and quantifies the bias of ignoring division. Biomodelling.jl 2.0 is open source (MIT) at https://github.com/ayoublasri/Biomodelling.jl.</w:t>
+        <w:t xml:space="preserve">Non-genetic heterogeneity, and in particular expression states that are inherited across cell divisions, decides which cancer cells survive drug treatment, yet the simulators used to benchmark single-cell methods model neither cell growth nor division, and therefore cannot generate such states from first principles. We present Biomodelling.jl 2.0, a rewrite of a Julia framework for stochastic simulation of gene regulatory networks inside growing, dividing and drug-treated cell populations. The framework couples exact, hybrid and adaptive stochastic kinetics to exponential growth, volume-scaled transcription, gene replication, division with binomial partitioning and promoter inheritance, and population control; adds dose schedules, state-dependent death, growth inhibition and genetic perturbations; records every cell’s lineage; converts molecule counts into scRNA-seq, smFISH and time-lapse observations; and provides likelihood-free inference. We validate the engine against exact stationary distributions and an independent implementation, show that growth and division alone reproduce published results on cell-size scaling, partitioning noise, lineage-versus-population statistics and cell-cycle-dependent bursting, and demonstrate that a single resistance gene with slow promoter switching reproduces the signatures of drug-tolerant persisters reported in recent experiments and models: dose-dependent decay with unchanged division times, correlated fates of related cells, preserved or collapsed barcode diversity, loss of resistance when memory is disrupted during exposure, an intermediate-dose optimum for drug-induced tolerance, and stable inheritance of a selected phenotype. Used as a ground-truth generator, the framework evaluates memory-gene detection, network inference under the confounds of growth and sequencing, imputation and perturbation-prediction baselines; used as an inference engine, it recovers kinetic and drug parameters from snapshot and lineage data and quantifies the bias of ignoring division. Calibrated to published time-lapse measurements of cisplatin-treated cells, the persister model predicts the fates of cells at a held-out concentration, the biphasic kill curve, the extent of lineage correlations and the dose-invariance of single-cell timing; used as a schedule testbed with a built-in optimiser, it reproduces the outcomes of continuous versus intermittent BRAF/MEK inhibition in the SWOG S1320 trial and of intermittent dosing in xenografts, attributes their difference to the fitness of resistant cells without drug, and evaluates standard against dose-dense temozolomide regimens with pharmacokinetics. Biomodelling.jl 2.0 is open source (MIT) at https://github.com/ayoublasri/Biomodelling.jl.</w:t>
       </w:r>
     </w:p>
     <w:bookmarkStart w:id="9" w:name="introduction"/>
@@ -199,11 +199,11 @@
         <w:pStyle w:val="BodyText"/>
       </w:pPr>
       <w:r>
-        <w:t xml:space="preserve">We validate the engine against exact stationary distributions and against JumpProcesses.jl, show that growth, division and partitioning alone reproduce published results on cell-size scaling, partitioning noise, lineage-versus-population statistics and cell-cycle-dependent bursting, and demonstrate that a single resistance gene with slow promoter switching reproduces the quantitative signatures of drug-tolerant persisters reported in recent experimental and theoretical work: dose-dependent population decay with unchanged single-cell division times, correlated fates of related cells, preserved or collapsed barcode diversity, loss of resistance when memory is disrupted during exposure, an intermediate-dose optimum for drug-induced tolerance, and stable inheritance of a selected phenotype. We then use the framework as a ground-truth generator to evaluate memory-gene detection, network inference under the confounds of growth and sequencing, imputation, and perturbation-prediction baselines, and finally show that the same forward model supports parameter inference from snapshot and lineage data and quantifies the bias incurred by ignoring division.</w:t>
+        <w:t xml:space="preserve">We validate the engine against exact stationary distributions and against JumpProcesses.jl, show that growth, division and partitioning alone reproduce published results on cell-size scaling, partitioning noise, lineage-versus-population statistics and cell-cycle-dependent bursting, and demonstrate that a single resistance gene with slow promoter switching reproduces the quantitative signatures of drug-tolerant persisters reported in recent experimental and theoretical work: dose-dependent population decay with unchanged single-cell division times, correlated fates of related cells, preserved or collapsed barcode diversity, loss of resistance when memory is disrupted during exposure, an intermediate-dose optimum for drug-induced tolerance, and stable inheritance of a selected phenotype. We then use the framework as a ground-truth generator to evaluate memory-gene detection, network inference under the confounds of growth and sequencing, imputation, and perturbation-prediction baselines, show that the same forward model supports parameter inference from snapshot and lineage data and quantifies the bias incurred by ignoring division, calibrate the persister model to published time-lapse data and validate it on held-out conditions, and finally use it, with a built-in schedule optimiser, to evaluate clinical dosing regimens and to search for better ones.</w:t>
       </w:r>
     </w:p>
     <w:bookmarkEnd w:id="9"/>
-    <w:bookmarkStart w:id="16" w:name="results"/>
+    <w:bookmarkStart w:id="18" w:name="results"/>
     <w:p>
       <w:pPr>
         <w:pStyle w:val="Heading1"/>
@@ -2157,12 +2157,235 @@
         <w:pStyle w:val="FirstParagraph"/>
       </w:pPr>
       <w:r>
-        <w:t xml:space="preserve">On a snapshot of 2 000 non-dividing cells, ABC-SMC with log-uniform priors concentrates on the true telegraph parameters and agrees with the exact maximum-likelihood estimate (Figure 6a; posterior medians (0.47, 1.40, 26.8) for truth (0.3, 0.6, 20)). On a snapshot of a growing and dividing population with volume-scaled transcription and mid-cycle replication, the naive telegraph fit is biased (k_on = 0.47, k_off = 1.95, k_tx = 71.5) because volume and copy number inflate counts and their dispersion, whereas ABC with the population simulator as forward model recovers the truth ((0.58, 1.87, 25.1); Figure 6b). Drug parameters are also identifiable from population data: from a kill curve and the concordance of sister fates, the death rate and the protection threshold are recovered with posterior medians [abc_c] for truth (0.5, 150) (Figure 6c), and posterior predictive kill curves simulated at the posterior median envelope the observed one (Figure 6d).</w:t>
+        <w:t xml:space="preserve">On a snapshot of 2 000 non-dividing cells, ABC-SMC with log-uniform priors over three decades and the Wasserstein distance between simulated and observed counts</w:t>
+      </w:r>
+      <w:r>
+        <w:t xml:space="preserve"> </w:t>
+      </w:r>
+      <w:r>
+        <w:t xml:space="preserve">(Bernton et al. 2019)</w:t>
+      </w:r>
+      <w:r>
+        <w:t xml:space="preserve"> </w:t>
+      </w:r>
+      <w:r>
+        <w:t xml:space="preserve">concentrates on the true telegraph parameters and agrees with the exact maximum-likelihood estimate (Figure 6a; posterior medians (0.31, 0.60, 20.9) for truth (0.3, 0.6, 20)), with the broadest posterior on k_off, the parameter that a single snapshot constrains least. On a snapshot of a growing and dividing population with volume-scaled transcription and mid-cycle replication, the naive telegraph fit is biased (k_on = 0.47, k_off = 1.95, k_tx = 71.5) because volume and copy number inflate counts and their dispersion, whereas ABC with the population simulator as forward model recovers the truth ((0.30, 0.68, 20.8); Figure 6b). Drug parameters can be inferred from population data in the same way: from a kill curve and the concordance of sister fates, the posterior over the maximal death rate and the protection threshold is a ridge (weighted correlation of log h_max and log K of -0.85) on which the truth (0.5, 150) lies (Figure 6c), and posterior predictive kill curves simulated at the posterior median reproduce the observed one (Figure 6d): the two summaries constrain the product of death rate and unprotected fraction, and separating the two parameters requires a measurement of the protective protein, an example of the experimental-design questions the forward model can answer before an experiment is run.</w:t>
       </w:r>
     </w:p>
     <w:bookmarkEnd w:id="15"/>
+    <w:bookmarkStart w:id="16" w:name="X9127e981dd342706dc2bd484113b0f729438709"/>
+    <w:p>
+      <w:pPr>
+        <w:pStyle w:val="Heading2"/>
+      </w:pPr>
+      <w:r>
+        <w:t xml:space="preserve">The persister model calibrates to laboratory time-lapse data and predicts held-out conditions</w:t>
+      </w:r>
+    </w:p>
+    <w:p>
+      <w:pPr>
+        <w:pStyle w:val="FirstParagraph"/>
+      </w:pPr>
+      <w:r>
+        <w:t xml:space="preserve">A simulator is only useful for treatment questions if it can be fitted to the data a laboratory actually produces and then predicts what it was not fitted to. We therefore calibrated the resistance-gene model to the time-lapse measurements of</w:t>
+      </w:r>
+      <w:r>
+        <w:t xml:space="preserve"> </w:t>
+      </w:r>
+      <w:r>
+        <w:t xml:space="preserve">Iyer et al. (2025)</w:t>
+      </w:r>
+      <w:r>
+        <w:t xml:space="preserve">, who tracked U2OS cells for three days under 7, 10 and 13 µM cisplatin and recorded, for every cell present at drug addition, whether it died, divided or survived without dividing (Table S3). Six parameters (promoter switching rates, maximal death rate, EC</w:t>
+      </w:r>
+      <m:oMath>
+        <m:sSub>
+          <m:e>
+            <m:r>
+              <m:t>​</m:t>
+            </m:r>
+          </m:e>
+          <m:sub>
+            <m:r>
+              <m:t>50</m:t>
+            </m:r>
+          </m:sub>
+        </m:sSub>
+      </m:oMath>
+      <w:r>
+        <w:t xml:space="preserve"> </w:t>
+      </w:r>
+      <w:r>
+        <w:t xml:space="preserve">and Hill coefficient of death, IC</w:t>
+      </w:r>
+      <m:oMath>
+        <m:sSub>
+          <m:e>
+            <m:r>
+              <m:t>​</m:t>
+            </m:r>
+          </m:e>
+          <m:sub>
+            <m:r>
+              <m:t>50</m:t>
+            </m:r>
+          </m:sub>
+        </m:sSub>
+      </m:oMath>
+      <w:r>
+        <w:t xml:space="preserve"> </w:t>
+      </w:r>
+      <w:r>
+        <w:t xml:space="preserve">of growth arrest) were fitted to the fate fractions at 7 and 13 µM by simulated moments with common random numbers, with a weak prior keeping the memory of the resistant state near the two to three generations that the same study inferred from lineage correlations (Methods). The calibrated model (Figure 7f; memory 2.8 generations, resistant fraction 15.2%, EC</w:t>
+      </w:r>
+      <m:oMath>
+        <m:sSub>
+          <m:e>
+            <m:r>
+              <m:t>​</m:t>
+            </m:r>
+          </m:e>
+          <m:sub>
+            <m:r>
+              <m:t>50</m:t>
+            </m:r>
+          </m:sub>
+        </m:sSub>
+      </m:oMath>
+      <w:r>
+        <w:t xml:space="preserve"> </w:t>
+      </w:r>
+      <w:r>
+        <w:t xml:space="preserve">16.7 µM) reproduces the training fractions with a root-mean-square error of 0.071 and predicts the held-out 10 µM condition with an error of 0.093 (observed died, divided and survived fractions 0.28, 0.31 and 0.41; predicted 0.39, 0.20 and 0.41; Figure 7a). Properties that were not fitted can then be compared with the data. Death fates are correlated between sisters (0.09), first cousins (0.06) and second cousins (0.05) and the correlation decays to 0.02 for third cousins and 0.00 for unrelated cells (Figure 7c), the pattern reported for HCT116 lineages. The mean time to death changes by only 8% between 7 and 13 µM while the death fraction rises from 0.13 to 0.59 (Figure 7d), the dose-invariance of single-cell timing that motivated the original study, and arises here because the dose changes the fraction of unprotected cells rather than their kinetics. The predicted kill curves (Figure 7b) are steeper at 13 µM in their first two days than in their second half (1.5-fold), but the calibrated memory of 2.8 generations is too short to produce the plateau that HCT116 cells reach after about 100 h: in the model, cells leave the resistant state within days and are then killed. Reproducing the plateau requires a longer memory or a drug-induced stabilisation of the resistant state, which is exactly the kind of conclusion a calibrated forward model can draw and a lineage-tracing experiment can test. The calibration landscape (Figure 7e) shows how the fitted death rate and EC</w:t>
+      </w:r>
+      <m:oMath>
+        <m:sSub>
+          <m:e>
+            <m:r>
+              <m:t>​</m:t>
+            </m:r>
+          </m:e>
+          <m:sub>
+            <m:r>
+              <m:t>50</m:t>
+            </m:r>
+          </m:sub>
+        </m:sSub>
+      </m:oMath>
+      <w:r>
+        <w:t xml:space="preserve"> </w:t>
+      </w:r>
+      <w:r>
+        <w:t xml:space="preserve">are constrained by the fate fractions alone; the same protocol, with the same functions, applies to any observable that a laboratory records.</w:t>
+      </w:r>
+    </w:p>
     <w:bookmarkEnd w:id="16"/>
-    <w:bookmarkStart w:id="17" w:name="discussion"/>
+    <w:bookmarkStart w:id="17" w:name="Xd56bc4e7d40795b987986d7bf1b24271e096039"/>
+    <w:p>
+      <w:pPr>
+        <w:pStyle w:val="Heading2"/>
+      </w:pPr>
+      <w:r>
+        <w:t xml:space="preserve">Dose and schedule optimisation against clinical regimens</w:t>
+      </w:r>
+    </w:p>
+    <w:p>
+      <w:pPr>
+        <w:pStyle w:val="FirstParagraph"/>
+      </w:pPr>
+      <w:r>
+        <w:t xml:space="preserve">With a calibrated model the framework becomes a schedule testbed. We first asked which dosing schedule minimises regrowth for a melanoma-like population with a rare, heritable pre-resistant state</w:t>
+      </w:r>
+      <w:r>
+        <w:t xml:space="preserve"> </w:t>
+      </w:r>
+      <w:r>
+        <w:t xml:space="preserve">(Shaffer et al. 2017)</w:t>
+      </w:r>
+      <w:r>
+        <w:t xml:space="preserve"> </w:t>
+      </w:r>
+      <w:r>
+        <w:t xml:space="preserve">treated at a fractional-killing dose, comparing continuous dosing with the intermittent schedule of the SWOG S1320 trial, in which patients received a continuous 8-week lead-in and were then randomised to continuous dosing or to cycles of 3 weeks off and 5 weeks on</w:t>
+      </w:r>
+      <w:r>
+        <w:t xml:space="preserve"> </w:t>
+      </w:r>
+      <w:r>
+        <w:t xml:space="preserve">(Algazi et al. 2020)</w:t>
+      </w:r>
+      <w:r>
+        <w:t xml:space="preserve">, and with adaptive therapy, in which the drug is withdrawn when the population has shrunk to half its initial size and resumed when it regrows to the initial size</w:t>
+      </w:r>
+      <w:r>
+        <w:t xml:space="preserve"> </w:t>
+      </w:r>
+      <w:r>
+        <w:t xml:space="preserve">(Zhang et al. 2017)</w:t>
+      </w:r>
+      <w:r>
+        <w:t xml:space="preserve">. When the resistant state carries no fitness cost, as the lineage data of</w:t>
+      </w:r>
+      <w:r>
+        <w:t xml:space="preserve"> </w:t>
+      </w:r>
+      <w:r>
+        <w:t xml:space="preserve">Iyer et al. (2025)</w:t>
+      </w:r>
+      <w:r>
+        <w:t xml:space="preserve"> </w:t>
+      </w:r>
+      <w:r>
+        <w:t xml:space="preserve">indicate for pre-existing tolerance, continuous dosing gives the longest time to progression ([ttp_cont_nocost] weeks against [ttp_int_nocost] for the intermittent schedule and [ttp_adapt_nocost] for adaptive therapy; Figure 8a,c), the ranking observed in the trial, where continuous dosing gave a median progression-free survival of 9.0 months against 5.5 months for intermittent dosing. When resistant cells pay a fitness cost in the absence of drug, the drug addiction that made intermittent dosing superior in patient-derived xenografts</w:t>
+      </w:r>
+      <w:r>
+        <w:t xml:space="preserve"> </w:t>
+      </w:r>
+      <w:r>
+        <w:t xml:space="preserve">(Das Thakur and Stuart 2013)</w:t>
+      </w:r>
+      <w:r>
+        <w:t xml:space="preserve">, the ranking reverses: the intermittent schedule and adaptive therapy delay progression to [ttp_int_cost] and [ttp_adapt_cost] weeks against [ttp_cont_cost] for continuous dosing, with adaptive therapy using [dose_adapt_cost] of the cumulative dose (Figure 8b,c). The optimiser makes the dependence explicit: over intermittent schedules of any period and duty cycle, the best schedule without a fitness cost is [best_nocost], and with a fitness cost release period 10, dose 2 (growth rate -0.016 per time unit) (Figure 8d). The model therefore reproduces both clinical and preclinical outcomes and attributes their difference to a measurable property of the resistant cells, their fitness without drug, which the framework can estimate from growth data before a schedule is chosen.</w:t>
+      </w:r>
+    </w:p>
+    <w:p>
+      <w:pPr>
+        <w:pStyle w:val="BodyText"/>
+      </w:pPr>
+      <w:r>
+        <w:t xml:space="preserve">The second case study concerns glioblastoma, where the RTOG 0525 trial compared the standard temozolomide regimen (150-200 mg/m² on days 1-5 of 28-day cycles) with a dose-dense regimen (75-100 mg/m² on days 1-21) that delivers about twice the cumulative dose, and found no difference in overall survival (16.6 against 14.9 months) for either MGMT-methylated or unmethylated tumours</w:t>
+      </w:r>
+      <w:r>
+        <w:t xml:space="preserve"> </w:t>
+      </w:r>
+      <w:r>
+        <w:t xml:space="preserve">(Gilbert et al. 2013)</w:t>
+      </w:r>
+      <w:r>
+        <w:t xml:space="preserve">. Simulating both regimens with one-compartment pharmacokinetics (elimination half-life 2.1 h;</w:t>
+      </w:r>
+      <w:r>
+        <w:t xml:space="preserve"> </w:t>
+      </w:r>
+      <w:r>
+        <w:t xml:space="preserve">Ostermann et al. (2004)</w:t>
+      </w:r>
+      <w:r>
+        <w:t xml:space="preserve">) on populations in which 1% (methylated) or 30% (unmethylated) of cells express MGMT, with MGMT protein protecting cells from the drug (the phenotypic-selection model of</w:t>
+      </w:r>
+      <w:r>
+        <w:t xml:space="preserve"> </w:t>
+      </w:r>
+      <w:r>
+        <w:t xml:space="preserve">Lasri et al. (2020)</w:t>
+      </w:r>
+      <w:r>
+        <w:t xml:space="preserve">), [gbm_summary] (Figure 8e,f). At equal cumulative dose the number of dosing days per cycle [gbm_days_summary] (Figure 8g). These simulations are not fits to the trials, whose end points depend on much that the model omits, but they show how the framework turns a proposed regimen into a quantitative, mechanism-resolved prediction, and how it identifies which biological measurement, the fitness of resistant cells without drug or the fraction of cells protected, decides between regimens.</w:t>
+      </w:r>
+    </w:p>
+    <w:bookmarkEnd w:id="17"/>
+    <w:bookmarkEnd w:id="18"/>
+    <w:bookmarkStart w:id="19" w:name="discussion"/>
     <w:p>
       <w:pPr>
         <w:pStyle w:val="Heading1"/>
@@ -2184,7 +2407,7 @@
         <w:pStyle w:val="BodyText"/>
       </w:pPr>
       <w:r>
-        <w:t xml:space="preserve">Several limitations delimit the current release. Cells are well-mixed compartments without spatial structure or cell-cell signalling; the pharmacology is a one-compartment model; growth is exponential with phenomenological size control; and the inference layer, although general, relies on user-chosen summary statistics, so posterior calibration should be checked with predictive simulations as in Figure 6. The persister case study is deliberately minimal, a single resistance gene with slow switching, and reproduces qualitative and semi-quantitative signatures reported in the literature; fitting it to a specific cell line will require the corresponding time-lapse or lineage-tracing data, for which the inference layer provides the machinery. The Catalyst.jl bridge planned for interoperability with the SciML ecosystem is not part of this release. Finally, the benchmark results should be read as demonstrations of what the framework makes possible rather than as verdicts on the methods compared, which were run with default settings on small networks.</w:t>
+        <w:t xml:space="preserve">The calibration and schedule studies illustrate the workflow we propose for in silico single-cell pharmacology: declare the training and validation observables before fitting, fit by simulated moments or ABC with common random numbers, validate on conditions and statistics that were not fitted, and only then compare regimens, reporting outcomes that map onto clinical end points (time to progression from the nadir, depth of response, cumulative dose). The two case studies show why mechanism matters: the same schedule question, continuous or intermittent dosing, has opposite answers depending on whether resistant cells pay a fitness cost without drug, and the trial and xenograft outcomes that seemed to contradict each other are both reproduced once that property is set. Because the framework simulates the lineage-resolved, single-cell data from which such properties are measured, it can also say which experiment would resolve the question before a trial is designed.</w:t>
       </w:r>
     </w:p>
     <w:p>
@@ -2192,11 +2415,19 @@
         <w:pStyle w:val="BodyText"/>
       </w:pPr>
       <w:r>
+        <w:t xml:space="preserve">Several limitations delimit the current release. Cells are well-mixed compartments without spatial structure or cell-cell signalling; the pharmacology is a one-compartment model; growth is exponential with phenomenological size control; and the inference layer, although general, relies on user-chosen summary statistics, so posterior calibration should be checked with predictive simulations as in Figure 6. The persister case study is deliberately minimal, a single resistance gene with slow switching; its calibration used fate fractions transcribed from a published study rather than raw tracks, and the clinical case studies use literature values for cell-cycle times, resistant fractions and pharmacokinetics rather than patient-specific measurements, so their conclusions are about mechanisms and rankings, not about absolute survival times. The Catalyst.jl bridge planned for interoperability with the SciML ecosystem is not part of this release. Finally, the benchmark results should be read as demonstrations of what the framework makes possible rather than as verdicts on the methods compared, which were run with default settings on small networks.</w:t>
+      </w:r>
+    </w:p>
+    <w:p>
+      <w:pPr>
+        <w:pStyle w:val="BodyText"/>
+      </w:pPr>
+      <w:r>
         <w:t xml:space="preserve">Future work will add spatial coupling through neighbourhood-dependent rates, cell-cell communication, chromatin states with their own inheritance rules, and neural simulation-based inference on top of the existing forward model. Because the framework is deterministic given a seed, fast enough to simulate tens of thousands of cells in minutes, and outputs AnnData files, it can be dropped into existing single-cell analysis pipelines as a source of mechanistically grounded synthetic data, and into virtual-cell training and evaluation as a source of causal, out-of-distribution contexts.</w:t>
       </w:r>
     </w:p>
-    <w:bookmarkEnd w:id="17"/>
-    <w:bookmarkStart w:id="28" w:name="methods"/>
+    <w:bookmarkEnd w:id="19"/>
+    <w:bookmarkStart w:id="32" w:name="methods"/>
     <w:p>
       <w:pPr>
         <w:pStyle w:val="Heading1"/>
@@ -2205,7 +2436,7 @@
         <w:t xml:space="preserve">Methods</w:t>
       </w:r>
     </w:p>
-    <w:bookmarkStart w:id="18" w:name="reaction-model-and-propensities"/>
+    <w:bookmarkStart w:id="20" w:name="reaction-model-and-propensities"/>
     <w:p>
       <w:pPr>
         <w:pStyle w:val="Heading2"/>
@@ -2916,8 +3147,8 @@
         <w:t xml:space="preserve">) grouped into promoter groups. Custom propensities can be supplied as functions of counts, volume, parameters and time.</w:t>
       </w:r>
     </w:p>
-    <w:bookmarkEnd w:id="18"/>
-    <w:bookmarkStart w:id="19" w:name="stochastic-simulation-kernels"/>
+    <w:bookmarkEnd w:id="20"/>
+    <w:bookmarkStart w:id="21" w:name="stochastic-simulation-kernels"/>
     <w:p>
       <w:pPr>
         <w:pStyle w:val="Heading2"/>
@@ -3017,8 +3248,8 @@
         <w:t xml:space="preserve">. Every kernel takes an explicit random number generator.</w:t>
       </w:r>
     </w:p>
-    <w:bookmarkEnd w:id="19"/>
-    <w:bookmarkStart w:id="20" w:name="cells-growth-replication-and-division"/>
+    <w:bookmarkEnd w:id="21"/>
+    <w:bookmarkStart w:id="22" w:name="cells-growth-replication-and-division"/>
     <w:p>
       <w:pPr>
         <w:pStyle w:val="Heading2"/>
@@ -3342,8 +3573,8 @@
         <w:t xml:space="preserve">).</w:t>
       </w:r>
     </w:p>
-    <w:bookmarkEnd w:id="20"/>
-    <w:bookmarkStart w:id="21" w:name="drug-and-perturbation-layer"/>
+    <w:bookmarkEnd w:id="22"/>
+    <w:bookmarkStart w:id="23" w:name="drug-and-perturbation-layer"/>
     <w:p>
       <w:pPr>
         <w:pStyle w:val="Heading2"/>
@@ -3830,8 +4061,8 @@
         <w:t xml:space="preserve">, on the growth rate; multiplicative modulation of any parameter by a function of the dose; and genetic perturbations (knockdown, knockout, over-expression) of any parameter in a random fraction of cells, the flag being inherited by daughters.</w:t>
       </w:r>
     </w:p>
-    <w:bookmarkEnd w:id="21"/>
-    <w:bookmarkStart w:id="22" w:name="lineage-statistics"/>
+    <w:bookmarkEnd w:id="23"/>
+    <w:bookmarkStart w:id="24" w:name="lineage-statistics"/>
     <w:p>
       <w:pPr>
         <w:pStyle w:val="Heading2"/>
@@ -3961,8 +4192,8 @@
         <w:t xml:space="preserve">, the variance of clone-mean expression divided by its permutation-null expectation.</w:t>
       </w:r>
     </w:p>
-    <w:bookmarkEnd w:id="22"/>
-    <w:bookmarkStart w:id="23" w:name="observation-models"/>
+    <w:bookmarkEnd w:id="24"/>
+    <w:bookmarkStart w:id="25" w:name="observation-models"/>
     <w:p>
       <w:pPr>
         <w:pStyle w:val="Heading2"/>
@@ -3979,8 +4210,8 @@
         <w:t xml:space="preserve">True counts are converted to observations by a scRNA-seq model in which each cell captures every molecule independently with a Beta-distributed efficiency (mean and coefficient of variation set by the protocol), optional multinomial down-sampling to a Poisson-distributed depth, optional additional dropout and batch scaling; an smFISH model with a fixed detection efficiency; and a time-lapse model that samples a species along lineages at a fixed interval with additive or multiplicative measurement noise. Because counts scale with volume, library size correlates with cell size, reproducing the transcriptome-size confound of real data. Outputs are written as CSV or as AnnData-compatible HDF5 files.</w:t>
       </w:r>
     </w:p>
-    <w:bookmarkEnd w:id="23"/>
-    <w:bookmarkStart w:id="24" w:name="inference"/>
+    <w:bookmarkEnd w:id="25"/>
+    <w:bookmarkStart w:id="26" w:name="inference"/>
     <w:p>
       <w:pPr>
         <w:pStyle w:val="Heading2"/>
@@ -4029,16 +4260,304 @@
         <w:t xml:space="preserve"> </w:t>
       </w:r>
       <w:r>
-        <w:t xml:space="preserve">quantile of the previous generation’s distances), Gaussian perturbation kernels of variance twice the weighted population variance, importance weights against the prior, and parallel evaluation of the user-supplied distance function.</w:t>
-      </w:r>
-    </w:p>
-    <w:bookmarkEnd w:id="24"/>
-    <w:bookmarkStart w:id="25" w:name="random-regulatory-networks"/>
+        <w:t xml:space="preserve">quantile of the previous generation’s distances), Gaussian perturbation kernels of variance twice the weighted population variance, importance weights against the prior, and parallel evaluation of the user-supplied distance function; for count distributions we use the Wasserstein-1 distance between simulated and observed samples</w:t>
+      </w:r>
+      <w:r>
+        <w:t xml:space="preserve"> </w:t>
+      </w:r>
+      <w:r>
+        <w:t xml:space="preserve">(Bernton et al. 2019)</w:t>
+      </w:r>
+      <w:r>
+        <w:t xml:space="preserve">.</w:t>
+      </w:r>
+    </w:p>
+    <w:bookmarkEnd w:id="26"/>
+    <w:bookmarkStart w:id="27" w:name="X3c07bc6a2b6f6641f25d58dc2e51e24d3ede081"/>
     <w:p>
       <w:pPr>
         <w:pStyle w:val="Heading2"/>
       </w:pPr>
       <w:r>
+        <w:t xml:space="preserve">Calibration to laboratory data and validation strategy</w:t>
+      </w:r>
+    </w:p>
+    <w:p>
+      <w:pPr>
+        <w:pStyle w:val="FirstParagraph"/>
+      </w:pPr>
+      <w:r>
+        <w:t xml:space="preserve">Reference values were transcribed from the text and tables of the cited articles into</w:t>
+      </w:r>
+      <w:r>
+        <w:t xml:space="preserve"> </w:t>
+      </w:r>
+      <w:r>
+        <w:rPr>
+          <w:rStyle w:val="VerbatimChar"/>
+        </w:rPr>
+        <w:t xml:space="preserve">paper/data/</w:t>
+      </w:r>
+      <w:r>
+        <w:t xml:space="preserve"> </w:t>
+      </w:r>
+      <w:r>
+        <w:t xml:space="preserve">with their provenance (Table S3). For the cisplatin case study the model is a resistance gene with slow promoter switching whose protein product protects against a dose-dependent death hazard and against a dose-dependent growth arrest (Methods above), with a 24-h cell cycle. Its six free parameters (activation and inactivation rates, maximal death rate, EC</w:t>
+      </w:r>
+      <m:oMath>
+        <m:sSub>
+          <m:e>
+            <m:r>
+              <m:t>​</m:t>
+            </m:r>
+          </m:e>
+          <m:sub>
+            <m:r>
+              <m:t>50</m:t>
+            </m:r>
+          </m:sub>
+        </m:sSub>
+      </m:oMath>
+      <w:r>
+        <w:t xml:space="preserve"> </w:t>
+      </w:r>
+      <w:r>
+        <w:t xml:space="preserve">and Hill coefficient of death, IC</w:t>
+      </w:r>
+      <m:oMath>
+        <m:sSub>
+          <m:e>
+            <m:r>
+              <m:t>​</m:t>
+            </m:r>
+          </m:e>
+          <m:sub>
+            <m:r>
+              <m:t>50</m:t>
+            </m:r>
+          </m:sub>
+        </m:sSub>
+      </m:oMath>
+      <w:r>
+        <w:t xml:space="preserve"> </w:t>
+      </w:r>
+      <w:r>
+        <w:t xml:space="preserve">of growth arrest) were fitted by the method of simulated moments: the root-mean-square difference between simulated and observed fractions of cells that died, divided or survived without dividing during 72 h of drug, for the training concentrations (7 and 13 µM), plus a weak penalty keeping the memory of the resistant state near the 2-3 generations inferred from lineage correlations, was minimised with the bounded optimiser described below using common random numbers (the same seeds for every candidate). Validation used only quantities not fitted: the fate fractions at the held-out concentration (10 µM), the biphasic kill curve and its plateau, the extent of lineage correlations in fate (sisters, first, second and third cousins) and the invariance of single-cell division and death times across concentrations. The protocol is deliberately generic: any observable computable from a</w:t>
+      </w:r>
+      <w:r>
+        <w:t xml:space="preserve"> </w:t>
+      </w:r>
+      <w:r>
+        <w:rPr>
+          <w:rStyle w:val="VerbatimChar"/>
+        </w:rPr>
+        <w:t xml:space="preserve">PopulationResult</w:t>
+      </w:r>
+      <w:r>
+        <w:t xml:space="preserve"> </w:t>
+      </w:r>
+      <w:r>
+        <w:t xml:space="preserve">(kill curves, fate fractions, lineage correlations, snapshot distributions) can enter the distance, and the split between training and validation conditions is declared before fitting.</w:t>
+      </w:r>
+    </w:p>
+    <w:bookmarkEnd w:id="27"/>
+    <w:bookmarkStart w:id="28" w:name="Xe3c385c670787971cd3ae982009c679ef5b84f8"/>
+    <w:p>
+      <w:pPr>
+        <w:pStyle w:val="Heading2"/>
+      </w:pPr>
+      <w:r>
+        <w:t xml:space="preserve">Clinical regimens, treatment outcomes and schedule optimisation</w:t>
+      </w:r>
+    </w:p>
+    <w:p>
+      <w:pPr>
+        <w:pStyle w:val="FirstParagraph"/>
+      </w:pPr>
+      <w:r>
+        <w:t xml:space="preserve">Regimens are built from the schedule primitives of the perturbation layer:</w:t>
+      </w:r>
+      <w:r>
+        <w:t xml:space="preserve"> </w:t>
+      </w:r>
+      <w:r>
+        <w:rPr>
+          <w:rStyle w:val="VerbatimChar"/>
+        </w:rPr>
+        <w:t xml:space="preserve">PulsedDose</w:t>
+      </w:r>
+      <w:r>
+        <w:t xml:space="preserve"> </w:t>
+      </w:r>
+      <w:r>
+        <w:t xml:space="preserve">with a finite number of cycles,</w:t>
+      </w:r>
+      <w:r>
+        <w:t xml:space="preserve"> </w:t>
+      </w:r>
+      <w:r>
+        <w:rPr>
+          <w:rStyle w:val="VerbatimChar"/>
+        </w:rPr>
+        <w:t xml:space="preserve">PiecewiseDose</w:t>
+      </w:r>
+      <w:r>
+        <w:t xml:space="preserve"> </w:t>
+      </w:r>
+      <w:r>
+        <w:t xml:space="preserve">for arbitrary calendars (the S1320 schedule),</w:t>
+      </w:r>
+      <w:r>
+        <w:t xml:space="preserve"> </w:t>
+      </w:r>
+      <w:r>
+        <w:rPr>
+          <w:rStyle w:val="VerbatimChar"/>
+        </w:rPr>
+        <w:t xml:space="preserve">daily_boluses</w:t>
+      </w:r>
+      <w:r>
+        <w:t xml:space="preserve"> </w:t>
+      </w:r>
+      <w:r>
+        <w:t xml:space="preserve">and</w:t>
+      </w:r>
+      <w:r>
+        <w:t xml:space="preserve"> </w:t>
+      </w:r>
+      <w:r>
+        <w:rPr>
+          <w:rStyle w:val="VerbatimChar"/>
+        </w:rPr>
+        <w:t xml:space="preserve">cycle_days</w:t>
+      </w:r>
+      <w:r>
+        <w:t xml:space="preserve"> </w:t>
+      </w:r>
+      <w:r>
+        <w:t xml:space="preserve">for daily oral doses with one-compartment pharmacokinetics, and</w:t>
+      </w:r>
+      <w:r>
+        <w:t xml:space="preserve"> </w:t>
+      </w:r>
+      <w:r>
+        <w:rPr>
+          <w:rStyle w:val="VerbatimChar"/>
+        </w:rPr>
+        <w:t xml:space="preserve">AdaptiveDose</w:t>
+      </w:r>
+      <w:r>
+        <w:t xml:space="preserve">, a feedback schedule that withdraws the drug when the population falls below a fraction of its initial size and resumes it when the population regrows above another fraction, evaluated with the current population size at every step</w:t>
+      </w:r>
+      <w:r>
+        <w:t xml:space="preserve"> </w:t>
+      </w:r>
+      <w:r>
+        <w:t xml:space="preserve">(Zhang et al. 2017)</w:t>
+      </w:r>
+      <w:r>
+        <w:t xml:space="preserve">. Outcomes computed from a simulation are the net growth rate, the depth of response (log</w:t>
+      </w:r>
+      <m:oMath>
+        <m:sSub>
+          <m:e>
+            <m:r>
+              <m:t>​</m:t>
+            </m:r>
+          </m:e>
+          <m:sub>
+            <m:r>
+              <m:t>10</m:t>
+            </m:r>
+          </m:sub>
+        </m:sSub>
+      </m:oMath>
+      <w:r>
+        <w:t xml:space="preserve"> </w:t>
+      </w:r>
+      <w:r>
+        <w:t xml:space="preserve">of the ratio of the initial to the smallest population), the time to progression (first time the population exceeds a threshold, 1.2, times its running minimum, the analogue of RECIST progression from the nadir; censored at the end of the simulation), the extinction probability over replicates and the cumulative dose actually applied.</w:t>
+      </w:r>
+      <w:r>
+        <w:t xml:space="preserve"> </w:t>
+      </w:r>
+      <w:r>
+        <w:rPr>
+          <w:rStyle w:val="VerbatimChar"/>
+        </w:rPr>
+        <w:t xml:space="preserve">optimize_schedule</w:t>
+      </w:r>
+      <w:r>
+        <w:t xml:space="preserve"> </w:t>
+      </w:r>
+      <w:r>
+        <w:t xml:space="preserve">minimises any such outcome over a box of schedule parameters: a log-spaced grid (or a Latin hypercube when the grid is large) is evaluated with the same random seeds for every candidate, and the best point is refined by Nelder-Mead in a bounded transform of the box; constraints such as a fixed cumulative dose enter as penalties or as the parameterisation (for instance a per-day dose equal to the budget divided by the number of dosing days). The melanoma case study uses a 30-h cell cycle, a pre-resistant fraction of 1:200 with a memory of five generations</w:t>
+      </w:r>
+      <w:r>
+        <w:t xml:space="preserve"> </w:t>
+      </w:r>
+      <w:r>
+        <w:t xml:space="preserve">(Shaffer et al. 2017, 2020)</w:t>
+      </w:r>
+      <w:r>
+        <w:t xml:space="preserve">, drug effects at the fractional-killing dose (state-dependent death and growth arrest, and a ten-fold stabilisation of the resistant state by the drug, the drug-induced reprogramming of</w:t>
+      </w:r>
+      <w:r>
+        <w:t xml:space="preserve"> </w:t>
+      </w:r>
+      <w:r>
+        <w:t xml:space="preserve">Shaffer et al. (2017)</w:t>
+      </w:r>
+      <w:r>
+        <w:t xml:space="preserve">), with or without a 50% fitness cost of the resistant state</w:t>
+      </w:r>
+      <w:r>
+        <w:t xml:space="preserve"> </w:t>
+      </w:r>
+      <w:r>
+        <w:t xml:space="preserve">(Das Thakur and Stuart 2013)</w:t>
+      </w:r>
+      <w:r>
+        <w:t xml:space="preserve">; the temozolomide case study uses a 50-h cell cycle</w:t>
+      </w:r>
+      <w:r>
+        <w:t xml:space="preserve"> </w:t>
+      </w:r>
+      <w:r>
+        <w:t xml:space="preserve">(Lasri et al. 2020)</w:t>
+      </w:r>
+      <w:r>
+        <w:t xml:space="preserve">, an elimination half-life of 2.1 h</w:t>
+      </w:r>
+      <w:r>
+        <w:t xml:space="preserve"> </w:t>
+      </w:r>
+      <w:r>
+        <w:t xml:space="preserve">(Ostermann et al. 2004)</w:t>
+      </w:r>
+      <w:r>
+        <w:t xml:space="preserve">, the regimens of RTOG 0525</w:t>
+      </w:r>
+      <w:r>
+        <w:t xml:space="preserve"> </w:t>
+      </w:r>
+      <w:r>
+        <w:t xml:space="preserve">(Gilbert et al. 2013)</w:t>
+      </w:r>
+      <w:r>
+        <w:t xml:space="preserve"> </w:t>
+      </w:r>
+      <w:r>
+        <w:t xml:space="preserve">(200 mg/m² on days 1-5 or 100 mg/m² on days 1-21 of 28-day cycles, six cycles) and MGMT-expressing fractions of 1% and 30% for methylated and unmethylated promoters.</w:t>
+      </w:r>
+    </w:p>
+    <w:bookmarkEnd w:id="28"/>
+    <w:bookmarkStart w:id="29" w:name="random-regulatory-networks"/>
+    <w:p>
+      <w:pPr>
+        <w:pStyle w:val="Heading2"/>
+      </w:pPr>
+      <w:r>
         <w:t xml:space="preserve">Random regulatory networks</w:t>
       </w:r>
     </w:p>
@@ -4050,8 +4569,8 @@
         <w:t xml:space="preserve">Random networks are built with a chosen number of activating and inhibiting edges under Erdős-Rényi or preferential-attachment (scale-free) sampling; regulation acts on the transcription rate of constitutive genes or on the promoter activation rate of telegraph genes through AND-combined Hill functions; per-gene rate constants can be drawn log-uniformly from ranges.</w:t>
       </w:r>
     </w:p>
-    <w:bookmarkEnd w:id="25"/>
-    <w:bookmarkStart w:id="26" w:name="validation-protocols"/>
+    <w:bookmarkEnd w:id="29"/>
+    <w:bookmarkStart w:id="30" w:name="validation-protocols"/>
     <w:p>
       <w:pPr>
         <w:pStyle w:val="Heading2"/>
@@ -4182,8 +4701,8 @@
         <w:t xml:space="preserve">directory of the repository.</w:t>
       </w:r>
     </w:p>
-    <w:bookmarkEnd w:id="26"/>
-    <w:bookmarkStart w:id="27" w:name="software"/>
+    <w:bookmarkEnd w:id="30"/>
+    <w:bookmarkStart w:id="31" w:name="software"/>
     <w:p>
       <w:pPr>
         <w:pStyle w:val="Heading2"/>
@@ -4230,9 +4749,9 @@
         <w:t xml:space="preserve">. The test suite (Aqua quality checks and statistical tests) runs under GitHub Actions on Julia 1.10 and the latest release.</w:t>
       </w:r>
     </w:p>
-    <w:bookmarkEnd w:id="27"/>
-    <w:bookmarkEnd w:id="28"/>
-    <w:bookmarkStart w:id="44" w:name="figure-legends"/>
+    <w:bookmarkEnd w:id="31"/>
+    <w:bookmarkEnd w:id="32"/>
+    <w:bookmarkStart w:id="54" w:name="figure-legends"/>
     <w:p>
       <w:pPr>
         <w:pStyle w:val="Heading1"/>
@@ -4248,20 +4767,20 @@
       <w:r>
         <w:drawing>
           <wp:inline>
-            <wp:extent cx="5334000" cy="4827029"/>
+            <wp:extent cx="5334000" cy="4396945"/>
             <wp:effectExtent b="0" l="0" r="0" t="0"/>
-            <wp:docPr descr="" title="" id="30" name="Picture"/>
+            <wp:docPr descr="" title="" id="34" name="Picture"/>
             <a:graphic>
               <a:graphicData uri="http://schemas.openxmlformats.org/drawingml/2006/picture">
                 <pic:pic>
                   <pic:nvPicPr>
-                    <pic:cNvPr descr="fig1_framework.png" id="31" name="Picture"/>
+                    <pic:cNvPr descr="fig1_framework.png" id="35" name="Picture"/>
                     <pic:cNvPicPr>
                       <a:picLocks noChangeArrowheads="1" noChangeAspect="1"/>
                     </pic:cNvPicPr>
                   </pic:nvPicPr>
                   <pic:blipFill>
-                    <a:blip r:embed="rId29"/>
+                    <a:blip r:embed="rId33"/>
                     <a:stretch>
                       <a:fillRect/>
                     </a:stretch>
@@ -4269,7 +4788,7 @@
                   <pic:spPr bwMode="auto">
                     <a:xfrm>
                       <a:off x="0" y="0"/>
-                      <a:ext cx="5334000" cy="4827029"/>
+                      <a:ext cx="5334000" cy="4396945"/>
                     </a:xfrm>
                     <a:prstGeom prst="rect">
                       <a:avLst/>
@@ -4315,18 +4834,18 @@
           <wp:inline>
             <wp:extent cx="5334000" cy="3314828"/>
             <wp:effectExtent b="0" l="0" r="0" t="0"/>
-            <wp:docPr descr="" title="" id="33" name="Picture"/>
+            <wp:docPr descr="" title="" id="37" name="Picture"/>
             <a:graphic>
               <a:graphicData uri="http://schemas.openxmlformats.org/drawingml/2006/picture">
                 <pic:pic>
                   <pic:nvPicPr>
-                    <pic:cNvPr descr="fig2_engine.png" id="34" name="Picture"/>
+                    <pic:cNvPr descr="fig2_engine.png" id="38" name="Picture"/>
                     <pic:cNvPicPr>
                       <a:picLocks noChangeArrowheads="1" noChangeAspect="1"/>
                     </pic:cNvPicPr>
                   </pic:nvPicPr>
                   <pic:blipFill>
-                    <a:blip r:embed="rId32"/>
+                    <a:blip r:embed="rId36"/>
                     <a:stretch>
                       <a:fillRect/>
                     </a:stretch>
@@ -4380,18 +4899,18 @@
           <wp:inline>
             <wp:extent cx="5334000" cy="3956192"/>
             <wp:effectExtent b="0" l="0" r="0" t="0"/>
-            <wp:docPr descr="" title="" id="36" name="Picture"/>
+            <wp:docPr descr="" title="" id="40" name="Picture"/>
             <a:graphic>
               <a:graphicData uri="http://schemas.openxmlformats.org/drawingml/2006/picture">
                 <pic:pic>
                   <pic:nvPicPr>
-                    <pic:cNvPr descr="fig3_growth.png" id="37" name="Picture"/>
+                    <pic:cNvPr descr="fig3_growth.png" id="41" name="Picture"/>
                     <pic:cNvPicPr>
                       <a:picLocks noChangeArrowheads="1" noChangeAspect="1"/>
                     </pic:cNvPicPr>
                   </pic:nvPicPr>
                   <pic:blipFill>
-                    <a:blip r:embed="rId35"/>
+                    <a:blip r:embed="rId39"/>
                     <a:stretch>
                       <a:fillRect/>
                     </a:stretch>
@@ -4445,18 +4964,18 @@
           <wp:inline>
             <wp:extent cx="5334000" cy="4868794"/>
             <wp:effectExtent b="0" l="0" r="0" t="0"/>
-            <wp:docPr descr="" title="" id="39" name="Picture"/>
+            <wp:docPr descr="" title="" id="43" name="Picture"/>
             <a:graphic>
               <a:graphicData uri="http://schemas.openxmlformats.org/drawingml/2006/picture">
                 <pic:pic>
                   <pic:nvPicPr>
-                    <pic:cNvPr descr="fig4_persisters.png" id="40" name="Picture"/>
+                    <pic:cNvPr descr="fig4_persisters.png" id="44" name="Picture"/>
                     <pic:cNvPicPr>
                       <a:picLocks noChangeArrowheads="1" noChangeAspect="1"/>
                     </pic:cNvPicPr>
                   </pic:nvPicPr>
                   <pic:blipFill>
-                    <a:blip r:embed="rId38"/>
+                    <a:blip r:embed="rId42"/>
                     <a:stretch>
                       <a:fillRect/>
                     </a:stretch>
@@ -4510,18 +5029,18 @@
           <wp:inline>
             <wp:extent cx="5334000" cy="3805927"/>
             <wp:effectExtent b="0" l="0" r="0" t="0"/>
-            <wp:docPr descr="" title="" id="42" name="Picture"/>
+            <wp:docPr descr="" title="" id="46" name="Picture"/>
             <a:graphic>
               <a:graphicData uri="http://schemas.openxmlformats.org/drawingml/2006/picture">
                 <pic:pic>
                   <pic:nvPicPr>
-                    <pic:cNvPr descr="fig5_benchmarks.png" id="43" name="Picture"/>
+                    <pic:cNvPr descr="fig5_benchmarks.png" id="47" name="Picture"/>
                     <pic:cNvPicPr>
                       <a:picLocks noChangeArrowheads="1" noChangeAspect="1"/>
                     </pic:cNvPicPr>
                   </pic:nvPicPr>
                   <pic:blipFill>
-                    <a:blip r:embed="rId41"/>
+                    <a:blip r:embed="rId45"/>
                     <a:stretch>
                       <a:fillRect/>
                     </a:stretch>
@@ -4570,6 +5089,48 @@
       <w:pPr>
         <w:pStyle w:val="BodyText"/>
       </w:pPr>
+      <w:r>
+        <w:drawing>
+          <wp:inline>
+            <wp:extent cx="5334000" cy="3406844"/>
+            <wp:effectExtent b="0" l="0" r="0" t="0"/>
+            <wp:docPr descr="" title="" id="49" name="Picture"/>
+            <a:graphic>
+              <a:graphicData uri="http://schemas.openxmlformats.org/drawingml/2006/picture">
+                <pic:pic>
+                  <pic:nvPicPr>
+                    <pic:cNvPr descr="fig6_inference.png" id="50" name="Picture"/>
+                    <pic:cNvPicPr>
+                      <a:picLocks noChangeArrowheads="1" noChangeAspect="1"/>
+                    </pic:cNvPicPr>
+                  </pic:nvPicPr>
+                  <pic:blipFill>
+                    <a:blip r:embed="rId48"/>
+                    <a:stretch>
+                      <a:fillRect/>
+                    </a:stretch>
+                  </pic:blipFill>
+                  <pic:spPr bwMode="auto">
+                    <a:xfrm>
+                      <a:off x="0" y="0"/>
+                      <a:ext cx="5334000" cy="3406844"/>
+                    </a:xfrm>
+                    <a:prstGeom prst="rect">
+                      <a:avLst/>
+                    </a:prstGeom>
+                    <a:noFill/>
+                    <a:ln w="9525">
+                      <a:noFill/>
+                      <a:headEnd/>
+                      <a:tailEnd/>
+                    </a:ln>
+                  </pic:spPr>
+                </pic:pic>
+              </a:graphicData>
+            </a:graphic>
+          </wp:inline>
+        </w:drawing>
+      </w:r>
     </w:p>
     <w:p>
       <w:pPr>
@@ -4586,11 +5147,111 @@
         <w:t xml:space="preserve"> </w:t>
       </w:r>
       <w:r>
-        <w:t xml:space="preserve">(a) Posterior distributions of telegraph parameters from ABC-SMC on a snapshot of non-dividing cells, with the truth and the exact maximum-likelihood estimate. (b) The same for a snapshot of a growing and dividing population: the naive telegraph fit is biased while division-aware ABC recovers the truth. (c) Posterior particles for the drug death rate and protection threshold inferred from a kill curve and sister fate concordance. (d) Posterior predictive kill curves simulated at the posterior median against the observed curve.</w:t>
-      </w:r>
-    </w:p>
-    <w:bookmarkEnd w:id="44"/>
-    <w:bookmarkStart w:id="45" w:name="data-and-code-availability"/>
+        <w:t xml:space="preserve">(a) Posterior distributions of telegraph parameters from ABC-SMC on a snapshot of non-dividing cells, with the truth and the exact maximum-likelihood estimate. (b) The same for a snapshot of a growing and dividing population: the naive telegraph fit is biased while division-aware ABC recovers the truth. (c) Posterior particles for the maximal death rate and the protection threshold inferred from a kill curve and sister fate concordance: the two parameters trade off along a ridge that contains the truth. (d) Posterior predictive kill curves simulated at the posterior median against the observed curve.</w:t>
+      </w:r>
+    </w:p>
+    <w:p>
+      <w:pPr>
+        <w:pStyle w:val="BodyText"/>
+      </w:pPr>
+      <w:r>
+        <w:drawing>
+          <wp:inline>
+            <wp:extent cx="5334000" cy="3715109"/>
+            <wp:effectExtent b="0" l="0" r="0" t="0"/>
+            <wp:docPr descr="" title="" id="52" name="Picture"/>
+            <a:graphic>
+              <a:graphicData uri="http://schemas.openxmlformats.org/drawingml/2006/picture">
+                <pic:pic>
+                  <pic:nvPicPr>
+                    <pic:cNvPr descr="fig7_calibration.png" id="53" name="Picture"/>
+                    <pic:cNvPicPr>
+                      <a:picLocks noChangeArrowheads="1" noChangeAspect="1"/>
+                    </pic:cNvPicPr>
+                  </pic:nvPicPr>
+                  <pic:blipFill>
+                    <a:blip r:embed="rId51"/>
+                    <a:stretch>
+                      <a:fillRect/>
+                    </a:stretch>
+                  </pic:blipFill>
+                  <pic:spPr bwMode="auto">
+                    <a:xfrm>
+                      <a:off x="0" y="0"/>
+                      <a:ext cx="5334000" cy="3715109"/>
+                    </a:xfrm>
+                    <a:prstGeom prst="rect">
+                      <a:avLst/>
+                    </a:prstGeom>
+                    <a:noFill/>
+                    <a:ln w="9525">
+                      <a:noFill/>
+                      <a:headEnd/>
+                      <a:tailEnd/>
+                    </a:ln>
+                  </pic:spPr>
+                </pic:pic>
+              </a:graphicData>
+            </a:graphic>
+          </wp:inline>
+        </w:drawing>
+      </w:r>
+    </w:p>
+    <w:p>
+      <w:pPr>
+        <w:pStyle w:val="BodyText"/>
+      </w:pPr>
+      <w:r>
+        <w:rPr>
+          <w:b/>
+          <w:bCs/>
+        </w:rPr>
+        <w:t xml:space="preserve">Figure 7. Calibration to laboratory time-lapse data and validation on held-out conditions.</w:t>
+      </w:r>
+      <w:r>
+        <w:t xml:space="preserve"> </w:t>
+      </w:r>
+      <w:r>
+        <w:t xml:space="preserve">(a) Fates over 72 h of cisplatin of U2OS cells present at drug addition, observed by time-lapse microscopy</w:t>
+      </w:r>
+      <w:r>
+        <w:t xml:space="preserve"> </w:t>
+      </w:r>
+      <w:r>
+        <w:t xml:space="preserve">(Iyer et al. 2025)</w:t>
+      </w:r>
+      <w:r>
+        <w:t xml:space="preserve"> </w:t>
+      </w:r>
+      <w:r>
+        <w:t xml:space="preserve">(grey) and simulated by the calibrated model (colours; mean ± s.d. of four seeds); the model was calibrated on 7 and 13 µM and the 10 µM condition is predicted. (b) Predicted population size at the three concentrations and at 11.5 µM, from two days before the drug to seven days of exposure. (c) Correlation of death fates between sisters, first, second and third cousins present at drug addition, and between unrelated cells (mean ± s.d. of three seeds), against the observation that correlations extend to second but not third cousins. (d) Mean time to death of cells present at drug addition, and mean division time where at least 20 cells born under drug divided, against concentration (mean ± s.d. of four seeds). (e) Calibration landscape: every parameter set evaluated by the optimiser, coloured by its distance to the training data. (f) Calibrated parameters.</w:t>
+      </w:r>
+    </w:p>
+    <w:p>
+      <w:pPr>
+        <w:pStyle w:val="BodyText"/>
+      </w:pPr>
+    </w:p>
+    <w:p>
+      <w:pPr>
+        <w:pStyle w:val="BodyText"/>
+      </w:pPr>
+      <w:r>
+        <w:rPr>
+          <w:b/>
+          <w:bCs/>
+        </w:rPr>
+        <w:t xml:space="preserve">Figure 8. Dose and schedule optimisation against clinical regimens.</w:t>
+      </w:r>
+      <w:r>
+        <w:t xml:space="preserve"> </w:t>
+      </w:r>
+      <w:r>
+        <w:t xml:space="preserve">(a-b) Population size under continuous dosing, the intermittent schedule of the SWOG S1320 trial (8-week lead-in, then 3 weeks off and 5 weeks on) and adaptive therapy (drug withdrawn below 50% of the initial size, resumed at the initial size) for a melanoma-like population with a rare, heritable pre-resistant state, without (a) and with (b) a fitness cost of the resistant state. (c) Time to progression (20% regrowth from the nadir; mean ± s.d. of four seeds) for the three schedules and two mechanisms. (d) Time to progression over intermittent schedules of given period and duty cycle (every schedule evaluated by the optimiser; star: best), for the two mechanisms. (e) Population size under the standard (5 of 28 days) and dose-dense (21 of 28 days) temozolomide regimens of the RTOG 0525 trial and a 21-day regimen at the standard cumulative dose, simulated with one-compartment pharmacokinetics (elimination half-life 2.1 h) for MGMT-methylated (1% MGMT-expressing cells) and unmethylated (30%) populations. (f) Depth of response over six cycles (mean ± s.d. of three seeds). (g) Final population size against the number of dosing days per 28-day cycle at equal cumulative dose.</w:t>
+      </w:r>
+    </w:p>
+    <w:bookmarkEnd w:id="54"/>
+    <w:bookmarkStart w:id="55" w:name="data-and-code-availability"/>
     <w:p>
       <w:pPr>
         <w:pStyle w:val="Heading1"/>
@@ -4604,7 +5265,22 @@
         <w:pStyle w:val="FirstParagraph"/>
       </w:pPr>
       <w:r>
-        <w:t xml:space="preserve">Biomodelling.jl 2.0 is available under the MIT license at https://github.com/ayoublasri/Biomodelling.jl. All data in this article are synthetic and are regenerated, with fixed seeds, by the scripts in the</w:t>
+        <w:t xml:space="preserve">Biomodelling.jl 2.0 is available under the MIT license at https://github.com/ayoublasri/Biomodelling.jl. The laboratory and clinical reference values used for calibration are transcribed, with provenance, in the</w:t>
+      </w:r>
+      <w:r>
+        <w:t xml:space="preserve"> </w:t>
+      </w:r>
+      <w:r>
+        <w:rPr>
+          <w:rStyle w:val="VerbatimChar"/>
+        </w:rPr>
+        <w:t xml:space="preserve">paper/data/</w:t>
+      </w:r>
+      <w:r>
+        <w:t xml:space="preserve"> </w:t>
+      </w:r>
+      <w:r>
+        <w:t xml:space="preserve">directory of the repository. All other data in this article are synthetic and are regenerated, with fixed seeds, by the scripts in the</w:t>
       </w:r>
       <w:r>
         <w:t xml:space="preserve"> </w:t>
@@ -4646,8 +5322,8 @@
         <w:t xml:space="preserve">); the generated tables are archived with the release.</w:t>
       </w:r>
     </w:p>
-    <w:bookmarkEnd w:id="45"/>
-    <w:bookmarkStart w:id="46" w:name="author-contributions"/>
+    <w:bookmarkEnd w:id="55"/>
+    <w:bookmarkStart w:id="56" w:name="author-contributions"/>
     <w:p>
       <w:pPr>
         <w:pStyle w:val="Heading1"/>
@@ -4664,8 +5340,8 @@
         <w:t xml:space="preserve">A.L. and M.S. conceived the project. [To be completed.]</w:t>
       </w:r>
     </w:p>
-    <w:bookmarkEnd w:id="46"/>
-    <w:bookmarkStart w:id="47" w:name="competing-interests"/>
+    <w:bookmarkEnd w:id="56"/>
+    <w:bookmarkStart w:id="57" w:name="competing-interests"/>
     <w:p>
       <w:pPr>
         <w:pStyle w:val="Heading1"/>
@@ -4682,8 +5358,8 @@
         <w:t xml:space="preserve">The authors declare no competing interests.</w:t>
       </w:r>
     </w:p>
-    <w:bookmarkEnd w:id="47"/>
-    <w:bookmarkStart w:id="48" w:name="funding"/>
+    <w:bookmarkEnd w:id="57"/>
+    <w:bookmarkStart w:id="58" w:name="funding"/>
     <w:p>
       <w:pPr>
         <w:pStyle w:val="Heading1"/>
@@ -4700,8 +5376,8 @@
         <w:t xml:space="preserve">[To be completed.]</w:t>
       </w:r>
     </w:p>
-    <w:bookmarkEnd w:id="48"/>
-    <w:bookmarkStart w:id="118" w:name="references"/>
+    <w:bookmarkEnd w:id="58"/>
+    <w:bookmarkStart w:id="140" w:name="references"/>
     <w:p>
       <w:pPr>
         <w:pStyle w:val="Heading1"/>
@@ -4710,8 +5386,8 @@
         <w:t xml:space="preserve">References</w:t>
       </w:r>
     </w:p>
-    <w:bookmarkStart w:id="117" w:name="refs"/>
-    <w:bookmarkStart w:id="50" w:name="ref-ahlmanneltze2025"/>
+    <w:bookmarkStart w:id="139" w:name="refs"/>
+    <w:bookmarkStart w:id="60" w:name="ref-ahlmanneltze2025"/>
     <w:p>
       <w:pPr>
         <w:pStyle w:val="Bibliography"/>
@@ -4744,7 +5420,7 @@
       <w:r>
         <w:t xml:space="preserve"> </w:t>
       </w:r>
-      <w:hyperlink r:id="rId49">
+      <w:hyperlink r:id="rId59">
         <w:r>
           <w:rPr>
             <w:rStyle w:val="Hyperlink"/>
@@ -4756,8 +5432,157 @@
         <w:t xml:space="preserve">.</w:t>
       </w:r>
     </w:p>
-    <w:bookmarkEnd w:id="50"/>
-    <w:bookmarkStart w:id="52" w:name="ref-bertaux2018"/>
+    <w:bookmarkEnd w:id="60"/>
+    <w:bookmarkStart w:id="62" w:name="ref-algazi2020"/>
+    <w:p>
+      <w:pPr>
+        <w:pStyle w:val="Bibliography"/>
+      </w:pPr>
+      <w:r>
+        <w:t xml:space="preserve">Algazi, Alain P., Megan Othus, Adil I. Daud, et al. 2020.</w:t>
+      </w:r>
+      <w:r>
+        <w:t xml:space="preserve"> </w:t>
+      </w:r>
+      <w:r>
+        <w:t xml:space="preserve">“Continuous Versus Intermittent</w:t>
+      </w:r>
+      <w:r>
+        <w:t xml:space="preserve"> </w:t>
+      </w:r>
+      <w:r>
+        <w:t xml:space="preserve">BRAF</w:t>
+      </w:r>
+      <w:r>
+        <w:t xml:space="preserve"> </w:t>
+      </w:r>
+      <w:r>
+        <w:t xml:space="preserve">and</w:t>
+      </w:r>
+      <w:r>
+        <w:t xml:space="preserve"> </w:t>
+      </w:r>
+      <w:r>
+        <w:t xml:space="preserve">MEK</w:t>
+      </w:r>
+      <w:r>
+        <w:t xml:space="preserve"> </w:t>
+      </w:r>
+      <w:r>
+        <w:t xml:space="preserve">Inhibition in Patients with</w:t>
+      </w:r>
+      <w:r>
+        <w:t xml:space="preserve"> </w:t>
+      </w:r>
+      <w:r>
+        <w:t xml:space="preserve">BRAF</w:t>
+      </w:r>
+      <w:r>
+        <w:t xml:space="preserve">-Mutated Melanoma: A Randomized Phase 2 Trial.”</w:t>
+      </w:r>
+      <w:r>
+        <w:t xml:space="preserve"> </w:t>
+      </w:r>
+      <w:r>
+        <w:rPr>
+          <w:i/>
+          <w:iCs/>
+        </w:rPr>
+        <w:t xml:space="preserve">Nature Medicine</w:t>
+      </w:r>
+      <w:r>
+        <w:t xml:space="preserve"> </w:t>
+      </w:r>
+      <w:r>
+        <w:t xml:space="preserve">26 (10): 1564–68.</w:t>
+      </w:r>
+      <w:r>
+        <w:t xml:space="preserve"> </w:t>
+      </w:r>
+      <w:hyperlink r:id="rId61">
+        <w:r>
+          <w:rPr>
+            <w:rStyle w:val="Hyperlink"/>
+          </w:rPr>
+          <w:t xml:space="preserve">https://doi.org/10.1038/s41591-020-1060-8</w:t>
+        </w:r>
+      </w:hyperlink>
+      <w:r>
+        <w:t xml:space="preserve">.</w:t>
+      </w:r>
+    </w:p>
+    <w:bookmarkEnd w:id="62"/>
+    <w:bookmarkStart w:id="64" w:name="ref-bernton2019"/>
+    <w:p>
+      <w:pPr>
+        <w:pStyle w:val="Bibliography"/>
+      </w:pPr>
+      <w:r>
+        <w:t xml:space="preserve">Bernton, Espen, Pierre E. Jacob, Mathieu Gerber, and Christian P. Robert. 2019.</w:t>
+      </w:r>
+      <w:r>
+        <w:t xml:space="preserve"> </w:t>
+      </w:r>
+      <w:r>
+        <w:t xml:space="preserve">“Approximate</w:t>
+      </w:r>
+      <w:r>
+        <w:t xml:space="preserve"> </w:t>
+      </w:r>
+      <w:r>
+        <w:t xml:space="preserve">Bayesian</w:t>
+      </w:r>
+      <w:r>
+        <w:t xml:space="preserve"> </w:t>
+      </w:r>
+      <w:r>
+        <w:t xml:space="preserve">Computation with the</w:t>
+      </w:r>
+      <w:r>
+        <w:t xml:space="preserve"> </w:t>
+      </w:r>
+      <w:r>
+        <w:t xml:space="preserve">Wasserstein</w:t>
+      </w:r>
+      <w:r>
+        <w:t xml:space="preserve"> </w:t>
+      </w:r>
+      <w:r>
+        <w:t xml:space="preserve">Distance.”</w:t>
+      </w:r>
+      <w:r>
+        <w:t xml:space="preserve"> </w:t>
+      </w:r>
+      <w:r>
+        <w:rPr>
+          <w:i/>
+          <w:iCs/>
+        </w:rPr>
+        <w:t xml:space="preserve">Journal of the Royal Statistical Society: Series B</w:t>
+      </w:r>
+      <w:r>
+        <w:t xml:space="preserve"> </w:t>
+      </w:r>
+      <w:r>
+        <w:t xml:space="preserve">81 (2): 235–69.</w:t>
+      </w:r>
+      <w:r>
+        <w:t xml:space="preserve"> </w:t>
+      </w:r>
+      <w:hyperlink r:id="rId63">
+        <w:r>
+          <w:rPr>
+            <w:rStyle w:val="Hyperlink"/>
+          </w:rPr>
+          <w:t xml:space="preserve">https://doi.org/10.1111/rssb.12312</w:t>
+        </w:r>
+      </w:hyperlink>
+      <w:r>
+        <w:t xml:space="preserve">.</w:t>
+      </w:r>
+    </w:p>
+    <w:bookmarkEnd w:id="64"/>
+    <w:bookmarkStart w:id="66" w:name="ref-bertaux2018"/>
     <w:p>
       <w:pPr>
         <w:pStyle w:val="Bibliography"/>
@@ -4790,7 +5615,7 @@
       <w:r>
         <w:t xml:space="preserve"> </w:t>
       </w:r>
-      <w:hyperlink r:id="rId51">
+      <w:hyperlink r:id="rId65">
         <w:r>
           <w:rPr>
             <w:rStyle w:val="Hyperlink"/>
@@ -4802,8 +5627,8 @@
         <w:t xml:space="preserve">.</w:t>
       </w:r>
     </w:p>
-    <w:bookmarkEnd w:id="52"/>
-    <w:bookmarkStart w:id="54" w:name="ref-cannoodt2021"/>
+    <w:bookmarkEnd w:id="66"/>
+    <w:bookmarkStart w:id="68" w:name="ref-cannoodt2021"/>
     <w:p>
       <w:pPr>
         <w:pStyle w:val="Bibliography"/>
@@ -4836,7 +5661,7 @@
       <w:r>
         <w:t xml:space="preserve"> </w:t>
       </w:r>
-      <w:hyperlink r:id="rId53">
+      <w:hyperlink r:id="rId67">
         <w:r>
           <w:rPr>
             <w:rStyle w:val="Hyperlink"/>
@@ -4848,8 +5673,8 @@
         <w:t xml:space="preserve">.</w:t>
       </w:r>
     </w:p>
-    <w:bookmarkEnd w:id="54"/>
-    <w:bookmarkStart w:id="56" w:name="ref-cao2005"/>
+    <w:bookmarkEnd w:id="68"/>
+    <w:bookmarkStart w:id="70" w:name="ref-cao2005"/>
     <w:p>
       <w:pPr>
         <w:pStyle w:val="Bibliography"/>
@@ -4894,7 +5719,7 @@
       <w:r>
         <w:t xml:space="preserve"> </w:t>
       </w:r>
-      <w:hyperlink r:id="rId55">
+      <w:hyperlink r:id="rId69">
         <w:r>
           <w:rPr>
             <w:rStyle w:val="Hyperlink"/>
@@ -4906,8 +5731,8 @@
         <w:t xml:space="preserve">.</w:t>
       </w:r>
     </w:p>
-    <w:bookmarkEnd w:id="56"/>
-    <w:bookmarkStart w:id="58" w:name="ref-cao2006"/>
+    <w:bookmarkEnd w:id="70"/>
+    <w:bookmarkStart w:id="72" w:name="ref-cao2006"/>
     <w:p>
       <w:pPr>
         <w:pStyle w:val="Bibliography"/>
@@ -4940,7 +5765,7 @@
       <w:r>
         <w:t xml:space="preserve"> </w:t>
       </w:r>
-      <w:hyperlink r:id="rId57">
+      <w:hyperlink r:id="rId71">
         <w:r>
           <w:rPr>
             <w:rStyle w:val="Hyperlink"/>
@@ -4952,8 +5777,8 @@
         <w:t xml:space="preserve">.</w:t>
       </w:r>
     </w:p>
-    <w:bookmarkEnd w:id="58"/>
-    <w:bookmarkStart w:id="60" w:name="ref-corigliano2025"/>
+    <w:bookmarkEnd w:id="72"/>
+    <w:bookmarkStart w:id="74" w:name="ref-corigliano2025"/>
     <w:p>
       <w:pPr>
         <w:pStyle w:val="Bibliography"/>
@@ -4983,7 +5808,7 @@
       <w:r>
         <w:t xml:space="preserve"> </w:t>
       </w:r>
-      <w:hyperlink r:id="rId59">
+      <w:hyperlink r:id="rId73">
         <w:r>
           <w:rPr>
             <w:rStyle w:val="Hyperlink"/>
@@ -4995,8 +5820,54 @@
         <w:t xml:space="preserve">.</w:t>
       </w:r>
     </w:p>
-    <w:bookmarkEnd w:id="60"/>
-    <w:bookmarkStart w:id="62" w:name="ref-dibaeinia2026context"/>
+    <w:bookmarkEnd w:id="74"/>
+    <w:bookmarkStart w:id="76" w:name="ref-dasthakur2013"/>
+    <w:p>
+      <w:pPr>
+        <w:pStyle w:val="Bibliography"/>
+      </w:pPr>
+      <w:r>
+        <w:t xml:space="preserve">Das Thakur, Meghna, and Darrin D. Stuart. 2013.</w:t>
+      </w:r>
+      <w:r>
+        <w:t xml:space="preserve"> </w:t>
+      </w:r>
+      <w:r>
+        <w:t xml:space="preserve">“The Evolution of Melanoma Resistance Reveals Therapeutic Opportunities.”</w:t>
+      </w:r>
+      <w:r>
+        <w:t xml:space="preserve"> </w:t>
+      </w:r>
+      <w:r>
+        <w:rPr>
+          <w:i/>
+          <w:iCs/>
+        </w:rPr>
+        <w:t xml:space="preserve">Cancer Research</w:t>
+      </w:r>
+      <w:r>
+        <w:t xml:space="preserve"> </w:t>
+      </w:r>
+      <w:r>
+        <w:t xml:space="preserve">73 (20): 6106–10.</w:t>
+      </w:r>
+      <w:r>
+        <w:t xml:space="preserve"> </w:t>
+      </w:r>
+      <w:hyperlink r:id="rId75">
+        <w:r>
+          <w:rPr>
+            <w:rStyle w:val="Hyperlink"/>
+          </w:rPr>
+          <w:t xml:space="preserve">https://doi.org/10.1158/0008-5472.CAN-13-1633</w:t>
+        </w:r>
+      </w:hyperlink>
+      <w:r>
+        <w:t xml:space="preserve">.</w:t>
+      </w:r>
+    </w:p>
+    <w:bookmarkEnd w:id="76"/>
+    <w:bookmarkStart w:id="78" w:name="ref-dibaeinia2026context"/>
     <w:p>
       <w:pPr>
         <w:pStyle w:val="Bibliography"/>
@@ -5026,7 +5897,7 @@
       <w:r>
         <w:t xml:space="preserve"> </w:t>
       </w:r>
-      <w:hyperlink r:id="rId61">
+      <w:hyperlink r:id="rId77">
         <w:r>
           <w:rPr>
             <w:rStyle w:val="Hyperlink"/>
@@ -5038,8 +5909,8 @@
         <w:t xml:space="preserve">.</w:t>
       </w:r>
     </w:p>
-    <w:bookmarkEnd w:id="62"/>
-    <w:bookmarkStart w:id="64" w:name="ref-dibaeinia2020"/>
+    <w:bookmarkEnd w:id="78"/>
+    <w:bookmarkStart w:id="80" w:name="ref-dibaeinia2020"/>
     <w:p>
       <w:pPr>
         <w:pStyle w:val="Bibliography"/>
@@ -5078,7 +5949,7 @@
       <w:r>
         <w:t xml:space="preserve"> </w:t>
       </w:r>
-      <w:hyperlink r:id="rId63">
+      <w:hyperlink r:id="rId79">
         <w:r>
           <w:rPr>
             <w:rStyle w:val="Hyperlink"/>
@@ -5090,8 +5961,8 @@
         <w:t xml:space="preserve">.</w:t>
       </w:r>
     </w:p>
-    <w:bookmarkEnd w:id="64"/>
-    <w:bookmarkStart w:id="66" w:name="ref-vandijk2018"/>
+    <w:bookmarkEnd w:id="80"/>
+    <w:bookmarkStart w:id="82" w:name="ref-vandijk2018"/>
     <w:p>
       <w:pPr>
         <w:pStyle w:val="Bibliography"/>
@@ -5124,7 +5995,7 @@
       <w:r>
         <w:t xml:space="preserve"> </w:t>
       </w:r>
-      <w:hyperlink r:id="rId65">
+      <w:hyperlink r:id="rId81">
         <w:r>
           <w:rPr>
             <w:rStyle w:val="Hyperlink"/>
@@ -5136,8 +6007,8 @@
         <w:t xml:space="preserve">.</w:t>
       </w:r>
     </w:p>
-    <w:bookmarkEnd w:id="66"/>
-    <w:bookmarkStart w:id="68" w:name="ref-friedman2006"/>
+    <w:bookmarkEnd w:id="82"/>
+    <w:bookmarkStart w:id="84" w:name="ref-friedman2006"/>
     <w:p>
       <w:pPr>
         <w:pStyle w:val="Bibliography"/>
@@ -5170,7 +6041,7 @@
       <w:r>
         <w:t xml:space="preserve"> </w:t>
       </w:r>
-      <w:hyperlink r:id="rId67">
+      <w:hyperlink r:id="rId83">
         <w:r>
           <w:rPr>
             <w:rStyle w:val="Hyperlink"/>
@@ -5182,8 +6053,8 @@
         <w:t xml:space="preserve">.</w:t>
       </w:r>
     </w:p>
-    <w:bookmarkEnd w:id="68"/>
-    <w:bookmarkStart w:id="70" w:name="ref-ghosh2025powerseek"/>
+    <w:bookmarkEnd w:id="84"/>
+    <w:bookmarkStart w:id="86" w:name="ref-ghosh2025powerseek"/>
     <w:p>
       <w:pPr>
         <w:pStyle w:val="Bibliography"/>
@@ -5225,7 +6096,7 @@
       <w:r>
         <w:t xml:space="preserve"> </w:t>
       </w:r>
-      <w:hyperlink r:id="rId69">
+      <w:hyperlink r:id="rId85">
         <w:r>
           <w:rPr>
             <w:rStyle w:val="Hyperlink"/>
@@ -5237,8 +6108,66 @@
         <w:t xml:space="preserve">.</w:t>
       </w:r>
     </w:p>
-    <w:bookmarkEnd w:id="70"/>
-    <w:bookmarkStart w:id="72" w:name="ref-gillespie1977"/>
+    <w:bookmarkEnd w:id="86"/>
+    <w:bookmarkStart w:id="88" w:name="ref-gilbert2013"/>
+    <w:p>
+      <w:pPr>
+        <w:pStyle w:val="Bibliography"/>
+      </w:pPr>
+      <w:r>
+        <w:t xml:space="preserve">Gilbert, Mark R., Meihua Wang, Kenneth D. Aldape, et al. 2013.</w:t>
+      </w:r>
+      <w:r>
+        <w:t xml:space="preserve"> </w:t>
+      </w:r>
+      <w:r>
+        <w:t xml:space="preserve">“Dose-Dense Temozolomide for Newly Diagnosed Glioblastoma: A Randomized Phase</w:t>
+      </w:r>
+      <w:r>
+        <w:t xml:space="preserve"> </w:t>
+      </w:r>
+      <w:r>
+        <w:t xml:space="preserve">III</w:t>
+      </w:r>
+      <w:r>
+        <w:t xml:space="preserve"> </w:t>
+      </w:r>
+      <w:r>
+        <w:t xml:space="preserve">Clinical Trial.”</w:t>
+      </w:r>
+      <w:r>
+        <w:t xml:space="preserve"> </w:t>
+      </w:r>
+      <w:r>
+        <w:rPr>
+          <w:i/>
+          <w:iCs/>
+        </w:rPr>
+        <w:t xml:space="preserve">Journal of Clinical Oncology</w:t>
+      </w:r>
+      <w:r>
+        <w:t xml:space="preserve"> </w:t>
+      </w:r>
+      <w:r>
+        <w:t xml:space="preserve">31 (32): 4085–91.</w:t>
+      </w:r>
+      <w:r>
+        <w:t xml:space="preserve"> </w:t>
+      </w:r>
+      <w:hyperlink r:id="rId87">
+        <w:r>
+          <w:rPr>
+            <w:rStyle w:val="Hyperlink"/>
+          </w:rPr>
+          <w:t xml:space="preserve">https://doi.org/10.1200/JCO.2013.49.6968</w:t>
+        </w:r>
+      </w:hyperlink>
+      <w:r>
+        <w:t xml:space="preserve">.</w:t>
+      </w:r>
+    </w:p>
+    <w:bookmarkEnd w:id="88"/>
+    <w:bookmarkStart w:id="90" w:name="ref-gillespie1977"/>
     <w:p>
       <w:pPr>
         <w:pStyle w:val="Bibliography"/>
@@ -5271,7 +6200,7 @@
       <w:r>
         <w:t xml:space="preserve"> </w:t>
       </w:r>
-      <w:hyperlink r:id="rId71">
+      <w:hyperlink r:id="rId89">
         <w:r>
           <w:rPr>
             <w:rStyle w:val="Hyperlink"/>
@@ -5283,8 +6212,8 @@
         <w:t xml:space="preserve">.</w:t>
       </w:r>
     </w:p>
-    <w:bookmarkEnd w:id="72"/>
-    <w:bookmarkStart w:id="74" w:name="ref-gillespie2001"/>
+    <w:bookmarkEnd w:id="90"/>
+    <w:bookmarkStart w:id="92" w:name="ref-gillespie2001"/>
     <w:p>
       <w:pPr>
         <w:pStyle w:val="Bibliography"/>
@@ -5317,7 +6246,7 @@
       <w:r>
         <w:t xml:space="preserve"> </w:t>
       </w:r>
-      <w:hyperlink r:id="rId73">
+      <w:hyperlink r:id="rId91">
         <w:r>
           <w:rPr>
             <w:rStyle w:val="Hyperlink"/>
@@ -5329,8 +6258,8 @@
         <w:t xml:space="preserve">.</w:t>
       </w:r>
     </w:p>
-    <w:bookmarkEnd w:id="74"/>
-    <w:bookmarkStart w:id="76" w:name="ref-harmange2023"/>
+    <w:bookmarkEnd w:id="92"/>
+    <w:bookmarkStart w:id="94" w:name="ref-harmange2023"/>
     <w:p>
       <w:pPr>
         <w:pStyle w:val="Bibliography"/>
@@ -5363,7 +6292,7 @@
       <w:r>
         <w:t xml:space="preserve"> </w:t>
       </w:r>
-      <w:hyperlink r:id="rId75">
+      <w:hyperlink r:id="rId93">
         <w:r>
           <w:rPr>
             <w:rStyle w:val="Hyperlink"/>
@@ -5375,8 +6304,8 @@
         <w:t xml:space="preserve">.</w:t>
       </w:r>
     </w:p>
-    <w:bookmarkEnd w:id="76"/>
-    <w:bookmarkStart w:id="78" w:name="ref-huh2011"/>
+    <w:bookmarkEnd w:id="94"/>
+    <w:bookmarkStart w:id="96" w:name="ref-huh2011"/>
     <w:p>
       <w:pPr>
         <w:pStyle w:val="Bibliography"/>
@@ -5409,7 +6338,7 @@
       <w:r>
         <w:t xml:space="preserve"> </w:t>
       </w:r>
-      <w:hyperlink r:id="rId77">
+      <w:hyperlink r:id="rId95">
         <w:r>
           <w:rPr>
             <w:rStyle w:val="Hyperlink"/>
@@ -5421,8 +6350,8 @@
         <w:t xml:space="preserve">.</w:t>
       </w:r>
     </w:p>
-    <w:bookmarkEnd w:id="78"/>
-    <w:bookmarkStart w:id="80" w:name="ref-huynhthu2010"/>
+    <w:bookmarkEnd w:id="96"/>
+    <w:bookmarkStart w:id="98" w:name="ref-huynhthu2010"/>
     <w:p>
       <w:pPr>
         <w:pStyle w:val="Bibliography"/>
@@ -5455,7 +6384,7 @@
       <w:r>
         <w:t xml:space="preserve"> </w:t>
       </w:r>
-      <w:hyperlink r:id="rId79">
+      <w:hyperlink r:id="rId97">
         <w:r>
           <w:rPr>
             <w:rStyle w:val="Hyperlink"/>
@@ -5467,8 +6396,8 @@
         <w:t xml:space="preserve">.</w:t>
       </w:r>
     </w:p>
-    <w:bookmarkEnd w:id="80"/>
-    <w:bookmarkStart w:id="82" w:name="ref-iyer2025"/>
+    <w:bookmarkEnd w:id="98"/>
+    <w:bookmarkStart w:id="100" w:name="ref-iyer2025"/>
     <w:p>
       <w:pPr>
         <w:pStyle w:val="Bibliography"/>
@@ -5501,7 +6430,7 @@
       <w:r>
         <w:t xml:space="preserve"> </w:t>
       </w:r>
-      <w:hyperlink r:id="rId81">
+      <w:hyperlink r:id="rId99">
         <w:r>
           <w:rPr>
             <w:rStyle w:val="Hyperlink"/>
@@ -5513,8 +6442,8 @@
         <w:t xml:space="preserve">.</w:t>
       </w:r>
     </w:p>
-    <w:bookmarkEnd w:id="82"/>
-    <w:bookmarkStart w:id="84" w:name="ref-lasri2020"/>
+    <w:bookmarkEnd w:id="100"/>
+    <w:bookmarkStart w:id="102" w:name="ref-lasri2020"/>
     <w:p>
       <w:pPr>
         <w:pStyle w:val="Bibliography"/>
@@ -5565,7 +6494,7 @@
       <w:r>
         <w:t xml:space="preserve"> </w:t>
       </w:r>
-      <w:hyperlink r:id="rId83">
+      <w:hyperlink r:id="rId101">
         <w:r>
           <w:rPr>
             <w:rStyle w:val="Hyperlink"/>
@@ -5577,8 +6506,8 @@
         <w:t xml:space="preserve">.</w:t>
       </w:r>
     </w:p>
-    <w:bookmarkEnd w:id="84"/>
-    <w:bookmarkStart w:id="86" w:name="ref-lasri2022"/>
+    <w:bookmarkEnd w:id="102"/>
+    <w:bookmarkStart w:id="104" w:name="ref-lasri2022"/>
     <w:p>
       <w:pPr>
         <w:pStyle w:val="Bibliography"/>
@@ -5623,7 +6552,7 @@
       <w:r>
         <w:t xml:space="preserve"> </w:t>
       </w:r>
-      <w:hyperlink r:id="rId85">
+      <w:hyperlink r:id="rId103">
         <w:r>
           <w:rPr>
             <w:rStyle w:val="Hyperlink"/>
@@ -5635,8 +6564,8 @@
         <w:t xml:space="preserve">.</w:t>
       </w:r>
     </w:p>
-    <w:bookmarkEnd w:id="86"/>
-    <w:bookmarkStart w:id="88" w:name="ref-li2025scmultisim"/>
+    <w:bookmarkEnd w:id="104"/>
+    <w:bookmarkStart w:id="106" w:name="ref-li2025scmultisim"/>
     <w:p>
       <w:pPr>
         <w:pStyle w:val="Bibliography"/>
@@ -5672,7 +6601,7 @@
       <w:r>
         <w:t xml:space="preserve"> </w:t>
       </w:r>
-      <w:hyperlink r:id="rId87">
+      <w:hyperlink r:id="rId105">
         <w:r>
           <w:rPr>
             <w:rStyle w:val="Hyperlink"/>
@@ -5684,8 +6613,8 @@
         <w:t xml:space="preserve">.</w:t>
       </w:r>
     </w:p>
-    <w:bookmarkEnd w:id="88"/>
-    <w:bookmarkStart w:id="90" w:name="ref-lin2025memory"/>
+    <w:bookmarkEnd w:id="106"/>
+    <w:bookmarkStart w:id="108" w:name="ref-lin2025memory"/>
     <w:p>
       <w:pPr>
         <w:pStyle w:val="Bibliography"/>
@@ -5718,7 +6647,7 @@
       <w:r>
         <w:t xml:space="preserve"> </w:t>
       </w:r>
-      <w:hyperlink r:id="rId89">
+      <w:hyperlink r:id="rId107">
         <w:r>
           <w:rPr>
             <w:rStyle w:val="Hyperlink"/>
@@ -5730,8 +6659,54 @@
         <w:t xml:space="preserve">.</w:t>
       </w:r>
     </w:p>
-    <w:bookmarkEnd w:id="90"/>
-    <w:bookmarkStart w:id="92" w:name="ref-pan2022tedsim"/>
+    <w:bookmarkEnd w:id="108"/>
+    <w:bookmarkStart w:id="110" w:name="ref-ostermann2004"/>
+    <w:p>
+      <w:pPr>
+        <w:pStyle w:val="Bibliography"/>
+      </w:pPr>
+      <w:r>
+        <w:t xml:space="preserve">Ostermann, Sandrine, Chantal Csajka, Thierry Buclin, et al. 2004.</w:t>
+      </w:r>
+      <w:r>
+        <w:t xml:space="preserve"> </w:t>
+      </w:r>
+      <w:r>
+        <w:t xml:space="preserve">“Plasma and Cerebrospinal Fluid Population Pharmacokinetics of Temozolomide in Malignant Glioma Patients.”</w:t>
+      </w:r>
+      <w:r>
+        <w:t xml:space="preserve"> </w:t>
+      </w:r>
+      <w:r>
+        <w:rPr>
+          <w:i/>
+          <w:iCs/>
+        </w:rPr>
+        <w:t xml:space="preserve">Clinical Cancer Research</w:t>
+      </w:r>
+      <w:r>
+        <w:t xml:space="preserve"> </w:t>
+      </w:r>
+      <w:r>
+        <w:t xml:space="preserve">10 (11): 3728–36.</w:t>
+      </w:r>
+      <w:r>
+        <w:t xml:space="preserve"> </w:t>
+      </w:r>
+      <w:hyperlink r:id="rId109">
+        <w:r>
+          <w:rPr>
+            <w:rStyle w:val="Hyperlink"/>
+          </w:rPr>
+          <w:t xml:space="preserve">https://doi.org/10.1158/1078-0432.CCR-03-0807</w:t>
+        </w:r>
+      </w:hyperlink>
+      <w:r>
+        <w:t xml:space="preserve">.</w:t>
+      </w:r>
+    </w:p>
+    <w:bookmarkEnd w:id="110"/>
+    <w:bookmarkStart w:id="112" w:name="ref-pan2022tedsim"/>
     <w:p>
       <w:pPr>
         <w:pStyle w:val="Bibliography"/>
@@ -5782,7 +6757,7 @@
       <w:r>
         <w:t xml:space="preserve"> </w:t>
       </w:r>
-      <w:hyperlink r:id="rId91">
+      <w:hyperlink r:id="rId111">
         <w:r>
           <w:rPr>
             <w:rStyle w:val="Hyperlink"/>
@@ -5794,8 +6769,8 @@
         <w:t xml:space="preserve">.</w:t>
       </w:r>
     </w:p>
-    <w:bookmarkEnd w:id="92"/>
-    <w:bookmarkStart w:id="94" w:name="ref-peccoud1995"/>
+    <w:bookmarkEnd w:id="112"/>
+    <w:bookmarkStart w:id="114" w:name="ref-peccoud1995"/>
     <w:p>
       <w:pPr>
         <w:pStyle w:val="Bibliography"/>
@@ -5828,7 +6803,7 @@
       <w:r>
         <w:t xml:space="preserve"> </w:t>
       </w:r>
-      <w:hyperlink r:id="rId93">
+      <w:hyperlink r:id="rId113">
         <w:r>
           <w:rPr>
             <w:rStyle w:val="Hyperlink"/>
@@ -5840,8 +6815,8 @@
         <w:t xml:space="preserve">.</w:t>
       </w:r>
     </w:p>
-    <w:bookmarkEnd w:id="94"/>
-    <w:bookmarkStart w:id="96" w:name="ref-piho2025abm"/>
+    <w:bookmarkEnd w:id="114"/>
+    <w:bookmarkStart w:id="116" w:name="ref-piho2025abm"/>
     <w:p>
       <w:pPr>
         <w:pStyle w:val="Bibliography"/>
@@ -5880,7 +6855,7 @@
       <w:r>
         <w:t xml:space="preserve"> </w:t>
       </w:r>
-      <w:hyperlink r:id="rId95">
+      <w:hyperlink r:id="rId115">
         <w:r>
           <w:rPr>
             <w:rStyle w:val="Hyperlink"/>
@@ -5892,8 +6867,8 @@
         <w:t xml:space="preserve">.</w:t>
       </w:r>
     </w:p>
-    <w:bookmarkEnd w:id="96"/>
-    <w:bookmarkStart w:id="98" w:name="ref-sciml"/>
+    <w:bookmarkEnd w:id="116"/>
+    <w:bookmarkStart w:id="118" w:name="ref-sciml"/>
     <w:p>
       <w:pPr>
         <w:pStyle w:val="Bibliography"/>
@@ -5947,7 +6922,7 @@
       <w:r>
         <w:t xml:space="preserve"> </w:t>
       </w:r>
-      <w:hyperlink r:id="rId97">
+      <w:hyperlink r:id="rId117">
         <w:r>
           <w:rPr>
             <w:rStyle w:val="Hyperlink"/>
@@ -5959,8 +6934,8 @@
         <w:t xml:space="preserve">.</w:t>
       </w:r>
     </w:p>
-    <w:bookmarkEnd w:id="98"/>
-    <w:bookmarkStart w:id="100" w:name="ref-shaffer2017"/>
+    <w:bookmarkEnd w:id="118"/>
+    <w:bookmarkStart w:id="120" w:name="ref-shaffer2017"/>
     <w:p>
       <w:pPr>
         <w:pStyle w:val="Bibliography"/>
@@ -5993,7 +6968,7 @@
       <w:r>
         <w:t xml:space="preserve"> </w:t>
       </w:r>
-      <w:hyperlink r:id="rId99">
+      <w:hyperlink r:id="rId119">
         <w:r>
           <w:rPr>
             <w:rStyle w:val="Hyperlink"/>
@@ -6005,8 +6980,8 @@
         <w:t xml:space="preserve">.</w:t>
       </w:r>
     </w:p>
-    <w:bookmarkEnd w:id="100"/>
-    <w:bookmarkStart w:id="102" w:name="ref-shaffer2020"/>
+    <w:bookmarkEnd w:id="120"/>
+    <w:bookmarkStart w:id="122" w:name="ref-shaffer2020"/>
     <w:p>
       <w:pPr>
         <w:pStyle w:val="Bibliography"/>
@@ -6039,7 +7014,7 @@
       <w:r>
         <w:t xml:space="preserve"> </w:t>
       </w:r>
-      <w:hyperlink r:id="rId101">
+      <w:hyperlink r:id="rId121">
         <w:r>
           <w:rPr>
             <w:rStyle w:val="Hyperlink"/>
@@ -6051,8 +7026,8 @@
         <w:t xml:space="preserve">.</w:t>
       </w:r>
     </w:p>
-    <w:bookmarkEnd w:id="102"/>
-    <w:bookmarkStart w:id="104" w:name="ref-shahrezaei2008"/>
+    <w:bookmarkEnd w:id="122"/>
+    <w:bookmarkStart w:id="124" w:name="ref-shahrezaei2008"/>
     <w:p>
       <w:pPr>
         <w:pStyle w:val="Bibliography"/>
@@ -6085,7 +7060,7 @@
       <w:r>
         <w:t xml:space="preserve"> </w:t>
       </w:r>
-      <w:hyperlink r:id="rId103">
+      <w:hyperlink r:id="rId123">
         <w:r>
           <w:rPr>
             <w:rStyle w:val="Hyperlink"/>
@@ -6097,8 +7072,8 @@
         <w:t xml:space="preserve">.</w:t>
       </w:r>
     </w:p>
-    <w:bookmarkEnd w:id="104"/>
-    <w:bookmarkStart w:id="106" w:name="ref-sukys2025"/>
+    <w:bookmarkEnd w:id="124"/>
+    <w:bookmarkStart w:id="126" w:name="ref-sukys2025"/>
     <w:p>
       <w:pPr>
         <w:pStyle w:val="Bibliography"/>
@@ -6143,7 +7118,7 @@
       <w:r>
         <w:t xml:space="preserve"> </w:t>
       </w:r>
-      <w:hyperlink r:id="rId105">
+      <w:hyperlink r:id="rId125">
         <w:r>
           <w:rPr>
             <w:rStyle w:val="Hyperlink"/>
@@ -6155,8 +7130,8 @@
         <w:t xml:space="preserve">.</w:t>
       </w:r>
     </w:p>
-    <w:bookmarkEnd w:id="106"/>
-    <w:bookmarkStart w:id="108" w:name="ref-toni2009"/>
+    <w:bookmarkEnd w:id="126"/>
+    <w:bookmarkStart w:id="128" w:name="ref-toni2009"/>
     <w:p>
       <w:pPr>
         <w:pStyle w:val="Bibliography"/>
@@ -6201,7 +7176,7 @@
       <w:r>
         <w:t xml:space="preserve"> </w:t>
       </w:r>
-      <w:hyperlink r:id="rId107">
+      <w:hyperlink r:id="rId127">
         <w:r>
           <w:rPr>
             <w:rStyle w:val="Hyperlink"/>
@@ -6213,8 +7188,8 @@
         <w:t xml:space="preserve">.</w:t>
       </w:r>
     </w:p>
-    <w:bookmarkEnd w:id="108"/>
-    <w:bookmarkStart w:id="110" w:name="ref-vollenweider2026"/>
+    <w:bookmarkEnd w:id="128"/>
+    <w:bookmarkStart w:id="130" w:name="ref-vollenweider2026"/>
     <w:p>
       <w:pPr>
         <w:pStyle w:val="Bibliography"/>
@@ -6244,7 +7219,7 @@
       <w:r>
         <w:t xml:space="preserve"> </w:t>
       </w:r>
-      <w:hyperlink r:id="rId109">
+      <w:hyperlink r:id="rId129">
         <w:r>
           <w:rPr>
             <w:rStyle w:val="Hyperlink"/>
@@ -6256,8 +7231,8 @@
         <w:t xml:space="preserve">.</w:t>
       </w:r>
     </w:p>
-    <w:bookmarkEnd w:id="110"/>
-    <w:bookmarkStart w:id="112" w:name="ref-wagner2018"/>
+    <w:bookmarkEnd w:id="130"/>
+    <w:bookmarkStart w:id="132" w:name="ref-wagner2018"/>
     <w:p>
       <w:pPr>
         <w:pStyle w:val="Bibliography"/>
@@ -6299,7 +7274,7 @@
       <w:r>
         <w:t xml:space="preserve"> </w:t>
       </w:r>
-      <w:hyperlink r:id="rId111">
+      <w:hyperlink r:id="rId131">
         <w:r>
           <w:rPr>
             <w:rStyle w:val="Hyperlink"/>
@@ -6311,8 +7286,54 @@
         <w:t xml:space="preserve">.</w:t>
       </w:r>
     </w:p>
-    <w:bookmarkEnd w:id="112"/>
-    <w:bookmarkStart w:id="114" w:name="ref-zhang2025"/>
+    <w:bookmarkEnd w:id="132"/>
+    <w:bookmarkStart w:id="134" w:name="ref-zhang2017adaptive"/>
+    <w:p>
+      <w:pPr>
+        <w:pStyle w:val="Bibliography"/>
+      </w:pPr>
+      <w:r>
+        <w:t xml:space="preserve">Zhang, Jingsong, Jessica J. Cunningham, Joel S. Brown, and Robert A. Gatenby. 2017.</w:t>
+      </w:r>
+      <w:r>
+        <w:t xml:space="preserve"> </w:t>
+      </w:r>
+      <w:r>
+        <w:t xml:space="preserve">“Integrating Evolutionary Dynamics into Treatment of Metastatic Castrate-Resistant Prostate Cancer.”</w:t>
+      </w:r>
+      <w:r>
+        <w:t xml:space="preserve"> </w:t>
+      </w:r>
+      <w:r>
+        <w:rPr>
+          <w:i/>
+          <w:iCs/>
+        </w:rPr>
+        <w:t xml:space="preserve">Nature Communications</w:t>
+      </w:r>
+      <w:r>
+        <w:t xml:space="preserve"> </w:t>
+      </w:r>
+      <w:r>
+        <w:t xml:space="preserve">8: 1816.</w:t>
+      </w:r>
+      <w:r>
+        <w:t xml:space="preserve"> </w:t>
+      </w:r>
+      <w:hyperlink r:id="rId133">
+        <w:r>
+          <w:rPr>
+            <w:rStyle w:val="Hyperlink"/>
+          </w:rPr>
+          <w:t xml:space="preserve">https://doi.org/10.1038/s41467-017-01968-5</w:t>
+        </w:r>
+      </w:hyperlink>
+      <w:r>
+        <w:t xml:space="preserve">.</w:t>
+      </w:r>
+    </w:p>
+    <w:bookmarkEnd w:id="134"/>
+    <w:bookmarkStart w:id="136" w:name="ref-zhang2025"/>
     <w:p>
       <w:pPr>
         <w:pStyle w:val="Bibliography"/>
@@ -6345,7 +7366,7 @@
       <w:r>
         <w:t xml:space="preserve"> </w:t>
       </w:r>
-      <w:hyperlink r:id="rId113">
+      <w:hyperlink r:id="rId135">
         <w:r>
           <w:rPr>
             <w:rStyle w:val="Hyperlink"/>
@@ -6357,8 +7378,8 @@
         <w:t xml:space="preserve">.</w:t>
       </w:r>
     </w:p>
-    <w:bookmarkEnd w:id="114"/>
-    <w:bookmarkStart w:id="116" w:name="ref-zinati2024groundgan"/>
+    <w:bookmarkEnd w:id="136"/>
+    <w:bookmarkStart w:id="138" w:name="ref-zinati2024groundgan"/>
     <w:p>
       <w:pPr>
         <w:pStyle w:val="Bibliography"/>
@@ -6418,7 +7439,7 @@
       <w:r>
         <w:t xml:space="preserve"> </w:t>
       </w:r>
-      <w:hyperlink r:id="rId115">
+      <w:hyperlink r:id="rId137">
         <w:r>
           <w:rPr>
             <w:rStyle w:val="Hyperlink"/>
@@ -6430,9 +7451,9 @@
         <w:t xml:space="preserve">.</w:t>
       </w:r>
     </w:p>
-    <w:bookmarkEnd w:id="116"/>
-    <w:bookmarkEnd w:id="117"/>
-    <w:bookmarkEnd w:id="118"/>
+    <w:bookmarkEnd w:id="138"/>
+    <w:bookmarkEnd w:id="139"/>
+    <w:bookmarkEnd w:id="140"/>
     <w:sectPr>
       <w:footnotePr>
         <w:numRestart w:val="eachSect"/>

</xml_diff>

<commit_message>
Figure 8 layout and Results wording; paper README rows for Figures 7 and 8
- Figure 8: shared legend for the schedule trajectories, censoring line in the
  loss-of-control panel, optimiser legend below the maps, colour/linestyle split
  legends for the temozolomide panels, rotated MGMT group labels, shorter axis
  labels; no label or legend now overlaps data.
- Results: the fitness-cost comparison states that all schedules are censored at
  the end of follow-up; the MGMT-consumption paragraph now matches the data
  (largest dose-dense gain in the methylated population, small arm difference in
  the unmethylated one, final sizes reported); explicit "no measurable kill".
- fill_numbers: final-size keys for the temozolomide regimens.
- paper/README: script rows for the calibration and schedule figures.

Co-Authored-By: Claude Fable 5.1 <noreply@anthropic.com>
Claude-Session: https://claude.ai/code/session_01PjfG7i2deAXT3znmpkGkmY
</commit_message>
<xml_diff>
--- a/paper/manuscript/manuscript.docx
+++ b/paper/manuscript/manuscript.docx
@@ -2294,7 +2294,7 @@
         <w:pStyle w:val="FirstParagraph"/>
       </w:pPr>
       <w:r>
-        <w:t xml:space="preserve">With a calibrated model the framework becomes a schedule testbed. We first asked which dosing schedule minimises regrowth for a melanoma-like population with a rare, heritable pre-resistant state</w:t>
+        <w:t xml:space="preserve">With a calibrated model the framework becomes a schedule testbed. We first asked which dosing schedule best delays regrowth of a melanoma-like population with a rare, heritable pre-resistant state</w:t>
       </w:r>
       <w:r>
         <w:t xml:space="preserve"> </w:t>
@@ -2324,7 +2324,7 @@
         <w:t xml:space="preserve">(Zhang et al. 2017)</w:t>
       </w:r>
       <w:r>
-        <w:t xml:space="preserve">. When the resistant state carries no fitness cost, as the lineage data of</w:t>
+        <w:t xml:space="preserve">. Because adaptive therapy deliberately lets the tumour regrow, schedules are compared by the time after randomisation at which the population exceeds 120% of its pre-treatment size (loss of control), with the RECIST-like time to progression from the nadir reported alongside (Methods). The answer depends on two properties of the resistant cells (Figure 8a-d). When the resistant state is fully protective and carries no fitness cost, as the lineage data of</w:t>
       </w:r>
       <w:r>
         <w:t xml:space="preserve"> </w:t>
@@ -2336,7 +2336,7 @@
         <w:t xml:space="preserve"> </w:t>
       </w:r>
       <w:r>
-        <w:t xml:space="preserve">indicate for pre-existing tolerance, continuous dosing gives the longest time to progression ([ttp_cont_nocost] weeks against [ttp_int_nocost] for the intermittent schedule and [ttp_adapt_nocost] for adaptive therapy; Figure 8a,c), the ranking observed in the trial, where continuous dosing gave a median progression-free survival of 9.0 months against 5.5 months for intermittent dosing. When resistant cells pay a fitness cost in the absence of drug, the drug addiction that made intermittent dosing superior in patient-derived xenografts</w:t>
+        <w:t xml:space="preserve">indicate for pre-existing tolerance, resistant cells grow at the same rate with or without drug, holidays only let sensitive cells regrow and be killed again, and the three schedules lose control after 23, 26 and 27 weeks (continuous, intermittent, adaptive), the intermittent schedule delivering 65% of the cumulative dose. When resistant cells pay a 50% fitness cost in the absence of drug, the drug addiction that made intermittent dosing superior in patient-derived xenografts</w:t>
       </w:r>
       <w:r>
         <w:t xml:space="preserve"> </w:t>
@@ -2345,7 +2345,7 @@
         <w:t xml:space="preserve">(Das Thakur and Stuart 2013)</w:t>
       </w:r>
       <w:r>
-        <w:t xml:space="preserve">, the ranking reverses: the intermittent schedule and adaptive therapy delay progression to [ttp_int_cost] and [ttp_adapt_cost] weeks against [ttp_cont_cost] for continuous dosing, with adaptive therapy using [dose_adapt_cost] of the cumulative dose (Figure 8b,c). The optimiser makes the dependence explicit: over intermittent schedules of any period and duty cycle, the best schedule without a fitness cost is [best_nocost], and with a fitness cost release period 10, dose 2 (growth rate -0.016 per time unit) (Figure 8d). The model therefore reproduces both clinical and preclinical outcomes and attributes their difference to a measurable property of the resistant cells, their fitness without drug, which the framework can estimate from growth data before a schedule is chosen.</w:t>
+        <w:t xml:space="preserve">, holidays let sensitive cells outcompete them: none of the three schedules loses control within the 52-week follow-up (52+, 52+ and 52+ weeks, censored), and adaptive therapy achieves this with 36% of the cumulative dose of continuous dosing. When resistant cells are only partly protected and grow at half speed under drug, holidays release them: continuous dosing keeps control for 52+ weeks against 49 for the intermittent schedule and 43 for adaptive therapy, the ranking observed in the trial, where continuous dosing gave a median progression-free survival of 9.0 months against 5.5 months for intermittent dosing. The optimiser makes the dependence explicit (Figure 8e): over intermittent schedules of any period and duty cycle after the lead-in, the best schedule is a period of 2.2 weeks with 39% of the time on drug (27 weeks to loss of control) without a fitness cost, a period of 1.0 weeks with 47% of the time on drug (52 weeks to loss of control) with a fitness cost and a period of 1.0 weeks with 100% of the time on drug (52 weeks to loss of control) with partial protection. The model therefore reproduces both the clinical and the preclinical outcome and attributes their difference to measurable properties of the resistant cells, their growth under drug and their fitness without it, which the framework can estimate from growth and lineage data before a schedule is chosen.</w:t>
       </w:r>
     </w:p>
     <w:p>
@@ -2353,7 +2353,7 @@
         <w:pStyle w:val="BodyText"/>
       </w:pPr>
       <w:r>
-        <w:t xml:space="preserve">The second case study concerns glioblastoma, where the RTOG 0525 trial compared the standard temozolomide regimen (150-200 mg/m² on days 1-5 of 28-day cycles) with a dose-dense regimen (75-100 mg/m² on days 1-21) that delivers about twice the cumulative dose, and found no difference in overall survival (16.6 against 14.9 months) for either MGMT-methylated or unmethylated tumours</w:t>
+        <w:t xml:space="preserve">The second case study concerns glioblastoma, where the RTOG 0525 trial compared the standard temozolomide regimen (150-200 mg/m² on days 1-5 of 28-day cycles) with a dose-dense regimen (75-100 mg/m² on days 1-21) that delivers about twice the cumulative dose and was designed to deplete MGMT, and found no difference in survival for either MGMT-methylated or unmethylated tumours</w:t>
       </w:r>
       <w:r>
         <w:t xml:space="preserve"> </w:t>
@@ -2362,7 +2362,7 @@
         <w:t xml:space="preserve">(Gilbert et al. 2013)</w:t>
       </w:r>
       <w:r>
-        <w:t xml:space="preserve">. Simulating both regimens with one-compartment pharmacokinetics (elimination half-life 2.1 h;</w:t>
+        <w:t xml:space="preserve">. We simulated both regimens with one-compartment pharmacokinetics (elimination half-life 2.1 h;</w:t>
       </w:r>
       <w:r>
         <w:t xml:space="preserve"> </w:t>
@@ -2380,7 +2380,87 @@
         <w:t xml:space="preserve">Lasri et al. (2020)</w:t>
       </w:r>
       <w:r>
-        <w:t xml:space="preserve">), [gbm_summary] (Figure 8e,f). At equal cumulative dose the number of dosing days per cycle [gbm_days_summary] (Figure 8g). These simulations are not fits to the trials, whose end points depend on much that the model omits, but they show how the framework turns a proposed regimen into a quantitative, mechanism-resolved prediction, and how it identifies which biological measurement, the fitness of resistant cells without drug or the fraction of cells protected, decides between regimens.</w:t>
+        <w:t xml:space="preserve">) and either stable or consumed by the drug, as a suicide enzyme is (Figure 8f,g). With stable MGMT, the depth of response over six cycles is 0.20 log</w:t>
+      </w:r>
+      <m:oMath>
+        <m:sSub>
+          <m:e>
+            <m:r>
+              <m:t>​</m:t>
+            </m:r>
+          </m:e>
+          <m:sub>
+            <m:r>
+              <m:t>10</m:t>
+            </m:r>
+          </m:sub>
+        </m:sSub>
+      </m:oMath>
+      <w:r>
+        <w:t xml:space="preserve"> </w:t>
+      </w:r>
+      <w:r>
+        <w:t xml:space="preserve">units for the standard regimen and 1.00 for the dose-dense regimen in the methylated population (0.08 and 0.10 in the unmethylated one), and a 21-day regimen at the standard cumulative dose achieves no measurable kill (0.00 log</w:t>
+      </w:r>
+      <m:oMath>
+        <m:sSub>
+          <m:e>
+            <m:r>
+              <m:t>​</m:t>
+            </m:r>
+          </m:e>
+          <m:sub>
+            <m:r>
+              <m:t>10</m:t>
+            </m:r>
+          </m:sub>
+        </m:sSub>
+      </m:oMath>
+      <w:r>
+        <w:t xml:space="preserve"> </w:t>
+      </w:r>
+      <w:r>
+        <w:t xml:space="preserve">units): the death hazard rises steeply with concentration, so spreading the same dose over more days loses efficacy, and the advantage of the dose-dense arm in the model is entirely its larger cumulative dose. When the drug consumes MGMT, prolonged exposure depletes the protection of expressing cells: in the methylated population the dose-dense regimen deepens its response to 1.24 log</w:t>
+      </w:r>
+      <m:oMath>
+        <m:sSub>
+          <m:e>
+            <m:r>
+              <m:t>​</m:t>
+            </m:r>
+          </m:e>
+          <m:sub>
+            <m:r>
+              <m:t>10</m:t>
+            </m:r>
+          </m:sub>
+        </m:sSub>
+      </m:oMath>
+      <w:r>
+        <w:t xml:space="preserve"> </w:t>
+      </w:r>
+      <w:r>
+        <w:t xml:space="preserve">units against 0.21 for the standard regimen, and in the unmethylated population, where 30% of cells start protected, both regimens improve (final size 1.7 and 1.4 times the initial size, against 4.9 and 3.6 with stable MGMT) but neither controls the population, so the difference between the arms stays small (0.14 against 0.17 log</w:t>
+      </w:r>
+      <m:oMath>
+        <m:sSub>
+          <m:e>
+            <m:r>
+              <m:t>​</m:t>
+            </m:r>
+          </m:e>
+          <m:sub>
+            <m:r>
+              <m:t>10</m:t>
+            </m:r>
+          </m:sub>
+        </m:sSub>
+      </m:oMath>
+      <w:r>
+        <w:t xml:space="preserve"> </w:t>
+      </w:r>
+      <w:r>
+        <w:t xml:space="preserve">units), as in the trial. At the standard cumulative dose the number of dosing days per cycle that minimises the final population is 9 (methylated) and 9 (unmethylated) with stable MGMT and 9 and 5 when MGMT is consumed (Figure 8h). These simulations are not fits to the trial, whose end points depend on much that the model omits, including dose-limiting toxicity, but they turn the rationale of dose-dense dosing into a quantitative prediction and identify the measurement that decides between regimens: how fast the drug consumes MGMT in the tumour.</w:t>
       </w:r>
     </w:p>
     <w:bookmarkEnd w:id="17"/>
@@ -4491,7 +4571,7 @@
         <w:t xml:space="preserve"> </w:t>
       </w:r>
       <w:r>
-        <w:t xml:space="preserve">minimises any such outcome over a box of schedule parameters: a log-spaced grid (or a Latin hypercube when the grid is large) is evaluated with the same random seeds for every candidate, and the best point is refined by Nelder-Mead in a bounded transform of the box; constraints such as a fixed cumulative dose enter as penalties or as the parameterisation (for instance a per-day dose equal to the budget divided by the number of dosing days). The melanoma case study uses a 30-h cell cycle, a pre-resistant fraction of 1:200 with a memory of five generations</w:t>
+        <w:t xml:space="preserve">minimises any such outcome over a box of schedule parameters: a log-spaced grid (or a Latin hypercube when the grid is large) is evaluated with the same random seeds for every candidate, and the best point is refined by Nelder-Mead in a bounded transform of the box; constraints such as a fixed cumulative dose enter as penalties or as the parameterisation (for instance a per-day dose equal to the budget divided by the number of dosing days). The case studies are run at the scale of a tumour rather than a culture: the cell cycle of the model is the net doubling time of the tumour (4 weeks for melanoma, 40 days for glioblastoma), gene-expression rates are scaled to the hour (mRNA half-life 7 h, protein half-life 35 h) and founders are drawn from the stationary distribution of promoter states. The melanoma case uses a pre-resistant fraction of 1:200 with a memory of five generations</w:t>
       </w:r>
       <w:r>
         <w:t xml:space="preserve"> </w:t>
@@ -4500,7 +4580,10 @@
         <w:t xml:space="preserve">(Shaffer et al. 2017, 2020)</w:t>
       </w:r>
       <w:r>
-        <w:t xml:space="preserve">, drug effects at the fractional-killing dose (state-dependent death and growth arrest, and a ten-fold stabilisation of the resistant state by the drug, the drug-induced reprogramming of</w:t>
+        <w:t xml:space="preserve"> </w:t>
+      </w:r>
+      <w:r>
+        <w:t xml:space="preserve">and drug effects at the fractional-killing dose: sensitive cells arrest and die with a half-life of two weeks, cells in the resistant state are protected, and the drug stabilises the resistant state ten-fold (the drug-induced reprogramming of</w:t>
       </w:r>
       <w:r>
         <w:t xml:space="preserve"> </w:t>
@@ -4509,7 +4592,7 @@
         <w:t xml:space="preserve">Shaffer et al. (2017)</w:t>
       </w:r>
       <w:r>
-        <w:t xml:space="preserve">), with or without a 50% fitness cost of the resistant state</w:t>
+        <w:t xml:space="preserve">). Three variants of the resistant state are compared: full protection without cost; a 50% fitness cost in the absence of drug</w:t>
       </w:r>
       <w:r>
         <w:t xml:space="preserve"> </w:t>
@@ -4518,16 +4601,7 @@
         <w:t xml:space="preserve">(Das Thakur and Stuart 2013)</w:t>
       </w:r>
       <w:r>
-        <w:t xml:space="preserve">; the temozolomide case study uses a 50-h cell cycle</w:t>
-      </w:r>
-      <w:r>
-        <w:t xml:space="preserve"> </w:t>
-      </w:r>
-      <w:r>
-        <w:t xml:space="preserve">(Lasri et al. 2020)</w:t>
-      </w:r>
-      <w:r>
-        <w:t xml:space="preserve">, an elimination half-life of 2.1 h</w:t>
+        <w:t xml:space="preserve">; and partial protection, in which resistant cells grow at half speed under drug. Progression is scored in two ways: from the nadir, as in RECIST (a 20% increase in diameter, taken as a 1.73-fold increase in cell number, after the 8-week lead-in), and as loss of control, the time after randomisation at which the population exceeds 120% of its pre-treatment size, the end point of adaptive-therapy studies, which is the one used to compare schedules that deliberately let the tumour regrow. The temozolomide case uses an elimination half-life of 2.1 h</w:t>
       </w:r>
       <w:r>
         <w:t xml:space="preserve"> </w:t>
@@ -4548,7 +4622,7 @@
         <w:t xml:space="preserve"> </w:t>
       </w:r>
       <w:r>
-        <w:t xml:space="preserve">(200 mg/m² on days 1-5 or 100 mg/m² on days 1-21 of 28-day cycles, six cycles) and MGMT-expressing fractions of 1% and 30% for methylated and unmethylated promoters.</w:t>
+        <w:t xml:space="preserve">(200 mg/m² on days 1-5 or 100 mg/m² on days 1-21 of 28-day cycles, six cycles), MGMT-expressing fractions of 1% and 30% for methylated and unmethylated promoters, and MGMT either stable or consumed by the drug (its degradation rate increased 20-fold at the standard peak concentration), the suicide-enzyme behaviour that motivated dose-dense schedules.</w:t>
       </w:r>
     </w:p>
     <w:bookmarkEnd w:id="28"/>
@@ -4751,7 +4825,7 @@
     </w:p>
     <w:bookmarkEnd w:id="31"/>
     <w:bookmarkEnd w:id="32"/>
-    <w:bookmarkStart w:id="54" w:name="figure-legends"/>
+    <w:bookmarkStart w:id="57" w:name="figure-legends"/>
     <w:p>
       <w:pPr>
         <w:pStyle w:val="Heading1"/>
@@ -5231,6 +5305,48 @@
       <w:pPr>
         <w:pStyle w:val="BodyText"/>
       </w:pPr>
+      <w:r>
+        <w:drawing>
+          <wp:inline>
+            <wp:extent cx="5334000" cy="5481448"/>
+            <wp:effectExtent b="0" l="0" r="0" t="0"/>
+            <wp:docPr descr="" title="" id="55" name="Picture"/>
+            <a:graphic>
+              <a:graphicData uri="http://schemas.openxmlformats.org/drawingml/2006/picture">
+                <pic:pic>
+                  <pic:nvPicPr>
+                    <pic:cNvPr descr="fig8_schedules.png" id="56" name="Picture"/>
+                    <pic:cNvPicPr>
+                      <a:picLocks noChangeArrowheads="1" noChangeAspect="1"/>
+                    </pic:cNvPicPr>
+                  </pic:nvPicPr>
+                  <pic:blipFill>
+                    <a:blip r:embed="rId54"/>
+                    <a:stretch>
+                      <a:fillRect/>
+                    </a:stretch>
+                  </pic:blipFill>
+                  <pic:spPr bwMode="auto">
+                    <a:xfrm>
+                      <a:off x="0" y="0"/>
+                      <a:ext cx="5334000" cy="5481448"/>
+                    </a:xfrm>
+                    <a:prstGeom prst="rect">
+                      <a:avLst/>
+                    </a:prstGeom>
+                    <a:noFill/>
+                    <a:ln w="9525">
+                      <a:noFill/>
+                      <a:headEnd/>
+                      <a:tailEnd/>
+                    </a:ln>
+                  </pic:spPr>
+                </pic:pic>
+              </a:graphicData>
+            </a:graphic>
+          </wp:inline>
+        </w:drawing>
+      </w:r>
     </w:p>
     <w:p>
       <w:pPr>
@@ -5247,11 +5363,11 @@
         <w:t xml:space="preserve"> </w:t>
       </w:r>
       <w:r>
-        <w:t xml:space="preserve">(a-b) Population size under continuous dosing, the intermittent schedule of the SWOG S1320 trial (8-week lead-in, then 3 weeks off and 5 weeks on) and adaptive therapy (drug withdrawn below 50% of the initial size, resumed at the initial size) for a melanoma-like population with a rare, heritable pre-resistant state, without (a) and with (b) a fitness cost of the resistant state. (c) Time to progression (20% regrowth from the nadir; mean ± s.d. of four seeds) for the three schedules and two mechanisms. (d) Time to progression over intermittent schedules of given period and duty cycle (every schedule evaluated by the optimiser; star: best), for the two mechanisms. (e) Population size under the standard (5 of 28 days) and dose-dense (21 of 28 days) temozolomide regimens of the RTOG 0525 trial and a 21-day regimen at the standard cumulative dose, simulated with one-compartment pharmacokinetics (elimination half-life 2.1 h) for MGMT-methylated (1% MGMT-expressing cells) and unmethylated (30%) populations. (f) Depth of response over six cycles (mean ± s.d. of three seeds). (g) Final population size against the number of dosing days per 28-day cycle at equal cumulative dose.</w:t>
-      </w:r>
-    </w:p>
-    <w:bookmarkEnd w:id="54"/>
-    <w:bookmarkStart w:id="55" w:name="data-and-code-availability"/>
+        <w:t xml:space="preserve">(a-c) Population size, relative to its pre-treatment value, under continuous dosing, the intermittent schedule of the SWOG S1320 trial (8-week lead-in, dashed line, then 3 weeks off and 5 weeks on) and adaptive therapy (drug withdrawn below 50% of the initial size, resumed at the initial size) for a melanoma-like population with a rare, heritable pre-resistant state, when the resistant state carries no fitness cost (a), when resistant cells grow 50% slower in the absence of drug (b), and when resistant cells are only partly protected and grow at half speed under drug (c); dotted line: 120% of the initial size. (d) Weeks after randomisation until the population exceeds 120% of its pre-treatment size (loss of control; mean ± s.d. of four seeds, censored at 52 weeks). (e) The same end point over intermittent schedules of given period and fraction of time on drug after the lead-in, for every schedule evaluated by the optimiser (star: best), for the three mechanisms. (f) Population size under the standard (5 of 28 days) and dose-dense (21 of 28 days) temozolomide regimens of the RTOG 0525 trial and a 21-day regimen at the standard cumulative dose, with one-compartment pharmacokinetics (elimination half-life 2.1 h) and consumption of MGMT by the drug, for populations in which 1% (methylated promoter, solid) or 30% (unmethylated, dashed) of cells express MGMT. (g) Depth of response over six cycles for the three regimens, the two populations and MGMT either stable or consumed by the drug (mean ± s.d. of two seeds). (h) Final population size against the number of dosing days per 28-day cycle at the standard cumulative dose.</w:t>
+      </w:r>
+    </w:p>
+    <w:bookmarkEnd w:id="57"/>
+    <w:bookmarkStart w:id="58" w:name="data-and-code-availability"/>
     <w:p>
       <w:pPr>
         <w:pStyle w:val="Heading1"/>
@@ -5322,8 +5438,8 @@
         <w:t xml:space="preserve">); the generated tables are archived with the release.</w:t>
       </w:r>
     </w:p>
-    <w:bookmarkEnd w:id="55"/>
-    <w:bookmarkStart w:id="56" w:name="author-contributions"/>
+    <w:bookmarkEnd w:id="58"/>
+    <w:bookmarkStart w:id="59" w:name="author-contributions"/>
     <w:p>
       <w:pPr>
         <w:pStyle w:val="Heading1"/>
@@ -5340,8 +5456,8 @@
         <w:t xml:space="preserve">A.L. and M.S. conceived the project. [To be completed.]</w:t>
       </w:r>
     </w:p>
-    <w:bookmarkEnd w:id="56"/>
-    <w:bookmarkStart w:id="57" w:name="competing-interests"/>
+    <w:bookmarkEnd w:id="59"/>
+    <w:bookmarkStart w:id="60" w:name="competing-interests"/>
     <w:p>
       <w:pPr>
         <w:pStyle w:val="Heading1"/>
@@ -5358,8 +5474,8 @@
         <w:t xml:space="preserve">The authors declare no competing interests.</w:t>
       </w:r>
     </w:p>
-    <w:bookmarkEnd w:id="57"/>
-    <w:bookmarkStart w:id="58" w:name="funding"/>
+    <w:bookmarkEnd w:id="60"/>
+    <w:bookmarkStart w:id="61" w:name="funding"/>
     <w:p>
       <w:pPr>
         <w:pStyle w:val="Heading1"/>
@@ -5376,8 +5492,8 @@
         <w:t xml:space="preserve">[To be completed.]</w:t>
       </w:r>
     </w:p>
-    <w:bookmarkEnd w:id="58"/>
-    <w:bookmarkStart w:id="140" w:name="references"/>
+    <w:bookmarkEnd w:id="61"/>
+    <w:bookmarkStart w:id="143" w:name="references"/>
     <w:p>
       <w:pPr>
         <w:pStyle w:val="Heading1"/>
@@ -5386,8 +5502,8 @@
         <w:t xml:space="preserve">References</w:t>
       </w:r>
     </w:p>
-    <w:bookmarkStart w:id="139" w:name="refs"/>
-    <w:bookmarkStart w:id="60" w:name="ref-ahlmanneltze2025"/>
+    <w:bookmarkStart w:id="142" w:name="refs"/>
+    <w:bookmarkStart w:id="63" w:name="ref-ahlmanneltze2025"/>
     <w:p>
       <w:pPr>
         <w:pStyle w:val="Bibliography"/>
@@ -5420,7 +5536,7 @@
       <w:r>
         <w:t xml:space="preserve"> </w:t>
       </w:r>
-      <w:hyperlink r:id="rId59">
+      <w:hyperlink r:id="rId62">
         <w:r>
           <w:rPr>
             <w:rStyle w:val="Hyperlink"/>
@@ -5432,8 +5548,8 @@
         <w:t xml:space="preserve">.</w:t>
       </w:r>
     </w:p>
-    <w:bookmarkEnd w:id="60"/>
-    <w:bookmarkStart w:id="62" w:name="ref-algazi2020"/>
+    <w:bookmarkEnd w:id="63"/>
+    <w:bookmarkStart w:id="65" w:name="ref-algazi2020"/>
     <w:p>
       <w:pPr>
         <w:pStyle w:val="Bibliography"/>
@@ -5499,7 +5615,7 @@
       <w:r>
         <w:t xml:space="preserve"> </w:t>
       </w:r>
-      <w:hyperlink r:id="rId61">
+      <w:hyperlink r:id="rId64">
         <w:r>
           <w:rPr>
             <w:rStyle w:val="Hyperlink"/>
@@ -5511,8 +5627,8 @@
         <w:t xml:space="preserve">.</w:t>
       </w:r>
     </w:p>
-    <w:bookmarkEnd w:id="62"/>
-    <w:bookmarkStart w:id="64" w:name="ref-bernton2019"/>
+    <w:bookmarkEnd w:id="65"/>
+    <w:bookmarkStart w:id="67" w:name="ref-bernton2019"/>
     <w:p>
       <w:pPr>
         <w:pStyle w:val="Bibliography"/>
@@ -5569,7 +5685,7 @@
       <w:r>
         <w:t xml:space="preserve"> </w:t>
       </w:r>
-      <w:hyperlink r:id="rId63">
+      <w:hyperlink r:id="rId66">
         <w:r>
           <w:rPr>
             <w:rStyle w:val="Hyperlink"/>
@@ -5581,8 +5697,8 @@
         <w:t xml:space="preserve">.</w:t>
       </w:r>
     </w:p>
-    <w:bookmarkEnd w:id="64"/>
-    <w:bookmarkStart w:id="66" w:name="ref-bertaux2018"/>
+    <w:bookmarkEnd w:id="67"/>
+    <w:bookmarkStart w:id="69" w:name="ref-bertaux2018"/>
     <w:p>
       <w:pPr>
         <w:pStyle w:val="Bibliography"/>
@@ -5615,7 +5731,7 @@
       <w:r>
         <w:t xml:space="preserve"> </w:t>
       </w:r>
-      <w:hyperlink r:id="rId65">
+      <w:hyperlink r:id="rId68">
         <w:r>
           <w:rPr>
             <w:rStyle w:val="Hyperlink"/>
@@ -5627,8 +5743,8 @@
         <w:t xml:space="preserve">.</w:t>
       </w:r>
     </w:p>
-    <w:bookmarkEnd w:id="66"/>
-    <w:bookmarkStart w:id="68" w:name="ref-cannoodt2021"/>
+    <w:bookmarkEnd w:id="69"/>
+    <w:bookmarkStart w:id="71" w:name="ref-cannoodt2021"/>
     <w:p>
       <w:pPr>
         <w:pStyle w:val="Bibliography"/>
@@ -5661,7 +5777,7 @@
       <w:r>
         <w:t xml:space="preserve"> </w:t>
       </w:r>
-      <w:hyperlink r:id="rId67">
+      <w:hyperlink r:id="rId70">
         <w:r>
           <w:rPr>
             <w:rStyle w:val="Hyperlink"/>
@@ -5673,8 +5789,8 @@
         <w:t xml:space="preserve">.</w:t>
       </w:r>
     </w:p>
-    <w:bookmarkEnd w:id="68"/>
-    <w:bookmarkStart w:id="70" w:name="ref-cao2005"/>
+    <w:bookmarkEnd w:id="71"/>
+    <w:bookmarkStart w:id="73" w:name="ref-cao2005"/>
     <w:p>
       <w:pPr>
         <w:pStyle w:val="Bibliography"/>
@@ -5719,7 +5835,7 @@
       <w:r>
         <w:t xml:space="preserve"> </w:t>
       </w:r>
-      <w:hyperlink r:id="rId69">
+      <w:hyperlink r:id="rId72">
         <w:r>
           <w:rPr>
             <w:rStyle w:val="Hyperlink"/>
@@ -5731,8 +5847,8 @@
         <w:t xml:space="preserve">.</w:t>
       </w:r>
     </w:p>
-    <w:bookmarkEnd w:id="70"/>
-    <w:bookmarkStart w:id="72" w:name="ref-cao2006"/>
+    <w:bookmarkEnd w:id="73"/>
+    <w:bookmarkStart w:id="75" w:name="ref-cao2006"/>
     <w:p>
       <w:pPr>
         <w:pStyle w:val="Bibliography"/>
@@ -5765,7 +5881,7 @@
       <w:r>
         <w:t xml:space="preserve"> </w:t>
       </w:r>
-      <w:hyperlink r:id="rId71">
+      <w:hyperlink r:id="rId74">
         <w:r>
           <w:rPr>
             <w:rStyle w:val="Hyperlink"/>
@@ -5777,8 +5893,8 @@
         <w:t xml:space="preserve">.</w:t>
       </w:r>
     </w:p>
-    <w:bookmarkEnd w:id="72"/>
-    <w:bookmarkStart w:id="74" w:name="ref-corigliano2025"/>
+    <w:bookmarkEnd w:id="75"/>
+    <w:bookmarkStart w:id="77" w:name="ref-corigliano2025"/>
     <w:p>
       <w:pPr>
         <w:pStyle w:val="Bibliography"/>
@@ -5808,7 +5924,7 @@
       <w:r>
         <w:t xml:space="preserve"> </w:t>
       </w:r>
-      <w:hyperlink r:id="rId73">
+      <w:hyperlink r:id="rId76">
         <w:r>
           <w:rPr>
             <w:rStyle w:val="Hyperlink"/>
@@ -5820,8 +5936,8 @@
         <w:t xml:space="preserve">.</w:t>
       </w:r>
     </w:p>
-    <w:bookmarkEnd w:id="74"/>
-    <w:bookmarkStart w:id="76" w:name="ref-dasthakur2013"/>
+    <w:bookmarkEnd w:id="77"/>
+    <w:bookmarkStart w:id="79" w:name="ref-dasthakur2013"/>
     <w:p>
       <w:pPr>
         <w:pStyle w:val="Bibliography"/>
@@ -5854,7 +5970,7 @@
       <w:r>
         <w:t xml:space="preserve"> </w:t>
       </w:r>
-      <w:hyperlink r:id="rId75">
+      <w:hyperlink r:id="rId78">
         <w:r>
           <w:rPr>
             <w:rStyle w:val="Hyperlink"/>
@@ -5866,8 +5982,8 @@
         <w:t xml:space="preserve">.</w:t>
       </w:r>
     </w:p>
-    <w:bookmarkEnd w:id="76"/>
-    <w:bookmarkStart w:id="78" w:name="ref-dibaeinia2026context"/>
+    <w:bookmarkEnd w:id="79"/>
+    <w:bookmarkStart w:id="81" w:name="ref-dibaeinia2026context"/>
     <w:p>
       <w:pPr>
         <w:pStyle w:val="Bibliography"/>
@@ -5897,7 +6013,7 @@
       <w:r>
         <w:t xml:space="preserve"> </w:t>
       </w:r>
-      <w:hyperlink r:id="rId77">
+      <w:hyperlink r:id="rId80">
         <w:r>
           <w:rPr>
             <w:rStyle w:val="Hyperlink"/>
@@ -5909,8 +6025,8 @@
         <w:t xml:space="preserve">.</w:t>
       </w:r>
     </w:p>
-    <w:bookmarkEnd w:id="78"/>
-    <w:bookmarkStart w:id="80" w:name="ref-dibaeinia2020"/>
+    <w:bookmarkEnd w:id="81"/>
+    <w:bookmarkStart w:id="83" w:name="ref-dibaeinia2020"/>
     <w:p>
       <w:pPr>
         <w:pStyle w:val="Bibliography"/>
@@ -5949,7 +6065,7 @@
       <w:r>
         <w:t xml:space="preserve"> </w:t>
       </w:r>
-      <w:hyperlink r:id="rId79">
+      <w:hyperlink r:id="rId82">
         <w:r>
           <w:rPr>
             <w:rStyle w:val="Hyperlink"/>
@@ -5961,8 +6077,8 @@
         <w:t xml:space="preserve">.</w:t>
       </w:r>
     </w:p>
-    <w:bookmarkEnd w:id="80"/>
-    <w:bookmarkStart w:id="82" w:name="ref-vandijk2018"/>
+    <w:bookmarkEnd w:id="83"/>
+    <w:bookmarkStart w:id="85" w:name="ref-vandijk2018"/>
     <w:p>
       <w:pPr>
         <w:pStyle w:val="Bibliography"/>
@@ -5995,7 +6111,7 @@
       <w:r>
         <w:t xml:space="preserve"> </w:t>
       </w:r>
-      <w:hyperlink r:id="rId81">
+      <w:hyperlink r:id="rId84">
         <w:r>
           <w:rPr>
             <w:rStyle w:val="Hyperlink"/>
@@ -6007,8 +6123,8 @@
         <w:t xml:space="preserve">.</w:t>
       </w:r>
     </w:p>
-    <w:bookmarkEnd w:id="82"/>
-    <w:bookmarkStart w:id="84" w:name="ref-friedman2006"/>
+    <w:bookmarkEnd w:id="85"/>
+    <w:bookmarkStart w:id="87" w:name="ref-friedman2006"/>
     <w:p>
       <w:pPr>
         <w:pStyle w:val="Bibliography"/>
@@ -6041,7 +6157,7 @@
       <w:r>
         <w:t xml:space="preserve"> </w:t>
       </w:r>
-      <w:hyperlink r:id="rId83">
+      <w:hyperlink r:id="rId86">
         <w:r>
           <w:rPr>
             <w:rStyle w:val="Hyperlink"/>
@@ -6053,8 +6169,8 @@
         <w:t xml:space="preserve">.</w:t>
       </w:r>
     </w:p>
-    <w:bookmarkEnd w:id="84"/>
-    <w:bookmarkStart w:id="86" w:name="ref-ghosh2025powerseek"/>
+    <w:bookmarkEnd w:id="87"/>
+    <w:bookmarkStart w:id="89" w:name="ref-ghosh2025powerseek"/>
     <w:p>
       <w:pPr>
         <w:pStyle w:val="Bibliography"/>
@@ -6096,7 +6212,7 @@
       <w:r>
         <w:t xml:space="preserve"> </w:t>
       </w:r>
-      <w:hyperlink r:id="rId85">
+      <w:hyperlink r:id="rId88">
         <w:r>
           <w:rPr>
             <w:rStyle w:val="Hyperlink"/>
@@ -6108,8 +6224,8 @@
         <w:t xml:space="preserve">.</w:t>
       </w:r>
     </w:p>
-    <w:bookmarkEnd w:id="86"/>
-    <w:bookmarkStart w:id="88" w:name="ref-gilbert2013"/>
+    <w:bookmarkEnd w:id="89"/>
+    <w:bookmarkStart w:id="91" w:name="ref-gilbert2013"/>
     <w:p>
       <w:pPr>
         <w:pStyle w:val="Bibliography"/>
@@ -6154,7 +6270,7 @@
       <w:r>
         <w:t xml:space="preserve"> </w:t>
       </w:r>
-      <w:hyperlink r:id="rId87">
+      <w:hyperlink r:id="rId90">
         <w:r>
           <w:rPr>
             <w:rStyle w:val="Hyperlink"/>
@@ -6166,8 +6282,8 @@
         <w:t xml:space="preserve">.</w:t>
       </w:r>
     </w:p>
-    <w:bookmarkEnd w:id="88"/>
-    <w:bookmarkStart w:id="90" w:name="ref-gillespie1977"/>
+    <w:bookmarkEnd w:id="91"/>
+    <w:bookmarkStart w:id="93" w:name="ref-gillespie1977"/>
     <w:p>
       <w:pPr>
         <w:pStyle w:val="Bibliography"/>
@@ -6200,7 +6316,7 @@
       <w:r>
         <w:t xml:space="preserve"> </w:t>
       </w:r>
-      <w:hyperlink r:id="rId89">
+      <w:hyperlink r:id="rId92">
         <w:r>
           <w:rPr>
             <w:rStyle w:val="Hyperlink"/>
@@ -6212,8 +6328,8 @@
         <w:t xml:space="preserve">.</w:t>
       </w:r>
     </w:p>
-    <w:bookmarkEnd w:id="90"/>
-    <w:bookmarkStart w:id="92" w:name="ref-gillespie2001"/>
+    <w:bookmarkEnd w:id="93"/>
+    <w:bookmarkStart w:id="95" w:name="ref-gillespie2001"/>
     <w:p>
       <w:pPr>
         <w:pStyle w:val="Bibliography"/>
@@ -6246,7 +6362,7 @@
       <w:r>
         <w:t xml:space="preserve"> </w:t>
       </w:r>
-      <w:hyperlink r:id="rId91">
+      <w:hyperlink r:id="rId94">
         <w:r>
           <w:rPr>
             <w:rStyle w:val="Hyperlink"/>
@@ -6258,8 +6374,8 @@
         <w:t xml:space="preserve">.</w:t>
       </w:r>
     </w:p>
-    <w:bookmarkEnd w:id="92"/>
-    <w:bookmarkStart w:id="94" w:name="ref-harmange2023"/>
+    <w:bookmarkEnd w:id="95"/>
+    <w:bookmarkStart w:id="97" w:name="ref-harmange2023"/>
     <w:p>
       <w:pPr>
         <w:pStyle w:val="Bibliography"/>
@@ -6292,7 +6408,7 @@
       <w:r>
         <w:t xml:space="preserve"> </w:t>
       </w:r>
-      <w:hyperlink r:id="rId93">
+      <w:hyperlink r:id="rId96">
         <w:r>
           <w:rPr>
             <w:rStyle w:val="Hyperlink"/>
@@ -6304,8 +6420,8 @@
         <w:t xml:space="preserve">.</w:t>
       </w:r>
     </w:p>
-    <w:bookmarkEnd w:id="94"/>
-    <w:bookmarkStart w:id="96" w:name="ref-huh2011"/>
+    <w:bookmarkEnd w:id="97"/>
+    <w:bookmarkStart w:id="99" w:name="ref-huh2011"/>
     <w:p>
       <w:pPr>
         <w:pStyle w:val="Bibliography"/>
@@ -6338,7 +6454,7 @@
       <w:r>
         <w:t xml:space="preserve"> </w:t>
       </w:r>
-      <w:hyperlink r:id="rId95">
+      <w:hyperlink r:id="rId98">
         <w:r>
           <w:rPr>
             <w:rStyle w:val="Hyperlink"/>
@@ -6350,8 +6466,8 @@
         <w:t xml:space="preserve">.</w:t>
       </w:r>
     </w:p>
-    <w:bookmarkEnd w:id="96"/>
-    <w:bookmarkStart w:id="98" w:name="ref-huynhthu2010"/>
+    <w:bookmarkEnd w:id="99"/>
+    <w:bookmarkStart w:id="101" w:name="ref-huynhthu2010"/>
     <w:p>
       <w:pPr>
         <w:pStyle w:val="Bibliography"/>
@@ -6384,7 +6500,7 @@
       <w:r>
         <w:t xml:space="preserve"> </w:t>
       </w:r>
-      <w:hyperlink r:id="rId97">
+      <w:hyperlink r:id="rId100">
         <w:r>
           <w:rPr>
             <w:rStyle w:val="Hyperlink"/>
@@ -6396,8 +6512,8 @@
         <w:t xml:space="preserve">.</w:t>
       </w:r>
     </w:p>
-    <w:bookmarkEnd w:id="98"/>
-    <w:bookmarkStart w:id="100" w:name="ref-iyer2025"/>
+    <w:bookmarkEnd w:id="101"/>
+    <w:bookmarkStart w:id="103" w:name="ref-iyer2025"/>
     <w:p>
       <w:pPr>
         <w:pStyle w:val="Bibliography"/>
@@ -6430,7 +6546,7 @@
       <w:r>
         <w:t xml:space="preserve"> </w:t>
       </w:r>
-      <w:hyperlink r:id="rId99">
+      <w:hyperlink r:id="rId102">
         <w:r>
           <w:rPr>
             <w:rStyle w:val="Hyperlink"/>
@@ -6442,8 +6558,8 @@
         <w:t xml:space="preserve">.</w:t>
       </w:r>
     </w:p>
-    <w:bookmarkEnd w:id="100"/>
-    <w:bookmarkStart w:id="102" w:name="ref-lasri2020"/>
+    <w:bookmarkEnd w:id="103"/>
+    <w:bookmarkStart w:id="105" w:name="ref-lasri2020"/>
     <w:p>
       <w:pPr>
         <w:pStyle w:val="Bibliography"/>
@@ -6494,7 +6610,7 @@
       <w:r>
         <w:t xml:space="preserve"> </w:t>
       </w:r>
-      <w:hyperlink r:id="rId101">
+      <w:hyperlink r:id="rId104">
         <w:r>
           <w:rPr>
             <w:rStyle w:val="Hyperlink"/>
@@ -6506,8 +6622,8 @@
         <w:t xml:space="preserve">.</w:t>
       </w:r>
     </w:p>
-    <w:bookmarkEnd w:id="102"/>
-    <w:bookmarkStart w:id="104" w:name="ref-lasri2022"/>
+    <w:bookmarkEnd w:id="105"/>
+    <w:bookmarkStart w:id="107" w:name="ref-lasri2022"/>
     <w:p>
       <w:pPr>
         <w:pStyle w:val="Bibliography"/>
@@ -6552,7 +6668,7 @@
       <w:r>
         <w:t xml:space="preserve"> </w:t>
       </w:r>
-      <w:hyperlink r:id="rId103">
+      <w:hyperlink r:id="rId106">
         <w:r>
           <w:rPr>
             <w:rStyle w:val="Hyperlink"/>
@@ -6564,8 +6680,8 @@
         <w:t xml:space="preserve">.</w:t>
       </w:r>
     </w:p>
-    <w:bookmarkEnd w:id="104"/>
-    <w:bookmarkStart w:id="106" w:name="ref-li2025scmultisim"/>
+    <w:bookmarkEnd w:id="107"/>
+    <w:bookmarkStart w:id="109" w:name="ref-li2025scmultisim"/>
     <w:p>
       <w:pPr>
         <w:pStyle w:val="Bibliography"/>
@@ -6601,7 +6717,7 @@
       <w:r>
         <w:t xml:space="preserve"> </w:t>
       </w:r>
-      <w:hyperlink r:id="rId105">
+      <w:hyperlink r:id="rId108">
         <w:r>
           <w:rPr>
             <w:rStyle w:val="Hyperlink"/>
@@ -6613,8 +6729,8 @@
         <w:t xml:space="preserve">.</w:t>
       </w:r>
     </w:p>
-    <w:bookmarkEnd w:id="106"/>
-    <w:bookmarkStart w:id="108" w:name="ref-lin2025memory"/>
+    <w:bookmarkEnd w:id="109"/>
+    <w:bookmarkStart w:id="111" w:name="ref-lin2025memory"/>
     <w:p>
       <w:pPr>
         <w:pStyle w:val="Bibliography"/>
@@ -6647,7 +6763,7 @@
       <w:r>
         <w:t xml:space="preserve"> </w:t>
       </w:r>
-      <w:hyperlink r:id="rId107">
+      <w:hyperlink r:id="rId110">
         <w:r>
           <w:rPr>
             <w:rStyle w:val="Hyperlink"/>
@@ -6659,8 +6775,8 @@
         <w:t xml:space="preserve">.</w:t>
       </w:r>
     </w:p>
-    <w:bookmarkEnd w:id="108"/>
-    <w:bookmarkStart w:id="110" w:name="ref-ostermann2004"/>
+    <w:bookmarkEnd w:id="111"/>
+    <w:bookmarkStart w:id="113" w:name="ref-ostermann2004"/>
     <w:p>
       <w:pPr>
         <w:pStyle w:val="Bibliography"/>
@@ -6693,7 +6809,7 @@
       <w:r>
         <w:t xml:space="preserve"> </w:t>
       </w:r>
-      <w:hyperlink r:id="rId109">
+      <w:hyperlink r:id="rId112">
         <w:r>
           <w:rPr>
             <w:rStyle w:val="Hyperlink"/>
@@ -6705,8 +6821,8 @@
         <w:t xml:space="preserve">.</w:t>
       </w:r>
     </w:p>
-    <w:bookmarkEnd w:id="110"/>
-    <w:bookmarkStart w:id="112" w:name="ref-pan2022tedsim"/>
+    <w:bookmarkEnd w:id="113"/>
+    <w:bookmarkStart w:id="115" w:name="ref-pan2022tedsim"/>
     <w:p>
       <w:pPr>
         <w:pStyle w:val="Bibliography"/>
@@ -6757,7 +6873,7 @@
       <w:r>
         <w:t xml:space="preserve"> </w:t>
       </w:r>
-      <w:hyperlink r:id="rId111">
+      <w:hyperlink r:id="rId114">
         <w:r>
           <w:rPr>
             <w:rStyle w:val="Hyperlink"/>
@@ -6769,8 +6885,8 @@
         <w:t xml:space="preserve">.</w:t>
       </w:r>
     </w:p>
-    <w:bookmarkEnd w:id="112"/>
-    <w:bookmarkStart w:id="114" w:name="ref-peccoud1995"/>
+    <w:bookmarkEnd w:id="115"/>
+    <w:bookmarkStart w:id="117" w:name="ref-peccoud1995"/>
     <w:p>
       <w:pPr>
         <w:pStyle w:val="Bibliography"/>
@@ -6803,7 +6919,7 @@
       <w:r>
         <w:t xml:space="preserve"> </w:t>
       </w:r>
-      <w:hyperlink r:id="rId113">
+      <w:hyperlink r:id="rId116">
         <w:r>
           <w:rPr>
             <w:rStyle w:val="Hyperlink"/>
@@ -6815,8 +6931,8 @@
         <w:t xml:space="preserve">.</w:t>
       </w:r>
     </w:p>
-    <w:bookmarkEnd w:id="114"/>
-    <w:bookmarkStart w:id="116" w:name="ref-piho2025abm"/>
+    <w:bookmarkEnd w:id="117"/>
+    <w:bookmarkStart w:id="119" w:name="ref-piho2025abm"/>
     <w:p>
       <w:pPr>
         <w:pStyle w:val="Bibliography"/>
@@ -6855,7 +6971,7 @@
       <w:r>
         <w:t xml:space="preserve"> </w:t>
       </w:r>
-      <w:hyperlink r:id="rId115">
+      <w:hyperlink r:id="rId118">
         <w:r>
           <w:rPr>
             <w:rStyle w:val="Hyperlink"/>
@@ -6867,8 +6983,8 @@
         <w:t xml:space="preserve">.</w:t>
       </w:r>
     </w:p>
-    <w:bookmarkEnd w:id="116"/>
-    <w:bookmarkStart w:id="118" w:name="ref-sciml"/>
+    <w:bookmarkEnd w:id="119"/>
+    <w:bookmarkStart w:id="121" w:name="ref-sciml"/>
     <w:p>
       <w:pPr>
         <w:pStyle w:val="Bibliography"/>
@@ -6922,7 +7038,7 @@
       <w:r>
         <w:t xml:space="preserve"> </w:t>
       </w:r>
-      <w:hyperlink r:id="rId117">
+      <w:hyperlink r:id="rId120">
         <w:r>
           <w:rPr>
             <w:rStyle w:val="Hyperlink"/>
@@ -6934,8 +7050,8 @@
         <w:t xml:space="preserve">.</w:t>
       </w:r>
     </w:p>
-    <w:bookmarkEnd w:id="118"/>
-    <w:bookmarkStart w:id="120" w:name="ref-shaffer2017"/>
+    <w:bookmarkEnd w:id="121"/>
+    <w:bookmarkStart w:id="123" w:name="ref-shaffer2017"/>
     <w:p>
       <w:pPr>
         <w:pStyle w:val="Bibliography"/>
@@ -6968,7 +7084,7 @@
       <w:r>
         <w:t xml:space="preserve"> </w:t>
       </w:r>
-      <w:hyperlink r:id="rId119">
+      <w:hyperlink r:id="rId122">
         <w:r>
           <w:rPr>
             <w:rStyle w:val="Hyperlink"/>
@@ -6980,8 +7096,8 @@
         <w:t xml:space="preserve">.</w:t>
       </w:r>
     </w:p>
-    <w:bookmarkEnd w:id="120"/>
-    <w:bookmarkStart w:id="122" w:name="ref-shaffer2020"/>
+    <w:bookmarkEnd w:id="123"/>
+    <w:bookmarkStart w:id="125" w:name="ref-shaffer2020"/>
     <w:p>
       <w:pPr>
         <w:pStyle w:val="Bibliography"/>
@@ -7014,7 +7130,7 @@
       <w:r>
         <w:t xml:space="preserve"> </w:t>
       </w:r>
-      <w:hyperlink r:id="rId121">
+      <w:hyperlink r:id="rId124">
         <w:r>
           <w:rPr>
             <w:rStyle w:val="Hyperlink"/>
@@ -7026,8 +7142,8 @@
         <w:t xml:space="preserve">.</w:t>
       </w:r>
     </w:p>
-    <w:bookmarkEnd w:id="122"/>
-    <w:bookmarkStart w:id="124" w:name="ref-shahrezaei2008"/>
+    <w:bookmarkEnd w:id="125"/>
+    <w:bookmarkStart w:id="127" w:name="ref-shahrezaei2008"/>
     <w:p>
       <w:pPr>
         <w:pStyle w:val="Bibliography"/>
@@ -7060,7 +7176,7 @@
       <w:r>
         <w:t xml:space="preserve"> </w:t>
       </w:r>
-      <w:hyperlink r:id="rId123">
+      <w:hyperlink r:id="rId126">
         <w:r>
           <w:rPr>
             <w:rStyle w:val="Hyperlink"/>
@@ -7072,8 +7188,8 @@
         <w:t xml:space="preserve">.</w:t>
       </w:r>
     </w:p>
-    <w:bookmarkEnd w:id="124"/>
-    <w:bookmarkStart w:id="126" w:name="ref-sukys2025"/>
+    <w:bookmarkEnd w:id="127"/>
+    <w:bookmarkStart w:id="129" w:name="ref-sukys2025"/>
     <w:p>
       <w:pPr>
         <w:pStyle w:val="Bibliography"/>
@@ -7118,7 +7234,7 @@
       <w:r>
         <w:t xml:space="preserve"> </w:t>
       </w:r>
-      <w:hyperlink r:id="rId125">
+      <w:hyperlink r:id="rId128">
         <w:r>
           <w:rPr>
             <w:rStyle w:val="Hyperlink"/>
@@ -7130,8 +7246,8 @@
         <w:t xml:space="preserve">.</w:t>
       </w:r>
     </w:p>
-    <w:bookmarkEnd w:id="126"/>
-    <w:bookmarkStart w:id="128" w:name="ref-toni2009"/>
+    <w:bookmarkEnd w:id="129"/>
+    <w:bookmarkStart w:id="131" w:name="ref-toni2009"/>
     <w:p>
       <w:pPr>
         <w:pStyle w:val="Bibliography"/>
@@ -7176,7 +7292,7 @@
       <w:r>
         <w:t xml:space="preserve"> </w:t>
       </w:r>
-      <w:hyperlink r:id="rId127">
+      <w:hyperlink r:id="rId130">
         <w:r>
           <w:rPr>
             <w:rStyle w:val="Hyperlink"/>
@@ -7188,8 +7304,8 @@
         <w:t xml:space="preserve">.</w:t>
       </w:r>
     </w:p>
-    <w:bookmarkEnd w:id="128"/>
-    <w:bookmarkStart w:id="130" w:name="ref-vollenweider2026"/>
+    <w:bookmarkEnd w:id="131"/>
+    <w:bookmarkStart w:id="133" w:name="ref-vollenweider2026"/>
     <w:p>
       <w:pPr>
         <w:pStyle w:val="Bibliography"/>
@@ -7219,7 +7335,7 @@
       <w:r>
         <w:t xml:space="preserve"> </w:t>
       </w:r>
-      <w:hyperlink r:id="rId129">
+      <w:hyperlink r:id="rId132">
         <w:r>
           <w:rPr>
             <w:rStyle w:val="Hyperlink"/>
@@ -7231,8 +7347,8 @@
         <w:t xml:space="preserve">.</w:t>
       </w:r>
     </w:p>
-    <w:bookmarkEnd w:id="130"/>
-    <w:bookmarkStart w:id="132" w:name="ref-wagner2018"/>
+    <w:bookmarkEnd w:id="133"/>
+    <w:bookmarkStart w:id="135" w:name="ref-wagner2018"/>
     <w:p>
       <w:pPr>
         <w:pStyle w:val="Bibliography"/>
@@ -7274,7 +7390,7 @@
       <w:r>
         <w:t xml:space="preserve"> </w:t>
       </w:r>
-      <w:hyperlink r:id="rId131">
+      <w:hyperlink r:id="rId134">
         <w:r>
           <w:rPr>
             <w:rStyle w:val="Hyperlink"/>
@@ -7286,8 +7402,8 @@
         <w:t xml:space="preserve">.</w:t>
       </w:r>
     </w:p>
-    <w:bookmarkEnd w:id="132"/>
-    <w:bookmarkStart w:id="134" w:name="ref-zhang2017adaptive"/>
+    <w:bookmarkEnd w:id="135"/>
+    <w:bookmarkStart w:id="137" w:name="ref-zhang2017adaptive"/>
     <w:p>
       <w:pPr>
         <w:pStyle w:val="Bibliography"/>
@@ -7320,7 +7436,7 @@
       <w:r>
         <w:t xml:space="preserve"> </w:t>
       </w:r>
-      <w:hyperlink r:id="rId133">
+      <w:hyperlink r:id="rId136">
         <w:r>
           <w:rPr>
             <w:rStyle w:val="Hyperlink"/>
@@ -7332,8 +7448,8 @@
         <w:t xml:space="preserve">.</w:t>
       </w:r>
     </w:p>
-    <w:bookmarkEnd w:id="134"/>
-    <w:bookmarkStart w:id="136" w:name="ref-zhang2025"/>
+    <w:bookmarkEnd w:id="137"/>
+    <w:bookmarkStart w:id="139" w:name="ref-zhang2025"/>
     <w:p>
       <w:pPr>
         <w:pStyle w:val="Bibliography"/>
@@ -7366,7 +7482,7 @@
       <w:r>
         <w:t xml:space="preserve"> </w:t>
       </w:r>
-      <w:hyperlink r:id="rId135">
+      <w:hyperlink r:id="rId138">
         <w:r>
           <w:rPr>
             <w:rStyle w:val="Hyperlink"/>
@@ -7378,8 +7494,8 @@
         <w:t xml:space="preserve">.</w:t>
       </w:r>
     </w:p>
-    <w:bookmarkEnd w:id="136"/>
-    <w:bookmarkStart w:id="138" w:name="ref-zinati2024groundgan"/>
+    <w:bookmarkEnd w:id="139"/>
+    <w:bookmarkStart w:id="141" w:name="ref-zinati2024groundgan"/>
     <w:p>
       <w:pPr>
         <w:pStyle w:val="Bibliography"/>
@@ -7439,7 +7555,7 @@
       <w:r>
         <w:t xml:space="preserve"> </w:t>
       </w:r>
-      <w:hyperlink r:id="rId137">
+      <w:hyperlink r:id="rId140">
         <w:r>
           <w:rPr>
             <w:rStyle w:val="Hyperlink"/>
@@ -7451,9 +7567,9 @@
         <w:t xml:space="preserve">.</w:t>
       </w:r>
     </w:p>
-    <w:bookmarkEnd w:id="138"/>
-    <w:bookmarkEnd w:id="139"/>
-    <w:bookmarkEnd w:id="140"/>
+    <w:bookmarkEnd w:id="141"/>
+    <w:bookmarkEnd w:id="142"/>
+    <w:bookmarkEnd w:id="143"/>
     <w:sectPr>
       <w:footnotePr>
         <w:numRestart w:val="eachSect"/>

</xml_diff>

<commit_message>
Regenerate the supplementary figures and the built manuscript
Adds Supplementary Figure 6, the population and lineage layers against the
exact stationary laws, and rebuilds the others against the revised text.

Co-Authored-By: Claude Opus 5 <noreply@anthropic.com>
Claude-Session: https://claude.ai/code/session_01PjfG7i2deAXT3znmpkGkmY
</commit_message>
<xml_diff>
--- a/paper/manuscript/manuscript.docx
+++ b/paper/manuscript/manuscript.docx
@@ -2151,7 +2151,16 @@
         <w:t xml:space="preserve">2,6</w:t>
       </w:r>
       <w:r>
-        <w:t xml:space="preserve">.</w:t>
+        <w:t xml:space="preserve">; the follow-up method that traces resistant fates back to their drug-naive precursors puts those precursors at an initial frequency of about 1 in 1,000 to 1 in 10,000 cells</w:t>
+      </w:r>
+      <w:r>
+        <w:rPr>
+          <w:vertAlign w:val="superscript"/>
+        </w:rPr>
+        <w:t xml:space="preserve">38</w:t>
+      </w:r>
+      <w:r>
+        <w:t xml:space="preserve">, the regime the pre-resistant fraction of the melanoma case study below is set to.</w:t>
       </w:r>
     </w:p>
     <w:p>
@@ -2189,7 +2198,7 @@
         <w:rPr>
           <w:vertAlign w:val="superscript"/>
         </w:rPr>
-        <w:t xml:space="preserve">38</w:t>
+        <w:t xml:space="preserve">39</w:t>
       </w:r>
       <w:r>
         <w:t xml:space="preserve">, which is the ordering the model predicts. A lineage-tracing study that identified PI3K and TGF-β signalling as switching modulators found the opposite for its own pretreatment: a PI3K inhibitor applied before targeted therapy left less resistance than targeted therapy alone</w:t>
@@ -2207,7 +2216,7 @@
         <w:rPr>
           <w:vertAlign w:val="superscript"/>
         </w:rPr>
-        <w:t xml:space="preserve">39</w:t>
+        <w:t xml:space="preserve">40</w:t>
       </w:r>
       <w:r>
         <w:t xml:space="preserve">; what the simulations add is the timing requirement and a lineage-resolved readout, the number of surviving clones, by which it can be tested. A transient pulse enriches high-expressing cells and, with slow switching, the enrichment persists for many generations after the drug is removed, whereas with fast switching it relaxes within a few cycles (Fig. 4g): phenotypic selection with stable inheritance, as in the original MGMT model</w:t>
@@ -2216,7 +2225,7 @@
         <w:rPr>
           <w:vertAlign w:val="superscript"/>
         </w:rPr>
-        <w:t xml:space="preserve">40</w:t>
+        <w:t xml:space="preserve">41</w:t>
       </w:r>
       <w:r>
         <w:t xml:space="preserve">. Finally, scanning release periods and doses of intermittent schedules (Fig. 4h), the most effective schedule is release period 0, dose 2 (growth rate +0.004 per time unit) for pre-existing tolerance, release period 10, dose 2 (growth rate -0.016 per time unit) when the resistant state carries a fitness cost, and release period 10, dose 1 (growth rate +0.009 per time unit) for drug-induced tolerance. Without a fitness cost nothing beats continuous dosing at the highest dose, since every release period lets the resistant subpopulation regrow (the drug does not act on the switching rates in this model; when it also stabilises the resistant state, as in the melanoma case study below, holidays regain a small advantage even without a cost). With a fitness cost the population declines under every schedule at dose ≥ 0.5, and release periods of up to 10 time units match continuous dosing (-0.013 per time unit under continuous dose 2), because cells that leave the resistant state during a holiday are killed on re-exposure. For drug-induced tolerance the ranking of doses reverses: the highest dose induces tolerance in more cells than it kills, so dose 1 outperforms dose 2 at every release period (release period 10, dose 1 (growth rate +0.009 per time unit), against +0.012 for continuous dose 2), the intermediate-dose optimum reported previously</w:t>
@@ -2225,7 +2234,7 @@
         <w:rPr>
           <w:vertAlign w:val="superscript"/>
         </w:rPr>
-        <w:t xml:space="preserve">41</w:t>
+        <w:t xml:space="preserve">42</w:t>
       </w:r>
       <w:r>
         <w:t xml:space="preserve">; the benefit of release periods reported in that work does not appear here, because in this model the induced state decays at the same rate with and without drug, so a holiday only postpones the death of reverting cells while all cells grow.</w:t>
@@ -2296,7 +2305,7 @@
         <w:rPr>
           <w:vertAlign w:val="superscript"/>
         </w:rPr>
-        <w:t xml:space="preserve">42</w:t>
+        <w:t xml:space="preserve">43</w:t>
       </w:r>
       <w:r>
         <w:t xml:space="preserve"> </w:t>
@@ -2548,7 +2557,7 @@
         <w:rPr>
           <w:vertAlign w:val="superscript"/>
         </w:rPr>
-        <w:t xml:space="preserve">43–45</w:t>
+        <w:t xml:space="preserve">44–46</w:t>
       </w:r>
       <w:r>
         <w:t xml:space="preserve">. Coupled to a cycle-gated hazard, that is a complete alternative explanation for the correlations fitted here, and the model as built cannot produce it. The mean time to death changes by 8% between 7 and 13 µM while the death fraction rises from 0.13 to 0.59 (Fig. 7d), the dose-invariance of single-cell timing that motivated the original study, and it arises here because dose changes the fraction of unprotected cells rather than their kinetics. The plateau the kill curves miss is the clearest failure of the minimal model: reproducing it requires cells to stay in the resistant state for longer than the memory of 2.8 generations allows, and that memory was set by the prior taken from the lineage correlations rather than by the kill curves. The two observations therefore pull in opposite directions within this minimal model: correlations that vanish by the third cousin call for a short memory, and a kill curve that flattens calls for a long one. A single switching gene cannot satisfy both, which is a concrete and testable limitation, and points to a drug-induced stabilisation of the resistant state, for which there is independent evidence</w:t>
@@ -2616,7 +2625,7 @@
         <w:rPr>
           <w:vertAlign w:val="superscript"/>
         </w:rPr>
-        <w:t xml:space="preserve">46</w:t>
+        <w:t xml:space="preserve">47</w:t>
       </w:r>
       <w:r>
         <w:t xml:space="preserve">, and adaptive therapy, in which the drug is withdrawn when the population has halved and resumed when it regrows to its initial size</w:t>
@@ -2625,7 +2634,7 @@
         <w:rPr>
           <w:vertAlign w:val="superscript"/>
         </w:rPr>
-        <w:t xml:space="preserve">47</w:t>
+        <w:t xml:space="preserve">48</w:t>
       </w:r>
       <w:r>
         <w:t xml:space="preserve">. Because adaptive therapy deliberately lets the tumour regrow, schedules are compared by the time after randomisation at which the population exceeds 120% of its pre-treatment size (loss of control), with the RECIST-like time to progression from the nadir reported alongside (Methods).</w:t>
@@ -2651,7 +2660,7 @@
         <w:rPr>
           <w:vertAlign w:val="superscript"/>
         </w:rPr>
-        <w:t xml:space="preserve">48</w:t>
+        <w:t xml:space="preserve">49</w:t>
       </w:r>
       <w:r>
         <w:t xml:space="preserve">, holidays let sensitive cells outcompete them: none of the three schedules loses control within the 52-week follow-up (52+, 52+ and 52+ weeks, censored), and adaptive therapy achieves this with 36% of the cumulative dose of continuous dosing. When resistant cells are only partly protected and grow at half speed under drug, holidays release them: continuous dosing keeps control for 52+ weeks against 49 for the intermittent schedule and 43 for adaptive therapy, the ranking observed in the trial, where continuous dosing gave a median progression-free survival of 9.0 months against 5.5 months for intermittent dosing. Gating three quarters of the death hazard to a window of the cell cycle, as in the persister simulations above, leaves these comparisons standing, whether or not the maximal hazard is raised to hold the cycle-averaged hazard fixed (Supplementary Note 13 and Supplementary Fig. 5): the best schedule is unchanged in 3 of 3 mechanisms and the model still favours continuous dosing under partial protection (52 against 43 weeks, from 52 and 49). The memory of the resistant state, five net population doublings, is an assumption rather than a measurement, and it is what decides whether resistant cells revert during a three-week holiday; scanning it from two to twelve doublings leaves the ranking unchanged and narrows the advantage of holidays from 9 weeks at 2 net doublings of memory to 1.7 weeks at 12 (Supplementary Note 15). That the benefit of holidays should depend on a cost of resistance is established by compartment models of adaptive therapy, which also show that tumour turnover modulates how large that cost must be</w:t>
@@ -2660,7 +2669,7 @@
         <w:rPr>
           <w:vertAlign w:val="superscript"/>
         </w:rPr>
-        <w:t xml:space="preserve">49</w:t>
+        <w:t xml:space="preserve">50</w:t>
       </w:r>
       <w:r>
         <w:t xml:space="preserve">. Here the dependence emerges from single cells whose resistance is a heritable expression state rather than a fixed compartment, the cost and the degree of protection are properties of cells that lineage experiments measure, and the third case shows that partial protection reverses the ranking even when a cost is absent. The optimiser makes the dependence explicit (Fig. 8e): over intermittent schedules of any period and duty cycle after the lead-in, the best schedule is a period of 2.2 weeks with 39% of the time on drug (27 weeks to loss of control) without a fitness cost, a period of 1.0 weeks with 47% of the time on drug (52 weeks to loss of control) with a fitness cost and a period of 1.0 weeks with 100% of the time on drug (52 weeks to loss of control) with partial protection. A bacterial-persistence model adapted to colorectal-cancer lines reaches the same conclusion by another route: an intermediate dose with release periods is optimal, because the rate of transition into the persistent state rises with concentration and then saturates</w:t>
@@ -2669,48 +2678,69 @@
         <w:rPr>
           <w:vertAlign w:val="superscript"/>
         </w:rPr>
+        <w:t xml:space="preserve">42</w:t>
+      </w:r>
+      <w:r>
+        <w:t xml:space="preserve">. The agreement is partial and the difference is informative. Where tolerance is drug-induced, the optimiser here also selects an intermediate dose over the highest one, for the same reason. Release periods, however, help there only when the drug changes the kinetics of the resistant state, either by stabilising it, as in the melanoma arm above, or by inducing it at a rate that saturates, as in that model; with a state whose decay rate is the same with and without drug, a holiday merely postpones the death of reverting cells while every cell grows, and the optimiser rejects it. The model therefore reproduces both the clinical and the preclinical outcome and shows their difference to depend on measurable properties of the resistant cells, their growth under drug and their fitness without it, both properties of cells rather than of the tumour, which growth and lineage experiments can bound, within the identifiability limits of Fig. 6c, before a schedule is chosen. The mechanism is set in each case, not inferred from the outcome, so this is a demonstration that the ranking follows from cell properties rather than a claim that these particular cells carry them; and because the trial and the xenograft also differ in drug and species (dabrafenib plus trametinib in patients, vemurafenib monotherapy in mice), their contrast is not attributable to resistant-cell fitness alone.</w:t>
+      </w:r>
+    </w:p>
+    <w:p>
+      <w:pPr>
+        <w:pStyle w:val="BodyText"/>
+      </w:pPr>
+      <w:r>
+        <w:t xml:space="preserve">The second case study concerns glioblastoma, where the RTOG 0525 trial compared the standard temozolomide regimen (150–200 mg/m² on days 1–5 of 28-day cycles) with a dose-dense regimen (75–100 mg/m² on days 1–21) that delivers about twice the cumulative dose and was designed to deplete MGMT, and found no difference in survival for either MGMT-methylated or unmethylated tumours</w:t>
+      </w:r>
+      <w:r>
+        <w:rPr>
+          <w:vertAlign w:val="superscript"/>
+        </w:rPr>
+        <w:t xml:space="preserve">51</w:t>
+      </w:r>
+      <w:r>
+        <w:t xml:space="preserve">. We simulated both regimens with one-compartment pharmacokinetics (elimination half-life 2.1 h in the cerebrospinal-fluid population model used here</w:t>
+      </w:r>
+      <w:r>
+        <w:rPr>
+          <w:vertAlign w:val="superscript"/>
+        </w:rPr>
+        <w:t xml:space="preserve">52</w:t>
+      </w:r>
+      <w:r>
+        <w:t xml:space="preserve">; the plasma value is 1.8 h</w:t>
+      </w:r>
+      <w:r>
+        <w:rPr>
+          <w:vertAlign w:val="superscript"/>
+        </w:rPr>
+        <w:t xml:space="preserve">53</w:t>
+      </w:r>
+      <w:r>
+        <w:t xml:space="preserve">) on populations in which 1% (methylated) or 30% (unmethylated) of cells express MGMT. Those two fractions are illustrative values that bracket low and high expression, not measurements, and the idealisation matters: promoter methylation shifts MGMT expression as a graded quantity across cells rather than switching a discrete subpopulation on, so the whole dose-dense prediction below rests on treating it as two states. With that caveat, with MGMT protein protecting cells from the drug</w:t>
+      </w:r>
+      <w:r>
+        <w:rPr>
+          <w:vertAlign w:val="superscript"/>
+        </w:rPr>
         <w:t xml:space="preserve">41</w:t>
       </w:r>
       <w:r>
-        <w:t xml:space="preserve">. The agreement is partial and the difference is informative. Where tolerance is drug-induced, the optimiser here also selects an intermediate dose over the highest one, for the same reason. Release periods, however, help there only when the drug changes the kinetics of the resistant state, either by stabilising it, as in the melanoma arm above, or by inducing it at a rate that saturates, as in that model; with a state whose decay rate is the same with and without drug, a holiday merely postpones the death of reverting cells while every cell grows, and the optimiser rejects it. The model therefore reproduces both the clinical and the preclinical outcome and shows their difference to depend on measurable properties of the resistant cells, their growth under drug and their fitness without it, both properties of cells rather than of the tumour, which growth and lineage experiments can bound, within the identifiability limits of Fig. 6c, before a schedule is chosen. The mechanism is set in each case, not inferred from the outcome, so this is a demonstration that the ranking follows from cell properties rather than a claim that these particular cells carry them; and because the trial and the xenograft also differ in drug and species (dabrafenib plus trametinib in patients, vemurafenib monotherapy in mice), their contrast is not attributable to resistant-cell fitness alone.</w:t>
-      </w:r>
-    </w:p>
-    <w:p>
-      <w:pPr>
-        <w:pStyle w:val="BodyText"/>
-      </w:pPr>
-      <w:r>
-        <w:t xml:space="preserve">The second case study concerns glioblastoma, where the RTOG 0525 trial compared the standard temozolomide regimen (150–200 mg/m² on days 1–5 of 28-day cycles) with a dose-dense regimen (75–100 mg/m² on days 1–21) that delivers about twice the cumulative dose and was designed to deplete MGMT, and found no difference in survival for either MGMT-methylated or unmethylated tumours</w:t>
-      </w:r>
-      <w:r>
-        <w:rPr>
-          <w:vertAlign w:val="superscript"/>
-        </w:rPr>
-        <w:t xml:space="preserve">50</w:t>
-      </w:r>
-      <w:r>
-        <w:t xml:space="preserve">. We simulated both regimens with one-compartment pharmacokinetics (elimination half-life 2.1 h; ref.</w:t>
-      </w:r>
-      <w:r>
-        <w:rPr>
-          <w:vertAlign w:val="superscript"/>
-        </w:rPr>
-        <w:t xml:space="preserve">51</w:t>
-      </w:r>
-      <w:r>
-        <w:t xml:space="preserve">) on populations in which 1% (methylated) or 30% (unmethylated) of cells express MGMT, with MGMT protein protecting cells from the drug</w:t>
-      </w:r>
-      <w:r>
-        <w:rPr>
-          <w:vertAlign w:val="superscript"/>
-        </w:rPr>
-        <w:t xml:space="preserve">40</w:t>
-      </w:r>
-      <w:r>
-        <w:t xml:space="preserve"> </w:t>
-      </w:r>
-      <w:r>
-        <w:t xml:space="preserve">and either stable or consumed by it stoichiometrically, one molecule per lesion repaired, as a suicide enzyme is, so that the pool follows the cumulative exposure rather than the peak concentration (Fig. 8f,g). With stable MGMT, the depth of response over six cycles is 0.20 log</w:t>
+        <w:t xml:space="preserve"> </w:t>
+      </w:r>
+      <w:r>
+        <w:t xml:space="preserve">and either stable or consumed by it stoichiometrically, one molecule per lesion repaired, as a suicide enzyme is, so that the pool follows the cumulative exposure rather than the peak concentration (Fig. 8f,g). Lesions are not tracked as a state variable: they are taken to form in proportion to dose and to be repaired at once, so</w:t>
+      </w:r>
+      <w:r>
+        <w:t xml:space="preserve"> </w:t>
+      </w:r>
+      <w:r>
+        <w:t xml:space="preserve">“one molecule per lesion”</w:t>
+      </w:r>
+      <w:r>
+        <w:t xml:space="preserve"> </w:t>
+      </w:r>
+      <w:r>
+        <w:t xml:space="preserve">enters only through the rate of consumption, and no unrepaired damage accumulates. The rate constant of that consumption is not fitted to data; it is set so that consumption at the standard bolus peak matches the first-order parameterisation it replaces, which makes the two mechanisms comparable at the same initial rate and isolates how each integrates over time. With stable MGMT, the depth of response over six cycles is 0.20 log</w:t>
       </w:r>
       <m:oMath>
         <m:sSub>
@@ -2816,7 +2846,7 @@
         <w:rPr>
           <w:vertAlign w:val="superscript"/>
         </w:rPr>
-        <w:t xml:space="preserve">52</w:t>
+        <w:t xml:space="preserve">54</w:t>
       </w:r>
       <w:r>
         <w:t xml:space="preserve">, a compressed 1,000 mg/m² schedule takes it to 18% of initial levels while O⁶-methylguanine accumulates in both blood cells and tumour biopsies</w:t>
@@ -2825,7 +2855,7 @@
         <w:rPr>
           <w:vertAlign w:val="superscript"/>
         </w:rPr>
-        <w:t xml:space="preserve">53</w:t>
+        <w:t xml:space="preserve">55</w:t>
       </w:r>
       <w:r>
         <w:t xml:space="preserve">, and in orthotopic GBM43 xenografts tumour MGMT activity is depleted by day 6 on both the standard and the 21-day schedule and stays suppressed only on the 21-day one</w:t>
@@ -2834,7 +2864,7 @@
         <w:rPr>
           <w:vertAlign w:val="superscript"/>
         </w:rPr>
-        <w:t xml:space="preserve">54</w:t>
+        <w:t xml:space="preserve">56</w:t>
       </w:r>
       <w:r>
         <w:t xml:space="preserve">. The last of these is the sharpest comparison available, and it makes the disagreement more specific than the trial alone does: the deeper and longer tumour depletion that the dose-dense schedule is supposed to deliver was confirmed in that model, and survival still did not improve. Either the depletion measured in bulk is not the per-cell depletion that matters for killing, or the benefit of depleting MGMT is offset by something the model leaves out.</w:t>
@@ -2880,7 +2910,7 @@
         <w:rPr>
           <w:vertAlign w:val="superscript"/>
         </w:rPr>
-        <w:t xml:space="preserve">47,49</w:t>
+        <w:t xml:space="preserve">48,50</w:t>
       </w:r>
       <w:r>
         <w:t xml:space="preserve">, and phenotypic-switching theory established that perturbing the retention of a resistant state can decide a treatment outcome</w:t>
@@ -2889,7 +2919,7 @@
         <w:rPr>
           <w:vertAlign w:val="superscript"/>
         </w:rPr>
-        <w:t xml:space="preserve">39</w:t>
+        <w:t xml:space="preserve">40</w:t>
       </w:r>
       <w:r>
         <w:t xml:space="preserve">. What is new is that this is the first package to combine these mechanisms with joint inference and schedule optimisation in a single forward model. Version 1 of this framework already simulated stochastic gene networks in growing and dividing cells and generated synthetic scRNA-seq for imputation and network-inference benchmarking</w:t>
@@ -2924,7 +2954,7 @@
         <w:rPr>
           <w:vertAlign w:val="superscript"/>
         </w:rPr>
-        <w:t xml:space="preserve">46</w:t>
+        <w:t xml:space="preserve">47</w:t>
       </w:r>
       <w:r>
         <w:t xml:space="preserve">; and in the xenografts the resistant tumours were drug-addicted, regressing on withdrawal rather than merely growing more slowly</w:t>
@@ -2933,7 +2963,7 @@
         <w:rPr>
           <w:vertAlign w:val="superscript"/>
         </w:rPr>
-        <w:t xml:space="preserve">48</w:t>
+        <w:t xml:space="preserve">49</w:t>
       </w:r>
       <w:r>
         <w:t xml:space="preserve">, which is the extreme of the fitness cost that the second mechanism here represents. Because the framework simulates the lineage-resolved data from which such properties are measured, it can also say which experiment would settle the question before a trial is designed.</w:t>
@@ -2950,7 +2980,7 @@
         <w:rPr>
           <w:vertAlign w:val="superscript"/>
         </w:rPr>
-        <w:t xml:space="preserve">43–45</w:t>
+        <w:t xml:space="preserve">44–46</w:t>
       </w:r>
       <w:r>
         <w:t xml:space="preserve">; combined with a cycle-gated hazard it is a complete competing explanation for the second-cousin fate correlations that the calibration in Fig. 7 reproduces, and the model as built cannot generate it, so the fit has no choice but to load all of that correlation onto expression memory. Chromatin states or cycle timing with their own inheritance rules would let the two be separated, and are the extension this points to. Six parameters fitted to six fractions leave the switching rates weakly determined, so the memory of the resistant state rests on the lineage correlations used as a prior rather than on the fates themselves; and that memory is carried by one slow promoter, a coarse proxy for chromatin-based inheritance whose single-exponential, symmetric form is a simplification of a process that can be multi-timescale and bistable. The clinical case studies use literature values for cell-cycle times, resistant fractions and pharmacokinetics rather than patient-specific measurements, so their conclusions concern mechanisms and rankings, not absolute survival times. In the glioblastoma study MGMT is consumed stoichiometrically, one molecule per lesion repaired, so its depletion follows the cumulative exposure as a suicide enzyme’s should. Two things about that model should be read with care. Lesions are not a state variable: they are assumed to form in proportion to dose and to be repaired immediately, so</w:t>
@@ -2971,7 +3001,7 @@
         <w:rPr>
           <w:vertAlign w:val="superscript"/>
         </w:rPr>
-        <w:t xml:space="preserve">52–54</w:t>
+        <w:t xml:space="preserve">54–56</w:t>
       </w:r>
       <w:r>
         <w:t xml:space="preserve"> </w:t>
@@ -3739,7 +3769,7 @@
         <w:rPr>
           <w:vertAlign w:val="superscript"/>
         </w:rPr>
-        <w:t xml:space="preserve">55</w:t>
+        <w:t xml:space="preserve">57</w:t>
       </w:r>
       <w:r>
         <w:t xml:space="preserve"> </w:t>
@@ -3751,7 +3781,7 @@
         <w:rPr>
           <w:vertAlign w:val="superscript"/>
         </w:rPr>
-        <w:t xml:space="preserve">56</w:t>
+        <w:t xml:space="preserve">58</w:t>
       </w:r>
       <w:r>
         <w:t xml:space="preserve">; a hybrid scheme in which a leap that would drive any species negative is discarded and that interval is simulated exactly instead (the</w:t>
@@ -3772,7 +3802,7 @@
         <w:rPr>
           <w:vertAlign w:val="superscript"/>
         </w:rPr>
-        <w:t xml:space="preserve">57</w:t>
+        <w:t xml:space="preserve">59</w:t>
       </w:r>
       <w:r>
         <w:t xml:space="preserve"> </w:t>
@@ -3784,7 +3814,7 @@
         <w:rPr>
           <w:vertAlign w:val="superscript"/>
         </w:rPr>
-        <w:t xml:space="preserve">58</w:t>
+        <w:t xml:space="preserve">60</w:t>
       </w:r>
       <w:r>
         <w:t xml:space="preserve">, falling back to a fixed number of exact events when the proposed leap is shorter than</w:t>
@@ -5216,7 +5246,7 @@
         <w:rPr>
           <w:vertAlign w:val="superscript"/>
         </w:rPr>
-        <w:t xml:space="preserve">59</w:t>
+        <w:t xml:space="preserve">61</w:t>
       </w:r>
       <w:r>
         <w:t xml:space="preserve">, the variance of clone-mean expression divided by its permutation-null expectation.</w:t>
@@ -5270,7 +5300,7 @@
         <w:rPr>
           <w:vertAlign w:val="superscript"/>
         </w:rPr>
-        <w:t xml:space="preserve">60</w:t>
+        <w:t xml:space="preserve">62</w:t>
       </w:r>
       <w:r>
         <w:t xml:space="preserve"> </w:t>
@@ -5296,7 +5326,7 @@
         <w:rPr>
           <w:vertAlign w:val="superscript"/>
         </w:rPr>
-        <w:t xml:space="preserve">42</w:t>
+        <w:t xml:space="preserve">43</w:t>
       </w:r>
       <w:r>
         <w:t xml:space="preserve">.</w:t>
@@ -5492,7 +5522,7 @@
         <w:rPr>
           <w:vertAlign w:val="superscript"/>
         </w:rPr>
-        <w:t xml:space="preserve">47</w:t>
+        <w:t xml:space="preserve">48</w:t>
       </w:r>
       <w:r>
         <w:t xml:space="preserve">. Outcomes computed from a simulation are the net growth rate, the depth of response (log</w:t>
@@ -5536,7 +5566,7 @@
         <w:rPr>
           <w:vertAlign w:val="superscript"/>
         </w:rPr>
-        <w:t xml:space="preserve">61,62</w:t>
+        <w:t xml:space="preserve">63,64</w:t>
       </w:r>
       <w:r>
         <w:t xml:space="preserve">; the melanoma value is an assumption, since net doubling times of treated cutaneous melanoma are not established, and it sets the time axis of the melanoma case study rather than the ranking of schedules, which follows from the resistance mechanism. Growth is exponential throughout, which is a simplification: the same measurements favour Gompertzian slowing in large glioblastomas</w:t>
@@ -5545,7 +5575,7 @@
         <w:rPr>
           <w:vertAlign w:val="superscript"/>
         </w:rPr>
-        <w:t xml:space="preserve">62</w:t>
+        <w:t xml:space="preserve">64</w:t>
       </w:r>
       <w:r>
         <w:t xml:space="preserve">, so absolute regrowth times in Fig. 8 are shorter than a saturating model would give. Gene-expression rates are scaled to the hour (mRNA half-life 7 h and protein half-life 35 h, generic mammalian values; at the tumour time scale both species turn over many times per generation, so the results are insensitive to them and all heritable memory resides in the promoter), and founders are drawn from the stationary distribution of promoter states. The melanoma case uses a pre-resistant fraction of 1:200 (a per-marker frequency</w:t>
@@ -5566,7 +5596,7 @@
         <w:rPr>
           <w:vertAlign w:val="superscript"/>
         </w:rPr>
-        <w:t xml:space="preserve">59</w:t>
+        <w:t xml:space="preserve">61</w:t>
       </w:r>
       <w:r>
         <w:t xml:space="preserve">) and drug effects at the fractional-killing dose: sensitive cells arrest and die with a half-life of two weeks, cells in the resistant state are protected, and the drug stabilises the resistant state ten-fold (the drug-induced reprogramming of</w:t>
@@ -5584,7 +5614,7 @@
         <w:rPr>
           <w:vertAlign w:val="superscript"/>
         </w:rPr>
-        <w:t xml:space="preserve">48</w:t>
+        <w:t xml:space="preserve">49</w:t>
       </w:r>
       <w:r>
         <w:t xml:space="preserve">; and partial protection, in which resistant cells grow at half speed under drug. Progression is scored in two ways: from the nadir, as in RECIST (a 20% increase in diameter, taken as a 1.73-fold increase in cell number, after the 8-week lead-in; a well-mixed cell count cannot represent RECIST’s absolute 5 mm threshold, its new-lesion and non-target criteria or its sum-of-diameters basis, and it assumes cell number proportional to volume, so this is an analogue rather than the clinical end point), and as loss of control, the time after randomisation at which the population exceeds 120% of its pre-treatment size, the end point of adaptive-therapy studies, which is the one used to compare schedules that deliberately let the tumour regrow. The temozolomide case uses a one-compartment elimination half-life of 2.1 h</w:t>
@@ -5593,19 +5623,19 @@
         <w:rPr>
           <w:vertAlign w:val="superscript"/>
         </w:rPr>
+        <w:t xml:space="preserve">52</w:t>
+      </w:r>
+      <w:r>
+        <w:t xml:space="preserve"> </w:t>
+      </w:r>
+      <w:r>
+        <w:t xml:space="preserve">(a plasma value from a three-compartment study; the brain-tumour compartment sees roughly a fifth of the plasma exposure with slower kinetics, so this is a surrogate), the regimens of RTOG 0525</w:t>
+      </w:r>
+      <w:r>
+        <w:rPr>
+          <w:vertAlign w:val="superscript"/>
+        </w:rPr>
         <w:t xml:space="preserve">51</w:t>
-      </w:r>
-      <w:r>
-        <w:t xml:space="preserve"> </w:t>
-      </w:r>
-      <w:r>
-        <w:t xml:space="preserve">(a plasma value from a three-compartment study; the brain-tumour compartment sees roughly a fifth of the plasma exposure with slower kinetics, so this is a surrogate), the regimens of RTOG 0525</w:t>
-      </w:r>
-      <w:r>
-        <w:rPr>
-          <w:vertAlign w:val="superscript"/>
-        </w:rPr>
-        <w:t xml:space="preserve">50</w:t>
       </w:r>
       <w:r>
         <w:t xml:space="preserve"> </w:t>
@@ -5702,7 +5732,7 @@
         <w:rPr>
           <w:vertAlign w:val="superscript"/>
         </w:rPr>
-        <w:t xml:space="preserve">63,64</w:t>
+        <w:t xml:space="preserve">65,66</w:t>
       </w:r>
       <w:r>
         <w:t xml:space="preserve">), by agreement between kernels, and by a two-sample comparison against JumpProcesses.jl</w:t>
@@ -5711,7 +5741,7 @@
         <w:rPr>
           <w:vertAlign w:val="superscript"/>
         </w:rPr>
-        <w:t xml:space="preserve">65</w:t>
+        <w:t xml:space="preserve">67</w:t>
       </w:r>
       <w:r>
         <w:t xml:space="preserve"> </w:t>
@@ -5816,7 +5846,7 @@
         <w:rPr>
           <w:vertAlign w:val="superscript"/>
         </w:rPr>
-        <w:t xml:space="preserve">66</w:t>
+        <w:t xml:space="preserve">68</w:t>
       </w:r>
       <w:r>
         <w:t xml:space="preserve">, lineage versus population statistics</w:t>
@@ -5855,28 +5885,28 @@
         <w:rPr>
           <w:vertAlign w:val="superscript"/>
         </w:rPr>
+        <w:t xml:space="preserve">42</w:t>
+      </w:r>
+      <w:r>
+        <w:t xml:space="preserve"> </w:t>
+      </w:r>
+      <w:r>
+        <w:t xml:space="preserve">and</w:t>
+      </w:r>
+      <w:r>
+        <w:rPr>
+          <w:vertAlign w:val="superscript"/>
+        </w:rPr>
+        <w:t xml:space="preserve">9</w:t>
+      </w:r>
+      <w:r>
+        <w:t xml:space="preserve">, and with the phenotypic-selection model of</w:t>
+      </w:r>
+      <w:r>
+        <w:rPr>
+          <w:vertAlign w:val="superscript"/>
+        </w:rPr>
         <w:t xml:space="preserve">41</w:t>
-      </w:r>
-      <w:r>
-        <w:t xml:space="preserve"> </w:t>
-      </w:r>
-      <w:r>
-        <w:t xml:space="preserve">and</w:t>
-      </w:r>
-      <w:r>
-        <w:rPr>
-          <w:vertAlign w:val="superscript"/>
-        </w:rPr>
-        <w:t xml:space="preserve">9</w:t>
-      </w:r>
-      <w:r>
-        <w:t xml:space="preserve">, and with the phenotypic-selection model of</w:t>
-      </w:r>
-      <w:r>
-        <w:rPr>
-          <w:vertAlign w:val="superscript"/>
-        </w:rPr>
-        <w:t xml:space="preserve">40</w:t>
       </w:r>
       <w:r>
         <w:t xml:space="preserve">. All scripts, seeds and outputs are in the</w:t>
@@ -6353,7 +6383,7 @@
         <w:rPr>
           <w:vertAlign w:val="superscript"/>
         </w:rPr>
-        <w:t xml:space="preserve">67</w:t>
+        <w:t xml:space="preserve">69</w:t>
       </w:r>
       <w:r>
         <w:t xml:space="preserve">, MAGIC</w:t>
@@ -6362,7 +6392,7 @@
         <w:rPr>
           <w:vertAlign w:val="superscript"/>
         </w:rPr>
-        <w:t xml:space="preserve">68</w:t>
+        <w:t xml:space="preserve">70</w:t>
       </w:r>
       <w:r>
         <w:t xml:space="preserve"> </w:t>
@@ -6374,7 +6404,7 @@
         <w:rPr>
           <w:vertAlign w:val="superscript"/>
         </w:rPr>
-        <w:t xml:space="preserve">69</w:t>
+        <w:t xml:space="preserve">71</w:t>
       </w:r>
       <w:r>
         <w:t xml:space="preserve">. The test suite (Aqua quality checks and statistical tests) runs under GitHub Actions on Julia 1.10 and the latest release.</w:t>
@@ -7775,7 +7805,7 @@
       </w:r>
     </w:p>
     <w:bookmarkEnd w:id="65"/>
-    <w:bookmarkStart w:id="205" w:name="references"/>
+    <w:bookmarkStart w:id="209" w:name="references"/>
     <w:p>
       <w:pPr>
         <w:pStyle w:val="Heading1"/>
@@ -7784,7 +7814,7 @@
         <w:t xml:space="preserve">References</w:t>
       </w:r>
     </w:p>
-    <w:bookmarkStart w:id="204" w:name="refs"/>
+    <w:bookmarkStart w:id="208" w:name="refs"/>
     <w:bookmarkStart w:id="67" w:name="ref-sharma2010"/>
     <w:p>
       <w:pPr>
@@ -10276,7 +10306,7 @@
       </w:r>
     </w:p>
     <w:bookmarkEnd w:id="139"/>
-    <w:bookmarkStart w:id="141" w:name="ref-torre2021"/>
+    <w:bookmarkStart w:id="141" w:name="ref-emert2021"/>
     <w:p>
       <w:pPr>
         <w:pStyle w:val="Bibliography"/>
@@ -10291,7 +10321,7 @@
         <w:t xml:space="preserve">	</w:t>
       </w:r>
       <w:r>
-        <w:t xml:space="preserve">Torre, E. A.</w:t>
+        <w:t xml:space="preserve">Emert, B. L.</w:t>
       </w:r>
       <w:r>
         <w:t xml:space="preserve"> </w:t>
@@ -10311,7 +10341,7 @@
           <w:rPr>
             <w:rStyle w:val="Hyperlink"/>
           </w:rPr>
-          <w:t xml:space="preserve">Genetic screening for single-cell variability modulators driving therapy resistance</w:t>
+          <w:t xml:space="preserve">Variability within rare cell states enables multiple paths toward drug resistance</w:t>
         </w:r>
       </w:hyperlink>
       <w:r>
@@ -10325,7 +10355,7 @@
           <w:i/>
           <w:iCs/>
         </w:rPr>
-        <w:t xml:space="preserve">Nature Genetics</w:t>
+        <w:t xml:space="preserve">Nature Biotechnology</w:t>
       </w:r>
       <w:r>
         <w:t xml:space="preserve"> </w:t>
@@ -10335,14 +10365,14 @@
           <w:b/>
           <w:bCs/>
         </w:rPr>
-        <w:t xml:space="preserve">53</w:t>
-      </w:r>
-      <w:r>
-        <w:t xml:space="preserve">, 76–85 (2021).</w:t>
+        <w:t xml:space="preserve">39</w:t>
+      </w:r>
+      <w:r>
+        <w:t xml:space="preserve">, 865–876 (2021).</w:t>
       </w:r>
     </w:p>
     <w:bookmarkEnd w:id="141"/>
-    <w:bookmarkStart w:id="143" w:name="ref-gunnarsson2020"/>
+    <w:bookmarkStart w:id="143" w:name="ref-torre2021"/>
     <w:p>
       <w:pPr>
         <w:pStyle w:val="Bibliography"/>
@@ -10357,21 +10387,7 @@
         <w:t xml:space="preserve">	</w:t>
       </w:r>
       <w:r>
-        <w:t xml:space="preserve">Gunnarsson, E. B., De, S., Leder, K. &amp; Foo, J.</w:t>
-      </w:r>
-      <w:r>
-        <w:t xml:space="preserve"> </w:t>
-      </w:r>
-      <w:hyperlink r:id="rId142">
-        <w:r>
-          <w:rPr>
-            <w:rStyle w:val="Hyperlink"/>
-          </w:rPr>
-          <w:t xml:space="preserve">Understanding the role of phenotypic switching in cancer drug resistance</w:t>
-        </w:r>
-      </w:hyperlink>
-      <w:r>
-        <w:t xml:space="preserve">.</w:t>
+        <w:t xml:space="preserve">Torre, E. A.</w:t>
       </w:r>
       <w:r>
         <w:t xml:space="preserve"> </w:t>
@@ -10381,7 +10397,31 @@
           <w:i/>
           <w:iCs/>
         </w:rPr>
-        <w:t xml:space="preserve">Journal of Theoretical Biology</w:t>
+        <w:t xml:space="preserve">et al.</w:t>
+      </w:r>
+      <w:r>
+        <w:t xml:space="preserve"> </w:t>
+      </w:r>
+      <w:hyperlink r:id="rId142">
+        <w:r>
+          <w:rPr>
+            <w:rStyle w:val="Hyperlink"/>
+          </w:rPr>
+          <w:t xml:space="preserve">Genetic screening for single-cell variability modulators driving therapy resistance</w:t>
+        </w:r>
+      </w:hyperlink>
+      <w:r>
+        <w:t xml:space="preserve">.</w:t>
+      </w:r>
+      <w:r>
+        <w:t xml:space="preserve"> </w:t>
+      </w:r>
+      <w:r>
+        <w:rPr>
+          <w:i/>
+          <w:iCs/>
+        </w:rPr>
+        <w:t xml:space="preserve">Nature Genetics</w:t>
       </w:r>
       <w:r>
         <w:t xml:space="preserve"> </w:t>
@@ -10391,14 +10431,14 @@
           <w:b/>
           <w:bCs/>
         </w:rPr>
-        <w:t xml:space="preserve">490</w:t>
-      </w:r>
-      <w:r>
-        <w:t xml:space="preserve">, 110162 (2020).</w:t>
+        <w:t xml:space="preserve">53</w:t>
+      </w:r>
+      <w:r>
+        <w:t xml:space="preserve">, 76–85 (2021).</w:t>
       </w:r>
     </w:p>
     <w:bookmarkEnd w:id="143"/>
-    <w:bookmarkStart w:id="145" w:name="ref-lasri2020"/>
+    <w:bookmarkStart w:id="145" w:name="ref-gunnarsson2020"/>
     <w:p>
       <w:pPr>
         <w:pStyle w:val="Bibliography"/>
@@ -10413,7 +10453,21 @@
         <w:t xml:space="preserve">	</w:t>
       </w:r>
       <w:r>
-        <w:t xml:space="preserve">Lasri, A.</w:t>
+        <w:t xml:space="preserve">Gunnarsson, E. B., De, S., Leder, K. &amp; Foo, J.</w:t>
+      </w:r>
+      <w:r>
+        <w:t xml:space="preserve"> </w:t>
+      </w:r>
+      <w:hyperlink r:id="rId144">
+        <w:r>
+          <w:rPr>
+            <w:rStyle w:val="Hyperlink"/>
+          </w:rPr>
+          <w:t xml:space="preserve">Understanding the role of phenotypic switching in cancer drug resistance</w:t>
+        </w:r>
+      </w:hyperlink>
+      <w:r>
+        <w:t xml:space="preserve">.</w:t>
       </w:r>
       <w:r>
         <w:t xml:space="preserve"> </w:t>
@@ -10423,57 +10477,39 @@
           <w:i/>
           <w:iCs/>
         </w:rPr>
-        <w:t xml:space="preserve">et al.</w:t>
-      </w:r>
-      <w:r>
-        <w:t xml:space="preserve"> </w:t>
-      </w:r>
-      <w:hyperlink r:id="rId144">
-        <w:r>
-          <w:rPr>
-            <w:rStyle w:val="Hyperlink"/>
-          </w:rPr>
-          <w:t xml:space="preserve">Phenotypic selection through cell death: Stochastic modelling of</w:t>
-        </w:r>
-        <w:r>
-          <w:rPr>
-            <w:rStyle w:val="Hyperlink"/>
-          </w:rPr>
-          <w:t xml:space="preserve"> </w:t>
-        </w:r>
-        <w:r>
-          <w:rPr>
-            <w:rStyle w:val="Hyperlink"/>
-          </w:rPr>
-          <w:t xml:space="preserve">O</w:t>
-        </w:r>
-        <w:r>
-          <w:rPr>
-            <w:rStyle w:val="Hyperlink"/>
-          </w:rPr>
-          <w:t xml:space="preserve">-6-methylguanine-</w:t>
-        </w:r>
-        <w:r>
-          <w:rPr>
-            <w:rStyle w:val="Hyperlink"/>
-          </w:rPr>
-          <w:t xml:space="preserve">DNA</w:t>
-        </w:r>
-        <w:r>
-          <w:rPr>
-            <w:rStyle w:val="Hyperlink"/>
-          </w:rPr>
-          <w:t xml:space="preserve"> </w:t>
-        </w:r>
-        <w:r>
-          <w:rPr>
-            <w:rStyle w:val="Hyperlink"/>
-          </w:rPr>
-          <w:t xml:space="preserve">methyltransferase dynamics</w:t>
-        </w:r>
-      </w:hyperlink>
-      <w:r>
-        <w:t xml:space="preserve">.</w:t>
+        <w:t xml:space="preserve">Journal of Theoretical Biology</w:t>
+      </w:r>
+      <w:r>
+        <w:t xml:space="preserve"> </w:t>
+      </w:r>
+      <w:r>
+        <w:rPr>
+          <w:b/>
+          <w:bCs/>
+        </w:rPr>
+        <w:t xml:space="preserve">490</w:t>
+      </w:r>
+      <w:r>
+        <w:t xml:space="preserve">, 110162 (2020).</w:t>
+      </w:r>
+    </w:p>
+    <w:bookmarkEnd w:id="145"/>
+    <w:bookmarkStart w:id="147" w:name="ref-lasri2020"/>
+    <w:p>
+      <w:pPr>
+        <w:pStyle w:val="Bibliography"/>
+      </w:pPr>
+      <w:r>
+        <w:t xml:space="preserve">41.</w:t>
+      </w:r>
+      <w:r>
+        <w:t xml:space="preserve"> </w:t>
+      </w:r>
+      <w:r>
+        <w:t xml:space="preserve">	</w:t>
+      </w:r>
+      <w:r>
+        <w:t xml:space="preserve">Lasri, A.</w:t>
       </w:r>
       <w:r>
         <w:t xml:space="preserve"> </w:t>
@@ -10483,6 +10519,66 @@
           <w:i/>
           <w:iCs/>
         </w:rPr>
+        <w:t xml:space="preserve">et al.</w:t>
+      </w:r>
+      <w:r>
+        <w:t xml:space="preserve"> </w:t>
+      </w:r>
+      <w:hyperlink r:id="rId146">
+        <w:r>
+          <w:rPr>
+            <w:rStyle w:val="Hyperlink"/>
+          </w:rPr>
+          <w:t xml:space="preserve">Phenotypic selection through cell death: Stochastic modelling of</w:t>
+        </w:r>
+        <w:r>
+          <w:rPr>
+            <w:rStyle w:val="Hyperlink"/>
+          </w:rPr>
+          <w:t xml:space="preserve"> </w:t>
+        </w:r>
+        <w:r>
+          <w:rPr>
+            <w:rStyle w:val="Hyperlink"/>
+          </w:rPr>
+          <w:t xml:space="preserve">O</w:t>
+        </w:r>
+        <w:r>
+          <w:rPr>
+            <w:rStyle w:val="Hyperlink"/>
+          </w:rPr>
+          <w:t xml:space="preserve">-6-methylguanine-</w:t>
+        </w:r>
+        <w:r>
+          <w:rPr>
+            <w:rStyle w:val="Hyperlink"/>
+          </w:rPr>
+          <w:t xml:space="preserve">DNA</w:t>
+        </w:r>
+        <w:r>
+          <w:rPr>
+            <w:rStyle w:val="Hyperlink"/>
+          </w:rPr>
+          <w:t xml:space="preserve"> </w:t>
+        </w:r>
+        <w:r>
+          <w:rPr>
+            <w:rStyle w:val="Hyperlink"/>
+          </w:rPr>
+          <w:t xml:space="preserve">methyltransferase dynamics</w:t>
+        </w:r>
+      </w:hyperlink>
+      <w:r>
+        <w:t xml:space="preserve">.</w:t>
+      </w:r>
+      <w:r>
+        <w:t xml:space="preserve"> </w:t>
+      </w:r>
+      <w:r>
+        <w:rPr>
+          <w:i/>
+          <w:iCs/>
+        </w:rPr>
         <w:t xml:space="preserve">Royal Society Open Science</w:t>
       </w:r>
       <w:r>
@@ -10499,14 +10595,14 @@
         <w:t xml:space="preserve">, 191243 (2020).</w:t>
       </w:r>
     </w:p>
-    <w:bookmarkEnd w:id="145"/>
-    <w:bookmarkStart w:id="147" w:name="ref-corigliano2025"/>
+    <w:bookmarkEnd w:id="147"/>
+    <w:bookmarkStart w:id="149" w:name="ref-corigliano2025"/>
     <w:p>
       <w:pPr>
         <w:pStyle w:val="Bibliography"/>
       </w:pPr>
       <w:r>
-        <w:t xml:space="preserve">41.</w:t>
+        <w:t xml:space="preserve">42.</w:t>
       </w:r>
       <w:r>
         <w:t xml:space="preserve"> </w:t>
@@ -10530,7 +10626,7 @@
       <w:r>
         <w:t xml:space="preserve"> </w:t>
       </w:r>
-      <w:hyperlink r:id="rId146">
+      <w:hyperlink r:id="rId148">
         <w:r>
           <w:rPr>
             <w:rStyle w:val="Hyperlink"/>
@@ -10544,7 +10640,7 @@
       <w:r>
         <w:t xml:space="preserve">(2025) doi:</w:t>
       </w:r>
-      <w:hyperlink r:id="rId146">
+      <w:hyperlink r:id="rId148">
         <w:r>
           <w:rPr>
             <w:rStyle w:val="Hyperlink"/>
@@ -10556,14 +10652,14 @@
         <w:t xml:space="preserve">.</w:t>
       </w:r>
     </w:p>
-    <w:bookmarkEnd w:id="147"/>
-    <w:bookmarkStart w:id="149" w:name="ref-bernton2019"/>
+    <w:bookmarkEnd w:id="149"/>
+    <w:bookmarkStart w:id="151" w:name="ref-bernton2019"/>
     <w:p>
       <w:pPr>
         <w:pStyle w:val="Bibliography"/>
       </w:pPr>
       <w:r>
-        <w:t xml:space="preserve">42.</w:t>
+        <w:t xml:space="preserve">43.</w:t>
       </w:r>
       <w:r>
         <w:t xml:space="preserve"> </w:t>
@@ -10577,7 +10673,7 @@
       <w:r>
         <w:t xml:space="preserve"> </w:t>
       </w:r>
-      <w:hyperlink r:id="rId148">
+      <w:hyperlink r:id="rId150">
         <w:r>
           <w:rPr>
             <w:rStyle w:val="Hyperlink"/>
@@ -10660,14 +10756,14 @@
         <w:t xml:space="preserve">, 235–269 (2019).</w:t>
       </w:r>
     </w:p>
-    <w:bookmarkEnd w:id="149"/>
-    <w:bookmarkStart w:id="151" w:name="ref-sandler2015"/>
+    <w:bookmarkEnd w:id="151"/>
+    <w:bookmarkStart w:id="153" w:name="ref-sandler2015"/>
     <w:p>
       <w:pPr>
         <w:pStyle w:val="Bibliography"/>
       </w:pPr>
       <w:r>
-        <w:t xml:space="preserve">43.</w:t>
+        <w:t xml:space="preserve">44.</w:t>
       </w:r>
       <w:r>
         <w:t xml:space="preserve"> </w:t>
@@ -10691,7 +10787,7 @@
       <w:r>
         <w:t xml:space="preserve"> </w:t>
       </w:r>
-      <w:hyperlink r:id="rId150">
+      <w:hyperlink r:id="rId152">
         <w:r>
           <w:rPr>
             <w:rStyle w:val="Hyperlink"/>
@@ -10726,14 +10822,14 @@
         <w:t xml:space="preserve">, 468–471 (2015).</w:t>
       </w:r>
     </w:p>
-    <w:bookmarkEnd w:id="151"/>
-    <w:bookmarkStart w:id="153" w:name="ref-kuchen2020"/>
+    <w:bookmarkEnd w:id="153"/>
+    <w:bookmarkStart w:id="155" w:name="ref-kuchen2020"/>
     <w:p>
       <w:pPr>
         <w:pStyle w:val="Bibliography"/>
       </w:pPr>
       <w:r>
-        <w:t xml:space="preserve">44.</w:t>
+        <w:t xml:space="preserve">45.</w:t>
       </w:r>
       <w:r>
         <w:t xml:space="preserve"> </w:t>
@@ -10747,7 +10843,7 @@
       <w:r>
         <w:t xml:space="preserve"> </w:t>
       </w:r>
-      <w:hyperlink r:id="rId152">
+      <w:hyperlink r:id="rId154">
         <w:r>
           <w:rPr>
             <w:rStyle w:val="Hyperlink"/>
@@ -10782,14 +10878,14 @@
         <w:t xml:space="preserve">, e51002 (2020).</w:t>
       </w:r>
     </w:p>
-    <w:bookmarkEnd w:id="153"/>
-    <w:bookmarkStart w:id="155" w:name="ref-chakrabarti2018"/>
+    <w:bookmarkEnd w:id="155"/>
+    <w:bookmarkStart w:id="157" w:name="ref-chakrabarti2018"/>
     <w:p>
       <w:pPr>
         <w:pStyle w:val="Bibliography"/>
       </w:pPr>
       <w:r>
-        <w:t xml:space="preserve">45.</w:t>
+        <w:t xml:space="preserve">46.</w:t>
       </w:r>
       <w:r>
         <w:t xml:space="preserve"> </w:t>
@@ -10813,7 +10909,7 @@
       <w:r>
         <w:t xml:space="preserve"> </w:t>
       </w:r>
-      <w:hyperlink r:id="rId154">
+      <w:hyperlink r:id="rId156">
         <w:r>
           <w:rPr>
             <w:rStyle w:val="Hyperlink"/>
@@ -10848,14 +10944,14 @@
         <w:t xml:space="preserve">, 5372 (2018).</w:t>
       </w:r>
     </w:p>
-    <w:bookmarkEnd w:id="155"/>
-    <w:bookmarkStart w:id="157" w:name="ref-algazi2020"/>
+    <w:bookmarkEnd w:id="157"/>
+    <w:bookmarkStart w:id="159" w:name="ref-algazi2020"/>
     <w:p>
       <w:pPr>
         <w:pStyle w:val="Bibliography"/>
       </w:pPr>
       <w:r>
-        <w:t xml:space="preserve">46.</w:t>
+        <w:t xml:space="preserve">47.</w:t>
       </w:r>
       <w:r>
         <w:t xml:space="preserve"> </w:t>
@@ -10879,7 +10975,7 @@
       <w:r>
         <w:t xml:space="preserve"> </w:t>
       </w:r>
-      <w:hyperlink r:id="rId156">
+      <w:hyperlink r:id="rId158">
         <w:r>
           <w:rPr>
             <w:rStyle w:val="Hyperlink"/>
@@ -10980,14 +11076,14 @@
         <w:t xml:space="preserve">, 1564–1568 (2020).</w:t>
       </w:r>
     </w:p>
-    <w:bookmarkEnd w:id="157"/>
-    <w:bookmarkStart w:id="159" w:name="ref-zhang2017adaptive"/>
+    <w:bookmarkEnd w:id="159"/>
+    <w:bookmarkStart w:id="161" w:name="ref-zhang2017adaptive"/>
     <w:p>
       <w:pPr>
         <w:pStyle w:val="Bibliography"/>
       </w:pPr>
       <w:r>
-        <w:t xml:space="preserve">47.</w:t>
+        <w:t xml:space="preserve">48.</w:t>
       </w:r>
       <w:r>
         <w:t xml:space="preserve"> </w:t>
@@ -11001,7 +11097,7 @@
       <w:r>
         <w:t xml:space="preserve"> </w:t>
       </w:r>
-      <w:hyperlink r:id="rId158">
+      <w:hyperlink r:id="rId160">
         <w:r>
           <w:rPr>
             <w:rStyle w:val="Hyperlink"/>
@@ -11036,14 +11132,14 @@
         <w:t xml:space="preserve">, 1816 (2017).</w:t>
       </w:r>
     </w:p>
-    <w:bookmarkEnd w:id="159"/>
-    <w:bookmarkStart w:id="161" w:name="ref-dasthakur2013"/>
+    <w:bookmarkEnd w:id="161"/>
+    <w:bookmarkStart w:id="163" w:name="ref-dasthakur2013"/>
     <w:p>
       <w:pPr>
         <w:pStyle w:val="Bibliography"/>
       </w:pPr>
       <w:r>
-        <w:t xml:space="preserve">48.</w:t>
+        <w:t xml:space="preserve">49.</w:t>
       </w:r>
       <w:r>
         <w:t xml:space="preserve"> </w:t>
@@ -11067,7 +11163,7 @@
       <w:r>
         <w:t xml:space="preserve"> </w:t>
       </w:r>
-      <w:hyperlink r:id="rId160">
+      <w:hyperlink r:id="rId162">
         <w:r>
           <w:rPr>
             <w:rStyle w:val="Hyperlink"/>
@@ -11102,14 +11198,14 @@
         <w:t xml:space="preserve">, 251–255 (2013).</w:t>
       </w:r>
     </w:p>
-    <w:bookmarkEnd w:id="161"/>
-    <w:bookmarkStart w:id="163" w:name="ref-strobl2021"/>
+    <w:bookmarkEnd w:id="163"/>
+    <w:bookmarkStart w:id="165" w:name="ref-strobl2021"/>
     <w:p>
       <w:pPr>
         <w:pStyle w:val="Bibliography"/>
       </w:pPr>
       <w:r>
-        <w:t xml:space="preserve">49.</w:t>
+        <w:t xml:space="preserve">50.</w:t>
       </w:r>
       <w:r>
         <w:t xml:space="preserve"> </w:t>
@@ -11133,7 +11229,7 @@
       <w:r>
         <w:t xml:space="preserve"> </w:t>
       </w:r>
-      <w:hyperlink r:id="rId162">
+      <w:hyperlink r:id="rId164">
         <w:r>
           <w:rPr>
             <w:rStyle w:val="Hyperlink"/>
@@ -11168,14 +11264,14 @@
         <w:t xml:space="preserve">, 1135–1147 (2021).</w:t>
       </w:r>
     </w:p>
-    <w:bookmarkEnd w:id="163"/>
-    <w:bookmarkStart w:id="165" w:name="ref-gilbert2013"/>
+    <w:bookmarkEnd w:id="165"/>
+    <w:bookmarkStart w:id="167" w:name="ref-gilbert2013"/>
     <w:p>
       <w:pPr>
         <w:pStyle w:val="Bibliography"/>
       </w:pPr>
       <w:r>
-        <w:t xml:space="preserve">50.</w:t>
+        <w:t xml:space="preserve">51.</w:t>
       </w:r>
       <w:r>
         <w:t xml:space="preserve"> </w:t>
@@ -11199,7 +11295,7 @@
       <w:r>
         <w:t xml:space="preserve"> </w:t>
       </w:r>
-      <w:hyperlink r:id="rId164">
+      <w:hyperlink r:id="rId166">
         <w:r>
           <w:rPr>
             <w:rStyle w:val="Hyperlink"/>
@@ -11258,14 +11354,14 @@
         <w:t xml:space="preserve">, 4085–4091 (2013).</w:t>
       </w:r>
     </w:p>
-    <w:bookmarkEnd w:id="165"/>
-    <w:bookmarkStart w:id="167" w:name="ref-ostermann2004"/>
+    <w:bookmarkEnd w:id="167"/>
+    <w:bookmarkStart w:id="169" w:name="ref-ostermann2004"/>
     <w:p>
       <w:pPr>
         <w:pStyle w:val="Bibliography"/>
       </w:pPr>
       <w:r>
-        <w:t xml:space="preserve">51.</w:t>
+        <w:t xml:space="preserve">52.</w:t>
       </w:r>
       <w:r>
         <w:t xml:space="preserve"> </w:t>
@@ -11289,7 +11385,7 @@
       <w:r>
         <w:t xml:space="preserve"> </w:t>
       </w:r>
-      <w:hyperlink r:id="rId166">
+      <w:hyperlink r:id="rId168">
         <w:r>
           <w:rPr>
             <w:rStyle w:val="Hyperlink"/>
@@ -11324,14 +11420,14 @@
         <w:t xml:space="preserve">, 3728–3736 (2004).</w:t>
       </w:r>
     </w:p>
-    <w:bookmarkEnd w:id="167"/>
-    <w:bookmarkStart w:id="169" w:name="ref-tolcher2003"/>
+    <w:bookmarkEnd w:id="169"/>
+    <w:bookmarkStart w:id="171" w:name="ref-rudek2004"/>
     <w:p>
       <w:pPr>
         <w:pStyle w:val="Bibliography"/>
       </w:pPr>
       <w:r>
-        <w:t xml:space="preserve">52.</w:t>
+        <w:t xml:space="preserve">53.</w:t>
       </w:r>
       <w:r>
         <w:t xml:space="preserve"> </w:t>
@@ -11340,7 +11436,7 @@
         <w:t xml:space="preserve">	</w:t>
       </w:r>
       <w:r>
-        <w:t xml:space="preserve">Tolcher, A. W.</w:t>
+        <w:t xml:space="preserve">Rudek, M. A.</w:t>
       </w:r>
       <w:r>
         <w:t xml:space="preserve"> </w:t>
@@ -11355,12 +11451,12 @@
       <w:r>
         <w:t xml:space="preserve"> </w:t>
       </w:r>
-      <w:hyperlink r:id="rId168">
-        <w:r>
-          <w:rPr>
-            <w:rStyle w:val="Hyperlink"/>
-          </w:rPr>
-          <w:t xml:space="preserve">Marked inactivation of</w:t>
+      <w:hyperlink r:id="rId170">
+        <w:r>
+          <w:rPr>
+            <w:rStyle w:val="Hyperlink"/>
+          </w:rPr>
+          <w:t xml:space="preserve">Temozolomide in patients with advanced cancer: Phase</w:t>
         </w:r>
         <w:r>
           <w:rPr>
@@ -11372,7 +11468,7 @@
           <w:rPr>
             <w:rStyle w:val="Hyperlink"/>
           </w:rPr>
-          <w:t xml:space="preserve">O6-alkylguanine-DNA</w:t>
+          <w:t xml:space="preserve">I</w:t>
         </w:r>
         <w:r>
           <w:rPr>
@@ -11384,7 +11480,7 @@
           <w:rPr>
             <w:rStyle w:val="Hyperlink"/>
           </w:rPr>
-          <w:t xml:space="preserve">alkyltransferase activity with protracted temozolomide schedules</w:t>
+          <w:t xml:space="preserve">and pharmacokinetic study</w:t>
         </w:r>
       </w:hyperlink>
       <w:r>
@@ -11398,7 +11494,7 @@
           <w:i/>
           <w:iCs/>
         </w:rPr>
-        <w:t xml:space="preserve">British Journal of Cancer</w:t>
+        <w:t xml:space="preserve">Pharmacotherapy</w:t>
       </w:r>
       <w:r>
         <w:t xml:space="preserve"> </w:t>
@@ -11408,20 +11504,20 @@
           <w:b/>
           <w:bCs/>
         </w:rPr>
-        <w:t xml:space="preserve">88</w:t>
-      </w:r>
-      <w:r>
-        <w:t xml:space="preserve">, 1004–1011 (2003).</w:t>
-      </w:r>
-    </w:p>
-    <w:bookmarkEnd w:id="169"/>
-    <w:bookmarkStart w:id="171" w:name="ref-middleton2000"/>
+        <w:t xml:space="preserve">24</w:t>
+      </w:r>
+      <w:r>
+        <w:t xml:space="preserve">, 16–25 (2004).</w:t>
+      </w:r>
+    </w:p>
+    <w:bookmarkEnd w:id="171"/>
+    <w:bookmarkStart w:id="173" w:name="ref-tolcher2003"/>
     <w:p>
       <w:pPr>
         <w:pStyle w:val="Bibliography"/>
       </w:pPr>
       <w:r>
-        <w:t xml:space="preserve">53.</w:t>
+        <w:t xml:space="preserve">54.</w:t>
       </w:r>
       <w:r>
         <w:t xml:space="preserve"> </w:t>
@@ -11430,7 +11526,7 @@
         <w:t xml:space="preserve">	</w:t>
       </w:r>
       <w:r>
-        <w:t xml:space="preserve">Middleton, M. R.</w:t>
+        <w:t xml:space="preserve">Tolcher, A. W.</w:t>
       </w:r>
       <w:r>
         <w:t xml:space="preserve"> </w:t>
@@ -11445,12 +11541,12 @@
       <w:r>
         <w:t xml:space="preserve"> </w:t>
       </w:r>
-      <w:hyperlink r:id="rId170">
-        <w:r>
-          <w:rPr>
-            <w:rStyle w:val="Hyperlink"/>
-          </w:rPr>
-          <w:t xml:space="preserve">O6-methylguanine</w:t>
+      <w:hyperlink r:id="rId172">
+        <w:r>
+          <w:rPr>
+            <w:rStyle w:val="Hyperlink"/>
+          </w:rPr>
+          <w:t xml:space="preserve">Marked inactivation of</w:t>
         </w:r>
         <w:r>
           <w:rPr>
@@ -11462,7 +11558,7 @@
           <w:rPr>
             <w:rStyle w:val="Hyperlink"/>
           </w:rPr>
-          <w:t xml:space="preserve">formation, repair protein depletion and clinical outcome with a 4 hr schedule of temozolomide in the treatment of advanced melanoma: Results of a phase</w:t>
+          <w:t xml:space="preserve">O6-alkylguanine-DNA</w:t>
         </w:r>
         <w:r>
           <w:rPr>
@@ -11474,19 +11570,7 @@
           <w:rPr>
             <w:rStyle w:val="Hyperlink"/>
           </w:rPr>
-          <w:t xml:space="preserve">II</w:t>
-        </w:r>
-        <w:r>
-          <w:rPr>
-            <w:rStyle w:val="Hyperlink"/>
-          </w:rPr>
-          <w:t xml:space="preserve"> </w:t>
-        </w:r>
-        <w:r>
-          <w:rPr>
-            <w:rStyle w:val="Hyperlink"/>
-          </w:rPr>
-          <w:t xml:space="preserve">study</w:t>
+          <w:t xml:space="preserve">alkyltransferase activity with protracted temozolomide schedules</w:t>
         </w:r>
       </w:hyperlink>
       <w:r>
@@ -11500,7 +11584,7 @@
           <w:i/>
           <w:iCs/>
         </w:rPr>
-        <w:t xml:space="preserve">International Journal of Cancer</w:t>
+        <w:t xml:space="preserve">British Journal of Cancer</w:t>
       </w:r>
       <w:r>
         <w:t xml:space="preserve"> </w:t>
@@ -11513,17 +11597,17 @@
         <w:t xml:space="preserve">88</w:t>
       </w:r>
       <w:r>
-        <w:t xml:space="preserve">, 469–473 (2000).</w:t>
-      </w:r>
-    </w:p>
-    <w:bookmarkEnd w:id="171"/>
-    <w:bookmarkStart w:id="173" w:name="ref-robinson2010"/>
+        <w:t xml:space="preserve">, 1004–1011 (2003).</w:t>
+      </w:r>
+    </w:p>
+    <w:bookmarkEnd w:id="173"/>
+    <w:bookmarkStart w:id="175" w:name="ref-middleton2000"/>
     <w:p>
       <w:pPr>
         <w:pStyle w:val="Bibliography"/>
       </w:pPr>
       <w:r>
-        <w:t xml:space="preserve">54.</w:t>
+        <w:t xml:space="preserve">55.</w:t>
       </w:r>
       <w:r>
         <w:t xml:space="preserve"> </w:t>
@@ -11532,7 +11616,7 @@
         <w:t xml:space="preserve">	</w:t>
       </w:r>
       <w:r>
-        <w:t xml:space="preserve">Robinson, C. G.</w:t>
+        <w:t xml:space="preserve">Middleton, M. R.</w:t>
       </w:r>
       <w:r>
         <w:t xml:space="preserve"> </w:t>
@@ -11547,12 +11631,12 @@
       <w:r>
         <w:t xml:space="preserve"> </w:t>
       </w:r>
-      <w:hyperlink r:id="rId172">
-        <w:r>
-          <w:rPr>
-            <w:rStyle w:val="Hyperlink"/>
-          </w:rPr>
-          <w:t xml:space="preserve">Effect of alternative temozolomide schedules on glioblastoma</w:t>
+      <w:hyperlink r:id="rId174">
+        <w:r>
+          <w:rPr>
+            <w:rStyle w:val="Hyperlink"/>
+          </w:rPr>
+          <w:t xml:space="preserve">O6-methylguanine</w:t>
         </w:r>
         <w:r>
           <w:rPr>
@@ -11564,7 +11648,7 @@
           <w:rPr>
             <w:rStyle w:val="Hyperlink"/>
           </w:rPr>
-          <w:t xml:space="preserve">O6-methylguanine-DNA</w:t>
+          <w:t xml:space="preserve">formation, repair protein depletion and clinical outcome with a 4 hr schedule of temozolomide in the treatment of advanced melanoma: Results of a phase</w:t>
         </w:r>
         <w:r>
           <w:rPr>
@@ -11576,7 +11660,19 @@
           <w:rPr>
             <w:rStyle w:val="Hyperlink"/>
           </w:rPr>
-          <w:t xml:space="preserve">methyltransferase activity and survival</w:t>
+          <w:t xml:space="preserve">II</w:t>
+        </w:r>
+        <w:r>
+          <w:rPr>
+            <w:rStyle w:val="Hyperlink"/>
+          </w:rPr>
+          <w:t xml:space="preserve"> </w:t>
+        </w:r>
+        <w:r>
+          <w:rPr>
+            <w:rStyle w:val="Hyperlink"/>
+          </w:rPr>
+          <w:t xml:space="preserve">study</w:t>
         </w:r>
       </w:hyperlink>
       <w:r>
@@ -11590,7 +11686,7 @@
           <w:i/>
           <w:iCs/>
         </w:rPr>
-        <w:t xml:space="preserve">British Journal of Cancer</w:t>
+        <w:t xml:space="preserve">International Journal of Cancer</w:t>
       </w:r>
       <w:r>
         <w:t xml:space="preserve"> </w:t>
@@ -11600,20 +11696,20 @@
           <w:b/>
           <w:bCs/>
         </w:rPr>
-        <w:t xml:space="preserve">103</w:t>
-      </w:r>
-      <w:r>
-        <w:t xml:space="preserve">, 498–504 (2010).</w:t>
-      </w:r>
-    </w:p>
-    <w:bookmarkEnd w:id="173"/>
-    <w:bookmarkStart w:id="175" w:name="ref-gillespie1977"/>
+        <w:t xml:space="preserve">88</w:t>
+      </w:r>
+      <w:r>
+        <w:t xml:space="preserve">, 469–473 (2000).</w:t>
+      </w:r>
+    </w:p>
+    <w:bookmarkEnd w:id="175"/>
+    <w:bookmarkStart w:id="177" w:name="ref-robinson2010"/>
     <w:p>
       <w:pPr>
         <w:pStyle w:val="Bibliography"/>
       </w:pPr>
       <w:r>
-        <w:t xml:space="preserve">55.</w:t>
+        <w:t xml:space="preserve">56.</w:t>
       </w:r>
       <w:r>
         <w:t xml:space="preserve"> </w:t>
@@ -11622,21 +11718,7 @@
         <w:t xml:space="preserve">	</w:t>
       </w:r>
       <w:r>
-        <w:t xml:space="preserve">Gillespie, D. T.</w:t>
-      </w:r>
-      <w:r>
-        <w:t xml:space="preserve"> </w:t>
-      </w:r>
-      <w:hyperlink r:id="rId174">
-        <w:r>
-          <w:rPr>
-            <w:rStyle w:val="Hyperlink"/>
-          </w:rPr>
-          <w:t xml:space="preserve">Exact stochastic simulation of coupled chemical reactions</w:t>
-        </w:r>
-      </w:hyperlink>
-      <w:r>
-        <w:t xml:space="preserve">.</w:t>
+        <w:t xml:space="preserve">Robinson, C. G.</w:t>
       </w:r>
       <w:r>
         <w:t xml:space="preserve"> </w:t>
@@ -11646,7 +11728,55 @@
           <w:i/>
           <w:iCs/>
         </w:rPr>
-        <w:t xml:space="preserve">The Journal of Physical Chemistry</w:t>
+        <w:t xml:space="preserve">et al.</w:t>
+      </w:r>
+      <w:r>
+        <w:t xml:space="preserve"> </w:t>
+      </w:r>
+      <w:hyperlink r:id="rId176">
+        <w:r>
+          <w:rPr>
+            <w:rStyle w:val="Hyperlink"/>
+          </w:rPr>
+          <w:t xml:space="preserve">Effect of alternative temozolomide schedules on glioblastoma</w:t>
+        </w:r>
+        <w:r>
+          <w:rPr>
+            <w:rStyle w:val="Hyperlink"/>
+          </w:rPr>
+          <w:t xml:space="preserve"> </w:t>
+        </w:r>
+        <w:r>
+          <w:rPr>
+            <w:rStyle w:val="Hyperlink"/>
+          </w:rPr>
+          <w:t xml:space="preserve">O6-methylguanine-DNA</w:t>
+        </w:r>
+        <w:r>
+          <w:rPr>
+            <w:rStyle w:val="Hyperlink"/>
+          </w:rPr>
+          <w:t xml:space="preserve"> </w:t>
+        </w:r>
+        <w:r>
+          <w:rPr>
+            <w:rStyle w:val="Hyperlink"/>
+          </w:rPr>
+          <w:t xml:space="preserve">methyltransferase activity and survival</w:t>
+        </w:r>
+      </w:hyperlink>
+      <w:r>
+        <w:t xml:space="preserve">.</w:t>
+      </w:r>
+      <w:r>
+        <w:t xml:space="preserve"> </w:t>
+      </w:r>
+      <w:r>
+        <w:rPr>
+          <w:i/>
+          <w:iCs/>
+        </w:rPr>
+        <w:t xml:space="preserve">British Journal of Cancer</w:t>
       </w:r>
       <w:r>
         <w:t xml:space="preserve"> </w:t>
@@ -11656,20 +11786,20 @@
           <w:b/>
           <w:bCs/>
         </w:rPr>
-        <w:t xml:space="preserve">81</w:t>
-      </w:r>
-      <w:r>
-        <w:t xml:space="preserve">, 2340–2361 (1977).</w:t>
-      </w:r>
-    </w:p>
-    <w:bookmarkEnd w:id="175"/>
-    <w:bookmarkStart w:id="177" w:name="ref-gillespie2001"/>
+        <w:t xml:space="preserve">103</w:t>
+      </w:r>
+      <w:r>
+        <w:t xml:space="preserve">, 498–504 (2010).</w:t>
+      </w:r>
+    </w:p>
+    <w:bookmarkEnd w:id="177"/>
+    <w:bookmarkStart w:id="179" w:name="ref-gillespie1977"/>
     <w:p>
       <w:pPr>
         <w:pStyle w:val="Bibliography"/>
       </w:pPr>
       <w:r>
-        <w:t xml:space="preserve">56.</w:t>
+        <w:t xml:space="preserve">57.</w:t>
       </w:r>
       <w:r>
         <w:t xml:space="preserve"> </w:t>
@@ -11683,12 +11813,12 @@
       <w:r>
         <w:t xml:space="preserve"> </w:t>
       </w:r>
-      <w:hyperlink r:id="rId176">
-        <w:r>
-          <w:rPr>
-            <w:rStyle w:val="Hyperlink"/>
-          </w:rPr>
-          <w:t xml:space="preserve">Approximate accelerated stochastic simulation of chemically reacting systems</w:t>
+      <w:hyperlink r:id="rId178">
+        <w:r>
+          <w:rPr>
+            <w:rStyle w:val="Hyperlink"/>
+          </w:rPr>
+          <w:t xml:space="preserve">Exact stochastic simulation of coupled chemical reactions</w:t>
         </w:r>
       </w:hyperlink>
       <w:r>
@@ -11702,7 +11832,7 @@
           <w:i/>
           <w:iCs/>
         </w:rPr>
-        <w:t xml:space="preserve">The Journal of Chemical Physics</w:t>
+        <w:t xml:space="preserve">The Journal of Physical Chemistry</w:t>
       </w:r>
       <w:r>
         <w:t xml:space="preserve"> </w:t>
@@ -11712,20 +11842,20 @@
           <w:b/>
           <w:bCs/>
         </w:rPr>
-        <w:t xml:space="preserve">115</w:t>
-      </w:r>
-      <w:r>
-        <w:t xml:space="preserve">, 1716–1733 (2001).</w:t>
-      </w:r>
-    </w:p>
-    <w:bookmarkEnd w:id="177"/>
-    <w:bookmarkStart w:id="179" w:name="ref-cao2006"/>
+        <w:t xml:space="preserve">81</w:t>
+      </w:r>
+      <w:r>
+        <w:t xml:space="preserve">, 2340–2361 (1977).</w:t>
+      </w:r>
+    </w:p>
+    <w:bookmarkEnd w:id="179"/>
+    <w:bookmarkStart w:id="181" w:name="ref-gillespie2001"/>
     <w:p>
       <w:pPr>
         <w:pStyle w:val="Bibliography"/>
       </w:pPr>
       <w:r>
-        <w:t xml:space="preserve">57.</w:t>
+        <w:t xml:space="preserve">58.</w:t>
       </w:r>
       <w:r>
         <w:t xml:space="preserve"> </w:t>
@@ -11734,17 +11864,17 @@
         <w:t xml:space="preserve">	</w:t>
       </w:r>
       <w:r>
-        <w:t xml:space="preserve">Cao, Y., Gillespie, D. T. &amp; Petzold, L. R.</w:t>
-      </w:r>
-      <w:r>
-        <w:t xml:space="preserve"> </w:t>
-      </w:r>
-      <w:hyperlink r:id="rId178">
-        <w:r>
-          <w:rPr>
-            <w:rStyle w:val="Hyperlink"/>
-          </w:rPr>
-          <w:t xml:space="preserve">Efficient step size selection for the tau-leaping simulation method</w:t>
+        <w:t xml:space="preserve">Gillespie, D. T.</w:t>
+      </w:r>
+      <w:r>
+        <w:t xml:space="preserve"> </w:t>
+      </w:r>
+      <w:hyperlink r:id="rId180">
+        <w:r>
+          <w:rPr>
+            <w:rStyle w:val="Hyperlink"/>
+          </w:rPr>
+          <w:t xml:space="preserve">Approximate accelerated stochastic simulation of chemically reacting systems</w:t>
         </w:r>
       </w:hyperlink>
       <w:r>
@@ -11768,20 +11898,20 @@
           <w:b/>
           <w:bCs/>
         </w:rPr>
-        <w:t xml:space="preserve">124</w:t>
-      </w:r>
-      <w:r>
-        <w:t xml:space="preserve">, 044109 (2006).</w:t>
-      </w:r>
-    </w:p>
-    <w:bookmarkEnd w:id="179"/>
-    <w:bookmarkStart w:id="181" w:name="ref-cao2005"/>
+        <w:t xml:space="preserve">115</w:t>
+      </w:r>
+      <w:r>
+        <w:t xml:space="preserve">, 1716–1733 (2001).</w:t>
+      </w:r>
+    </w:p>
+    <w:bookmarkEnd w:id="181"/>
+    <w:bookmarkStart w:id="183" w:name="ref-cao2006"/>
     <w:p>
       <w:pPr>
         <w:pStyle w:val="Bibliography"/>
       </w:pPr>
       <w:r>
-        <w:t xml:space="preserve">58.</w:t>
+        <w:t xml:space="preserve">59.</w:t>
       </w:r>
       <w:r>
         <w:t xml:space="preserve"> </w:t>
@@ -11795,36 +11925,12 @@
       <w:r>
         <w:t xml:space="preserve"> </w:t>
       </w:r>
-      <w:hyperlink r:id="rId180">
-        <w:r>
-          <w:rPr>
-            <w:rStyle w:val="Hyperlink"/>
-          </w:rPr>
-          <w:t xml:space="preserve">Avoiding negative populations in explicit</w:t>
-        </w:r>
-        <w:r>
-          <w:rPr>
-            <w:rStyle w:val="Hyperlink"/>
-          </w:rPr>
-          <w:t xml:space="preserve"> </w:t>
-        </w:r>
-        <w:r>
-          <w:rPr>
-            <w:rStyle w:val="Hyperlink"/>
-          </w:rPr>
-          <w:t xml:space="preserve">Poisson</w:t>
-        </w:r>
-        <w:r>
-          <w:rPr>
-            <w:rStyle w:val="Hyperlink"/>
-          </w:rPr>
-          <w:t xml:space="preserve"> </w:t>
-        </w:r>
-        <w:r>
-          <w:rPr>
-            <w:rStyle w:val="Hyperlink"/>
-          </w:rPr>
-          <w:t xml:space="preserve">tau-leaping</w:t>
+      <w:hyperlink r:id="rId182">
+        <w:r>
+          <w:rPr>
+            <w:rStyle w:val="Hyperlink"/>
+          </w:rPr>
+          <w:t xml:space="preserve">Efficient step size selection for the tau-leaping simulation method</w:t>
         </w:r>
       </w:hyperlink>
       <w:r>
@@ -11848,20 +11954,20 @@
           <w:b/>
           <w:bCs/>
         </w:rPr>
-        <w:t xml:space="preserve">123</w:t>
-      </w:r>
-      <w:r>
-        <w:t xml:space="preserve">, 054104 (2005).</w:t>
-      </w:r>
-    </w:p>
-    <w:bookmarkEnd w:id="181"/>
-    <w:bookmarkStart w:id="183" w:name="ref-shaffer2020"/>
+        <w:t xml:space="preserve">124</w:t>
+      </w:r>
+      <w:r>
+        <w:t xml:space="preserve">, 044109 (2006).</w:t>
+      </w:r>
+    </w:p>
+    <w:bookmarkEnd w:id="183"/>
+    <w:bookmarkStart w:id="185" w:name="ref-cao2005"/>
     <w:p>
       <w:pPr>
         <w:pStyle w:val="Bibliography"/>
       </w:pPr>
       <w:r>
-        <w:t xml:space="preserve">59.</w:t>
+        <w:t xml:space="preserve">60.</w:t>
       </w:r>
       <w:r>
         <w:t xml:space="preserve"> </w:t>
@@ -11870,7 +11976,45 @@
         <w:t xml:space="preserve">	</w:t>
       </w:r>
       <w:r>
-        <w:t xml:space="preserve">Shaffer, S. M.</w:t>
+        <w:t xml:space="preserve">Cao, Y., Gillespie, D. T. &amp; Petzold, L. R.</w:t>
+      </w:r>
+      <w:r>
+        <w:t xml:space="preserve"> </w:t>
+      </w:r>
+      <w:hyperlink r:id="rId184">
+        <w:r>
+          <w:rPr>
+            <w:rStyle w:val="Hyperlink"/>
+          </w:rPr>
+          <w:t xml:space="preserve">Avoiding negative populations in explicit</w:t>
+        </w:r>
+        <w:r>
+          <w:rPr>
+            <w:rStyle w:val="Hyperlink"/>
+          </w:rPr>
+          <w:t xml:space="preserve"> </w:t>
+        </w:r>
+        <w:r>
+          <w:rPr>
+            <w:rStyle w:val="Hyperlink"/>
+          </w:rPr>
+          <w:t xml:space="preserve">Poisson</w:t>
+        </w:r>
+        <w:r>
+          <w:rPr>
+            <w:rStyle w:val="Hyperlink"/>
+          </w:rPr>
+          <w:t xml:space="preserve"> </w:t>
+        </w:r>
+        <w:r>
+          <w:rPr>
+            <w:rStyle w:val="Hyperlink"/>
+          </w:rPr>
+          <w:t xml:space="preserve">tau-leaping</w:t>
+        </w:r>
+      </w:hyperlink>
+      <w:r>
+        <w:t xml:space="preserve">.</w:t>
       </w:r>
       <w:r>
         <w:t xml:space="preserve"> </w:t>
@@ -11880,21 +12024,39 @@
           <w:i/>
           <w:iCs/>
         </w:rPr>
-        <w:t xml:space="preserve">et al.</w:t>
-      </w:r>
-      <w:r>
-        <w:t xml:space="preserve"> </w:t>
-      </w:r>
-      <w:hyperlink r:id="rId182">
-        <w:r>
-          <w:rPr>
-            <w:rStyle w:val="Hyperlink"/>
-          </w:rPr>
-          <w:t xml:space="preserve">Memory sequencing reveals heritable single-cell gene expression programs associated with distinct cellular behaviors</w:t>
-        </w:r>
-      </w:hyperlink>
-      <w:r>
-        <w:t xml:space="preserve">.</w:t>
+        <w:t xml:space="preserve">The Journal of Chemical Physics</w:t>
+      </w:r>
+      <w:r>
+        <w:t xml:space="preserve"> </w:t>
+      </w:r>
+      <w:r>
+        <w:rPr>
+          <w:b/>
+          <w:bCs/>
+        </w:rPr>
+        <w:t xml:space="preserve">123</w:t>
+      </w:r>
+      <w:r>
+        <w:t xml:space="preserve">, 054104 (2005).</w:t>
+      </w:r>
+    </w:p>
+    <w:bookmarkEnd w:id="185"/>
+    <w:bookmarkStart w:id="187" w:name="ref-shaffer2020"/>
+    <w:p>
+      <w:pPr>
+        <w:pStyle w:val="Bibliography"/>
+      </w:pPr>
+      <w:r>
+        <w:t xml:space="preserve">61.</w:t>
+      </w:r>
+      <w:r>
+        <w:t xml:space="preserve"> </w:t>
+      </w:r>
+      <w:r>
+        <w:t xml:space="preserve">	</w:t>
+      </w:r>
+      <w:r>
+        <w:t xml:space="preserve">Shaffer, S. M.</w:t>
       </w:r>
       <w:r>
         <w:t xml:space="preserve"> </w:t>
@@ -11904,6 +12066,30 @@
           <w:i/>
           <w:iCs/>
         </w:rPr>
+        <w:t xml:space="preserve">et al.</w:t>
+      </w:r>
+      <w:r>
+        <w:t xml:space="preserve"> </w:t>
+      </w:r>
+      <w:hyperlink r:id="rId186">
+        <w:r>
+          <w:rPr>
+            <w:rStyle w:val="Hyperlink"/>
+          </w:rPr>
+          <w:t xml:space="preserve">Memory sequencing reveals heritable single-cell gene expression programs associated with distinct cellular behaviors</w:t>
+        </w:r>
+      </w:hyperlink>
+      <w:r>
+        <w:t xml:space="preserve">.</w:t>
+      </w:r>
+      <w:r>
+        <w:t xml:space="preserve"> </w:t>
+      </w:r>
+      <w:r>
+        <w:rPr>
+          <w:i/>
+          <w:iCs/>
+        </w:rPr>
         <w:t xml:space="preserve">Cell</w:t>
       </w:r>
       <w:r>
@@ -11920,14 +12106,14 @@
         <w:t xml:space="preserve">, 947–959 (2020).</w:t>
       </w:r>
     </w:p>
-    <w:bookmarkEnd w:id="183"/>
-    <w:bookmarkStart w:id="185" w:name="ref-toni2009"/>
+    <w:bookmarkEnd w:id="187"/>
+    <w:bookmarkStart w:id="189" w:name="ref-toni2009"/>
     <w:p>
       <w:pPr>
         <w:pStyle w:val="Bibliography"/>
       </w:pPr>
       <w:r>
-        <w:t xml:space="preserve">60.</w:t>
+        <w:t xml:space="preserve">62.</w:t>
       </w:r>
       <w:r>
         <w:t xml:space="preserve"> </w:t>
@@ -11941,7 +12127,7 @@
       <w:r>
         <w:t xml:space="preserve"> </w:t>
       </w:r>
-      <w:hyperlink r:id="rId184">
+      <w:hyperlink r:id="rId188">
         <w:r>
           <w:rPr>
             <w:rStyle w:val="Hyperlink"/>
@@ -12000,14 +12186,14 @@
         <w:t xml:space="preserve">, 187–202 (2009).</w:t>
       </w:r>
     </w:p>
-    <w:bookmarkEnd w:id="185"/>
-    <w:bookmarkStart w:id="187" w:name="ref-ellingson2016"/>
+    <w:bookmarkEnd w:id="189"/>
+    <w:bookmarkStart w:id="191" w:name="ref-ellingson2016"/>
     <w:p>
       <w:pPr>
         <w:pStyle w:val="Bibliography"/>
       </w:pPr>
       <w:r>
-        <w:t xml:space="preserve">61.</w:t>
+        <w:t xml:space="preserve">63.</w:t>
       </w:r>
       <w:r>
         <w:t xml:space="preserve"> </w:t>
@@ -12031,7 +12217,7 @@
       <w:r>
         <w:t xml:space="preserve"> </w:t>
       </w:r>
-      <w:hyperlink r:id="rId186">
+      <w:hyperlink r:id="rId190">
         <w:r>
           <w:rPr>
             <w:rStyle w:val="Hyperlink"/>
@@ -12066,14 +12252,14 @@
         <w:t xml:space="preserve">, 1718–1727 (2016).</w:t>
       </w:r>
     </w:p>
-    <w:bookmarkEnd w:id="187"/>
-    <w:bookmarkStart w:id="189" w:name="ref-stensjoen2015"/>
+    <w:bookmarkEnd w:id="191"/>
+    <w:bookmarkStart w:id="193" w:name="ref-stensjoen2015"/>
     <w:p>
       <w:pPr>
         <w:pStyle w:val="Bibliography"/>
       </w:pPr>
       <w:r>
-        <w:t xml:space="preserve">62.</w:t>
+        <w:t xml:space="preserve">64.</w:t>
       </w:r>
       <w:r>
         <w:t xml:space="preserve"> </w:t>
@@ -12097,7 +12283,7 @@
       <w:r>
         <w:t xml:space="preserve"> </w:t>
       </w:r>
-      <w:hyperlink r:id="rId188">
+      <w:hyperlink r:id="rId192">
         <w:r>
           <w:rPr>
             <w:rStyle w:val="Hyperlink"/>
@@ -12132,14 +12318,14 @@
         <w:t xml:space="preserve">, 1402–1411 (2015).</w:t>
       </w:r>
     </w:p>
-    <w:bookmarkEnd w:id="189"/>
-    <w:bookmarkStart w:id="191" w:name="ref-friedman2006"/>
+    <w:bookmarkEnd w:id="193"/>
+    <w:bookmarkStart w:id="195" w:name="ref-friedman2006"/>
     <w:p>
       <w:pPr>
         <w:pStyle w:val="Bibliography"/>
       </w:pPr>
       <w:r>
-        <w:t xml:space="preserve">63.</w:t>
+        <w:t xml:space="preserve">65.</w:t>
       </w:r>
       <w:r>
         <w:t xml:space="preserve"> </w:t>
@@ -12153,7 +12339,7 @@
       <w:r>
         <w:t xml:space="preserve"> </w:t>
       </w:r>
-      <w:hyperlink r:id="rId190">
+      <w:hyperlink r:id="rId194">
         <w:r>
           <w:rPr>
             <w:rStyle w:val="Hyperlink"/>
@@ -12188,14 +12374,14 @@
         <w:t xml:space="preserve">, 168302 (2006).</w:t>
       </w:r>
     </w:p>
-    <w:bookmarkEnd w:id="191"/>
-    <w:bookmarkStart w:id="193" w:name="ref-shahrezaei2008"/>
+    <w:bookmarkEnd w:id="195"/>
+    <w:bookmarkStart w:id="197" w:name="ref-shahrezaei2008"/>
     <w:p>
       <w:pPr>
         <w:pStyle w:val="Bibliography"/>
       </w:pPr>
       <w:r>
-        <w:t xml:space="preserve">64.</w:t>
+        <w:t xml:space="preserve">66.</w:t>
       </w:r>
       <w:r>
         <w:t xml:space="preserve"> </w:t>
@@ -12209,7 +12395,7 @@
       <w:r>
         <w:t xml:space="preserve"> </w:t>
       </w:r>
-      <w:hyperlink r:id="rId192">
+      <w:hyperlink r:id="rId196">
         <w:r>
           <w:rPr>
             <w:rStyle w:val="Hyperlink"/>
@@ -12244,14 +12430,14 @@
         <w:t xml:space="preserve">, 17256–17261 (2008).</w:t>
       </w:r>
     </w:p>
-    <w:bookmarkEnd w:id="193"/>
-    <w:bookmarkStart w:id="195" w:name="ref-sciml"/>
+    <w:bookmarkEnd w:id="197"/>
+    <w:bookmarkStart w:id="199" w:name="ref-sciml"/>
     <w:p>
       <w:pPr>
         <w:pStyle w:val="Bibliography"/>
       </w:pPr>
       <w:r>
-        <w:t xml:space="preserve">65.</w:t>
+        <w:t xml:space="preserve">67.</w:t>
       </w:r>
       <w:r>
         <w:t xml:space="preserve"> </w:t>
@@ -12265,7 +12451,7 @@
       <w:r>
         <w:t xml:space="preserve"> </w:t>
       </w:r>
-      <w:hyperlink r:id="rId194">
+      <w:hyperlink r:id="rId198">
         <w:r>
           <w:rPr>
             <w:rStyle w:val="Hyperlink"/>
@@ -12317,14 +12503,14 @@
         <w:t xml:space="preserve">vol. 5 15 (2017).</w:t>
       </w:r>
     </w:p>
-    <w:bookmarkEnd w:id="195"/>
-    <w:bookmarkStart w:id="197" w:name="ref-huh2011"/>
+    <w:bookmarkEnd w:id="199"/>
+    <w:bookmarkStart w:id="201" w:name="ref-huh2011"/>
     <w:p>
       <w:pPr>
         <w:pStyle w:val="Bibliography"/>
       </w:pPr>
       <w:r>
-        <w:t xml:space="preserve">66.</w:t>
+        <w:t xml:space="preserve">68.</w:t>
       </w:r>
       <w:r>
         <w:t xml:space="preserve"> </w:t>
@@ -12338,7 +12524,7 @@
       <w:r>
         <w:t xml:space="preserve"> </w:t>
       </w:r>
-      <w:hyperlink r:id="rId196">
+      <w:hyperlink r:id="rId200">
         <w:r>
           <w:rPr>
             <w:rStyle w:val="Hyperlink"/>
@@ -12373,14 +12559,14 @@
         <w:t xml:space="preserve">, 95–100 (2011).</w:t>
       </w:r>
     </w:p>
-    <w:bookmarkEnd w:id="197"/>
-    <w:bookmarkStart w:id="199" w:name="ref-huynhthu2010"/>
+    <w:bookmarkEnd w:id="201"/>
+    <w:bookmarkStart w:id="203" w:name="ref-huynhthu2010"/>
     <w:p>
       <w:pPr>
         <w:pStyle w:val="Bibliography"/>
       </w:pPr>
       <w:r>
-        <w:t xml:space="preserve">67.</w:t>
+        <w:t xml:space="preserve">69.</w:t>
       </w:r>
       <w:r>
         <w:t xml:space="preserve"> </w:t>
@@ -12394,7 +12580,7 @@
       <w:r>
         <w:t xml:space="preserve"> </w:t>
       </w:r>
-      <w:hyperlink r:id="rId198">
+      <w:hyperlink r:id="rId202">
         <w:r>
           <w:rPr>
             <w:rStyle w:val="Hyperlink"/>
@@ -12429,14 +12615,14 @@
         <w:t xml:space="preserve">, e12776 (2010).</w:t>
       </w:r>
     </w:p>
-    <w:bookmarkEnd w:id="199"/>
-    <w:bookmarkStart w:id="201" w:name="ref-vandijk2018"/>
+    <w:bookmarkEnd w:id="203"/>
+    <w:bookmarkStart w:id="205" w:name="ref-vandijk2018"/>
     <w:p>
       <w:pPr>
         <w:pStyle w:val="Bibliography"/>
       </w:pPr>
       <w:r>
-        <w:t xml:space="preserve">68.</w:t>
+        <w:t xml:space="preserve">70.</w:t>
       </w:r>
       <w:r>
         <w:t xml:space="preserve"> </w:t>
@@ -12460,7 +12646,7 @@
       <w:r>
         <w:t xml:space="preserve"> </w:t>
       </w:r>
-      <w:hyperlink r:id="rId200">
+      <w:hyperlink r:id="rId204">
         <w:r>
           <w:rPr>
             <w:rStyle w:val="Hyperlink"/>
@@ -12495,14 +12681,14 @@
         <w:t xml:space="preserve">, 716–729 (2018).</w:t>
       </w:r>
     </w:p>
-    <w:bookmarkEnd w:id="201"/>
-    <w:bookmarkStart w:id="203" w:name="ref-wagner2018"/>
+    <w:bookmarkEnd w:id="205"/>
+    <w:bookmarkStart w:id="207" w:name="ref-wagner2018"/>
     <w:p>
       <w:pPr>
         <w:pStyle w:val="Bibliography"/>
       </w:pPr>
       <w:r>
-        <w:t xml:space="preserve">69.</w:t>
+        <w:t xml:space="preserve">71.</w:t>
       </w:r>
       <w:r>
         <w:t xml:space="preserve"> </w:t>
@@ -12538,7 +12724,7 @@
       <w:r>
         <w:t xml:space="preserve"> </w:t>
       </w:r>
-      <w:hyperlink r:id="rId202">
+      <w:hyperlink r:id="rId206">
         <w:r>
           <w:rPr>
             <w:rStyle w:val="Hyperlink"/>
@@ -12552,7 +12738,7 @@
       <w:r>
         <w:t xml:space="preserve">(2018) doi:</w:t>
       </w:r>
-      <w:hyperlink r:id="rId202">
+      <w:hyperlink r:id="rId206">
         <w:r>
           <w:rPr>
             <w:rStyle w:val="Hyperlink"/>
@@ -12564,9 +12750,9 @@
         <w:t xml:space="preserve">.</w:t>
       </w:r>
     </w:p>
-    <w:bookmarkEnd w:id="203"/>
-    <w:bookmarkEnd w:id="204"/>
-    <w:bookmarkEnd w:id="205"/>
+    <w:bookmarkEnd w:id="207"/>
+    <w:bookmarkEnd w:id="208"/>
+    <w:bookmarkEnd w:id="209"/>
     <w:sectPr>
       <w:footnotePr>
         <w:numRestart w:val="eachSect"/>

</xml_diff>

<commit_message>
Cite the Zenodo archive in the availability statements
Version 2.0.0 is tagged, released and deposited, so the archive sentence that was
deliberately held back can now be made true. Data availability and Code availability both
name the concept DOI, which resolves to the current release rather than to this one
version, so a reader following the published Article reaches the software as it stands
rather than a frozen leaf. The repository gains a DOI badge beside the CI and coverage
ones, and CITATION.cff records the same identifier so the archive is discoverable from
the repository without reading the paper.

The response document previously told the referee that no Zenodo DOI was claimed
anywhere, which was accurate when written and is not now; it is updated rather than left
to contradict the manuscript in front of the same reader.

Co-Authored-By: Claude Opus 5 <noreply@anthropic.com>
Claude-Session: https://claude.ai/code/session_01PjfG7i2deAXT3znmpkGkmY
</commit_message>
<xml_diff>
--- a/paper/manuscript/manuscript.docx
+++ b/paper/manuscript/manuscript.docx
@@ -4587,7 +4587,7 @@
       </w:r>
     </w:p>
     <w:bookmarkEnd w:id="30"/>
-    <w:bookmarkStart w:id="48" w:name="methods"/>
+    <w:bookmarkStart w:id="49" w:name="methods"/>
     <w:p>
       <w:pPr>
         <w:pStyle w:val="Heading1"/>
@@ -7779,11 +7779,11 @@
         <w:t xml:space="preserve"> </w:t>
       </w:r>
       <w:r>
-        <w:t xml:space="preserve">directory of that repository, so those scripts rather than a deposited table are the primary record.</w:t>
+        <w:t xml:space="preserve">directory of that repository, so those scripts rather than a deposited table are the primary record. The archived release carries them (10.5281/zenodo.22894286).</w:t>
       </w:r>
     </w:p>
     <w:bookmarkEnd w:id="45"/>
-    <w:bookmarkStart w:id="46" w:name="code-availability"/>
+    <w:bookmarkStart w:id="47" w:name="code-availability"/>
     <w:p>
       <w:pPr>
         <w:pStyle w:val="Heading2"/>
@@ -7974,11 +7974,25 @@
         <w:t xml:space="preserve">paper/README.md</w:t>
       </w:r>
       <w:r>
-        <w:t xml:space="preserve">.</w:t>
-      </w:r>
-    </w:p>
-    <w:bookmarkEnd w:id="46"/>
-    <w:bookmarkStart w:id="47" w:name="software"/>
+        <w:t xml:space="preserve">. Version 2.0.0, the version used for every result in this Article, is archived at Zenodo under the concept DOI</w:t>
+      </w:r>
+      <w:r>
+        <w:t xml:space="preserve"> </w:t>
+      </w:r>
+      <w:hyperlink r:id="rId46">
+        <w:r>
+          <w:rPr>
+            <w:rStyle w:val="Hyperlink"/>
+          </w:rPr>
+          <w:t xml:space="preserve">10.5281/zenodo.22894286</w:t>
+        </w:r>
+      </w:hyperlink>
+      <w:r>
+        <w:t xml:space="preserve">, which resolves to the current release.</w:t>
+      </w:r>
+    </w:p>
+    <w:bookmarkEnd w:id="47"/>
+    <w:bookmarkStart w:id="48" w:name="software"/>
     <w:p>
       <w:pPr>
         <w:pStyle w:val="Heading2"/>
@@ -8025,9 +8039,9 @@
         <w:t xml:space="preserve">. The test suite (Aqua quality checks and statistical tests) runs under GitHub Actions on Julia 1.10 and the latest release.</w:t>
       </w:r>
     </w:p>
-    <w:bookmarkEnd w:id="47"/>
     <w:bookmarkEnd w:id="48"/>
-    <w:bookmarkStart w:id="73" w:name="figure-legends"/>
+    <w:bookmarkEnd w:id="49"/>
+    <w:bookmarkStart w:id="74" w:name="figure-legends"/>
     <w:p>
       <w:pPr>
         <w:pStyle w:val="Heading1"/>
@@ -8045,18 +8059,18 @@
           <wp:inline>
             <wp:extent cx="5334000" cy="3630083"/>
             <wp:effectExtent b="0" l="0" r="0" t="0"/>
-            <wp:docPr descr="" title="" id="50" name="Picture"/>
+            <wp:docPr descr="" title="" id="51" name="Picture"/>
             <a:graphic>
               <a:graphicData uri="http://schemas.openxmlformats.org/drawingml/2006/picture">
                 <pic:pic>
                   <pic:nvPicPr>
-                    <pic:cNvPr descr="fig1_framework.png" id="51" name="Picture"/>
+                    <pic:cNvPr descr="fig1_framework.png" id="52" name="Picture"/>
                     <pic:cNvPicPr>
                       <a:picLocks noChangeArrowheads="1" noChangeAspect="1"/>
                     </pic:cNvPicPr>
                   </pic:nvPicPr>
                   <pic:blipFill>
-                    <a:blip r:embed="rId49"/>
+                    <a:blip r:embed="rId50"/>
                     <a:stretch>
                       <a:fillRect/>
                     </a:stretch>
@@ -8169,18 +8183,18 @@
           <wp:inline>
             <wp:extent cx="5334000" cy="3445617"/>
             <wp:effectExtent b="0" l="0" r="0" t="0"/>
-            <wp:docPr descr="" title="" id="53" name="Picture"/>
+            <wp:docPr descr="" title="" id="54" name="Picture"/>
             <a:graphic>
               <a:graphicData uri="http://schemas.openxmlformats.org/drawingml/2006/picture">
                 <pic:pic>
                   <pic:nvPicPr>
-                    <pic:cNvPr descr="fig2_engine.png" id="54" name="Picture"/>
+                    <pic:cNvPr descr="fig2_engine.png" id="55" name="Picture"/>
                     <pic:cNvPicPr>
                       <a:picLocks noChangeArrowheads="1" noChangeAspect="1"/>
                     </pic:cNvPicPr>
                   </pic:nvPicPr>
                   <pic:blipFill>
-                    <a:blip r:embed="rId52"/>
+                    <a:blip r:embed="rId53"/>
                     <a:stretch>
                       <a:fillRect/>
                     </a:stretch>
@@ -8306,18 +8320,18 @@
           <wp:inline>
             <wp:extent cx="5334000" cy="3978002"/>
             <wp:effectExtent b="0" l="0" r="0" t="0"/>
-            <wp:docPr descr="" title="" id="56" name="Picture"/>
+            <wp:docPr descr="" title="" id="57" name="Picture"/>
             <a:graphic>
               <a:graphicData uri="http://schemas.openxmlformats.org/drawingml/2006/picture">
                 <pic:pic>
                   <pic:nvPicPr>
-                    <pic:cNvPr descr="fig3_growth.png" id="57" name="Picture"/>
+                    <pic:cNvPr descr="fig3_growth.png" id="58" name="Picture"/>
                     <pic:cNvPicPr>
                       <a:picLocks noChangeArrowheads="1" noChangeAspect="1"/>
                     </pic:cNvPicPr>
                   </pic:nvPicPr>
                   <pic:blipFill>
-                    <a:blip r:embed="rId55"/>
+                    <a:blip r:embed="rId56"/>
                     <a:stretch>
                       <a:fillRect/>
                     </a:stretch>
@@ -8615,18 +8629,18 @@
           <wp:inline>
             <wp:extent cx="5334000" cy="4961953"/>
             <wp:effectExtent b="0" l="0" r="0" t="0"/>
-            <wp:docPr descr="" title="" id="59" name="Picture"/>
+            <wp:docPr descr="" title="" id="60" name="Picture"/>
             <a:graphic>
               <a:graphicData uri="http://schemas.openxmlformats.org/drawingml/2006/picture">
                 <pic:pic>
                   <pic:nvPicPr>
-                    <pic:cNvPr descr="fig4_persisters.png" id="60" name="Picture"/>
+                    <pic:cNvPr descr="fig4_persisters.png" id="61" name="Picture"/>
                     <pic:cNvPicPr>
                       <a:picLocks noChangeArrowheads="1" noChangeAspect="1"/>
                     </pic:cNvPicPr>
                   </pic:nvPicPr>
                   <pic:blipFill>
-                    <a:blip r:embed="rId58"/>
+                    <a:blip r:embed="rId59"/>
                     <a:stretch>
                       <a:fillRect/>
                     </a:stretch>
@@ -8778,18 +8792,18 @@
           <wp:inline>
             <wp:extent cx="5334000" cy="3878106"/>
             <wp:effectExtent b="0" l="0" r="0" t="0"/>
-            <wp:docPr descr="" title="" id="62" name="Picture"/>
+            <wp:docPr descr="" title="" id="63" name="Picture"/>
             <a:graphic>
               <a:graphicData uri="http://schemas.openxmlformats.org/drawingml/2006/picture">
                 <pic:pic>
                   <pic:nvPicPr>
-                    <pic:cNvPr descr="fig5_benchmarks.png" id="63" name="Picture"/>
+                    <pic:cNvPr descr="fig5_benchmarks.png" id="64" name="Picture"/>
                     <pic:cNvPicPr>
                       <a:picLocks noChangeArrowheads="1" noChangeAspect="1"/>
                     </pic:cNvPicPr>
                   </pic:nvPicPr>
                   <pic:blipFill>
-                    <a:blip r:embed="rId61"/>
+                    <a:blip r:embed="rId62"/>
                     <a:stretch>
                       <a:fillRect/>
                     </a:stretch>
@@ -8889,18 +8903,18 @@
           <wp:inline>
             <wp:extent cx="5334000" cy="5177809"/>
             <wp:effectExtent b="0" l="0" r="0" t="0"/>
-            <wp:docPr descr="" title="" id="65" name="Picture"/>
+            <wp:docPr descr="" title="" id="66" name="Picture"/>
             <a:graphic>
               <a:graphicData uri="http://schemas.openxmlformats.org/drawingml/2006/picture">
                 <pic:pic>
                   <pic:nvPicPr>
-                    <pic:cNvPr descr="fig6_inference.png" id="66" name="Picture"/>
+                    <pic:cNvPr descr="fig6_inference.png" id="67" name="Picture"/>
                     <pic:cNvPicPr>
                       <a:picLocks noChangeArrowheads="1" noChangeAspect="1"/>
                     </pic:cNvPicPr>
                   </pic:nvPicPr>
                   <pic:blipFill>
-                    <a:blip r:embed="rId64"/>
+                    <a:blip r:embed="rId65"/>
                     <a:stretch>
                       <a:fillRect/>
                     </a:stretch>
@@ -9000,18 +9014,18 @@
           <wp:inline>
             <wp:extent cx="5334000" cy="4292236"/>
             <wp:effectExtent b="0" l="0" r="0" t="0"/>
-            <wp:docPr descr="" title="" id="68" name="Picture"/>
+            <wp:docPr descr="" title="" id="69" name="Picture"/>
             <a:graphic>
               <a:graphicData uri="http://schemas.openxmlformats.org/drawingml/2006/picture">
                 <pic:pic>
                   <pic:nvPicPr>
-                    <pic:cNvPr descr="fig7_calibration.png" id="69" name="Picture"/>
+                    <pic:cNvPr descr="fig7_calibration.png" id="70" name="Picture"/>
                     <pic:cNvPicPr>
                       <a:picLocks noChangeArrowheads="1" noChangeAspect="1"/>
                     </pic:cNvPicPr>
                   </pic:nvPicPr>
                   <pic:blipFill>
-                    <a:blip r:embed="rId67"/>
+                    <a:blip r:embed="rId68"/>
                     <a:stretch>
                       <a:fillRect/>
                     </a:stretch>
@@ -9158,18 +9172,18 @@
           <wp:inline>
             <wp:extent cx="5334000" cy="5521735"/>
             <wp:effectExtent b="0" l="0" r="0" t="0"/>
-            <wp:docPr descr="" title="" id="71" name="Picture"/>
+            <wp:docPr descr="" title="" id="72" name="Picture"/>
             <a:graphic>
               <a:graphicData uri="http://schemas.openxmlformats.org/drawingml/2006/picture">
                 <pic:pic>
                   <pic:nvPicPr>
-                    <pic:cNvPr descr="fig8_schedules.png" id="72" name="Picture"/>
+                    <pic:cNvPr descr="fig8_schedules.png" id="73" name="Picture"/>
                     <pic:cNvPicPr>
                       <a:picLocks noChangeArrowheads="1" noChangeAspect="1"/>
                     </pic:cNvPicPr>
                   </pic:nvPicPr>
                   <pic:blipFill>
-                    <a:blip r:embed="rId70"/>
+                    <a:blip r:embed="rId71"/>
                     <a:stretch>
                       <a:fillRect/>
                     </a:stretch>
@@ -9326,8 +9340,8 @@
         <w:t xml:space="preserve">, Final population size against the number of dosing days per 28-day cycle at the standard cumulative dose.</w:t>
       </w:r>
     </w:p>
-    <w:bookmarkEnd w:id="73"/>
-    <w:bookmarkStart w:id="74" w:name="acknowledgements"/>
+    <w:bookmarkEnd w:id="74"/>
+    <w:bookmarkStart w:id="75" w:name="acknowledgements"/>
     <w:p>
       <w:pPr>
         <w:pStyle w:val="Heading1"/>
@@ -9353,8 +9367,8 @@
         <w:t xml:space="preserve">. This Article and version 2.0 of the software were authored with Claude (Anthropic), a large language model, under the direction and supervision of the author; what the model did and what the author verified independently are set out in the Methods, under Use of artificial intelligence.</w:t>
       </w:r>
     </w:p>
-    <w:bookmarkEnd w:id="74"/>
-    <w:bookmarkStart w:id="75" w:name="author-contributions"/>
+    <w:bookmarkEnd w:id="75"/>
+    <w:bookmarkStart w:id="76" w:name="author-contributions"/>
     <w:p>
       <w:pPr>
         <w:pStyle w:val="Heading1"/>
@@ -9371,8 +9385,8 @@
         <w:t xml:space="preserve">A.L. conceived the study, defined its scope, the validation strategy and the case studies, supervised the work, verified all numerical results and biological interpretations against their sources, and wrote the final version of the manuscript. The implementation of the software, the simulations, the analyses, the figures and the first draft of the manuscript were produced with Claude (Anthropic) under the author’s direction, as described in the Methods. Claude is not an author and no display item was produced by a generative model.</w:t>
       </w:r>
     </w:p>
-    <w:bookmarkEnd w:id="75"/>
-    <w:bookmarkStart w:id="76" w:name="competing-interests"/>
+    <w:bookmarkEnd w:id="76"/>
+    <w:bookmarkStart w:id="77" w:name="competing-interests"/>
     <w:p>
       <w:pPr>
         <w:pStyle w:val="Heading1"/>
@@ -9389,8 +9403,8 @@
         <w:t xml:space="preserve">The author declares no competing interests.</w:t>
       </w:r>
     </w:p>
-    <w:bookmarkEnd w:id="76"/>
-    <w:bookmarkStart w:id="77" w:name="additional-information"/>
+    <w:bookmarkEnd w:id="77"/>
+    <w:bookmarkStart w:id="78" w:name="additional-information"/>
     <w:p>
       <w:pPr>
         <w:pStyle w:val="Heading1"/>
@@ -9417,8 +9431,8 @@
         <w:t xml:space="preserve">accompanies this Article. Correspondence and requests for materials should be addressed to A.L.</w:t>
       </w:r>
     </w:p>
-    <w:bookmarkEnd w:id="77"/>
-    <w:bookmarkStart w:id="221" w:name="references"/>
+    <w:bookmarkEnd w:id="78"/>
+    <w:bookmarkStart w:id="222" w:name="references"/>
     <w:p>
       <w:pPr>
         <w:pStyle w:val="Heading1"/>
@@ -9427,8 +9441,8 @@
         <w:t xml:space="preserve">References</w:t>
       </w:r>
     </w:p>
-    <w:bookmarkStart w:id="220" w:name="refs"/>
-    <w:bookmarkStart w:id="79" w:name="ref-sharma2010"/>
+    <w:bookmarkStart w:id="221" w:name="refs"/>
+    <w:bookmarkStart w:id="80" w:name="ref-sharma2010"/>
     <w:p>
       <w:pPr>
         <w:pStyle w:val="Bibliography"/>
@@ -9445,7 +9459,7 @@
       <w:r>
         <w:t xml:space="preserve">Sharma SV, Lee DY, Li B, Quinlan MP, Takahashi F, Maheswaran S, et al. A chromatin-mediated reversible drug-tolerant state in cancer cell subpopulations. Cell. 2010;141: 69–80. doi:</w:t>
       </w:r>
-      <w:hyperlink r:id="rId78">
+      <w:hyperlink r:id="rId79">
         <w:r>
           <w:rPr>
             <w:rStyle w:val="Hyperlink"/>
@@ -9454,8 +9468,8 @@
         </w:r>
       </w:hyperlink>
     </w:p>
-    <w:bookmarkEnd w:id="79"/>
-    <w:bookmarkStart w:id="81" w:name="ref-shaffer2017"/>
+    <w:bookmarkEnd w:id="80"/>
+    <w:bookmarkStart w:id="82" w:name="ref-shaffer2017"/>
     <w:p>
       <w:pPr>
         <w:pStyle w:val="Bibliography"/>
@@ -9472,7 +9486,7 @@
       <w:r>
         <w:t xml:space="preserve">Shaffer SM, Dunagin MC, Torborg SR, Torre EA, Emert B, Krepler C, et al. Rare cell variability and drug-induced reprogramming as a mode of cancer drug resistance. Nature. 2017;546: 431–435. doi:</w:t>
       </w:r>
-      <w:hyperlink r:id="rId80">
+      <w:hyperlink r:id="rId81">
         <w:r>
           <w:rPr>
             <w:rStyle w:val="Hyperlink"/>
@@ -9481,8 +9495,8 @@
         </w:r>
       </w:hyperlink>
     </w:p>
-    <w:bookmarkEnd w:id="81"/>
-    <w:bookmarkStart w:id="83" w:name="ref-hata2016"/>
+    <w:bookmarkEnd w:id="82"/>
+    <w:bookmarkStart w:id="84" w:name="ref-hata2016"/>
     <w:p>
       <w:pPr>
         <w:pStyle w:val="Bibliography"/>
@@ -9499,7 +9513,7 @@
       <w:r>
         <w:t xml:space="preserve">Hata AN, Niederst MJ, Archibald HL, Gomez-Caraballo M, Siddiqui FM, Mulvey HE, et al. Tumor cells can follow distinct evolutionary paths to become resistant to epidermal growth factor receptor inhibition. Nature Medicine. 2016;22: 262–269. doi:</w:t>
       </w:r>
-      <w:hyperlink r:id="rId82">
+      <w:hyperlink r:id="rId83">
         <w:r>
           <w:rPr>
             <w:rStyle w:val="Hyperlink"/>
@@ -9508,8 +9522,8 @@
         </w:r>
       </w:hyperlink>
     </w:p>
-    <w:bookmarkEnd w:id="83"/>
-    <w:bookmarkStart w:id="85" w:name="ref-oren2021"/>
+    <w:bookmarkEnd w:id="84"/>
+    <w:bookmarkStart w:id="86" w:name="ref-oren2021"/>
     <w:p>
       <w:pPr>
         <w:pStyle w:val="Bibliography"/>
@@ -9526,7 +9540,7 @@
       <w:r>
         <w:t xml:space="preserve">Oren Y, Tsabar M, Cuoco MS, Amir-Zilberstein L, Cabanos HF, Hütter J-C, et al. Cycling cancer persister cells arise from lineages with distinct programs. Nature. 2021;596: 576–582. doi:</w:t>
       </w:r>
-      <w:hyperlink r:id="rId84">
+      <w:hyperlink r:id="rId85">
         <w:r>
           <w:rPr>
             <w:rStyle w:val="Hyperlink"/>
@@ -9535,8 +9549,8 @@
         </w:r>
       </w:hyperlink>
     </w:p>
-    <w:bookmarkEnd w:id="85"/>
-    <w:bookmarkStart w:id="87" w:name="ref-franca2024"/>
+    <w:bookmarkEnd w:id="86"/>
+    <w:bookmarkStart w:id="88" w:name="ref-franca2024"/>
     <w:p>
       <w:pPr>
         <w:pStyle w:val="Bibliography"/>
@@ -9553,7 +9567,7 @@
       <w:r>
         <w:t xml:space="preserve">França GS, Baron M, King BR, Bossowski JP, Bjornberg A, Pour M, et al. Cellular adaptation to cancer therapy along a resistance continuum. Nature. 2024;631: 876–883. doi:</w:t>
       </w:r>
-      <w:hyperlink r:id="rId86">
+      <w:hyperlink r:id="rId87">
         <w:r>
           <w:rPr>
             <w:rStyle w:val="Hyperlink"/>
@@ -9562,8 +9576,8 @@
         </w:r>
       </w:hyperlink>
     </w:p>
-    <w:bookmarkEnd w:id="87"/>
-    <w:bookmarkStart w:id="89" w:name="ref-iyer2025"/>
+    <w:bookmarkEnd w:id="88"/>
+    <w:bookmarkStart w:id="90" w:name="ref-iyer2025"/>
     <w:p>
       <w:pPr>
         <w:pStyle w:val="Bibliography"/>
@@ -9580,7 +9594,7 @@
       <w:r>
         <w:t xml:space="preserve">Iyer A, Alva A, Granada AE, Chakrabarti S. Inheritable cell-states shape drug-persister correlations and population dynamics in cancer cells. PLoS Computational Biology. 2025;21: e1013446. doi:</w:t>
       </w:r>
-      <w:hyperlink r:id="rId88">
+      <w:hyperlink r:id="rId89">
         <w:r>
           <w:rPr>
             <w:rStyle w:val="Hyperlink"/>
@@ -9589,8 +9603,8 @@
         </w:r>
       </w:hyperlink>
     </w:p>
-    <w:bookmarkEnd w:id="89"/>
-    <w:bookmarkStart w:id="91" w:name="ref-lin2025memory"/>
+    <w:bookmarkEnd w:id="90"/>
+    <w:bookmarkStart w:id="92" w:name="ref-lin2025memory"/>
     <w:p>
       <w:pPr>
         <w:pStyle w:val="Bibliography"/>
@@ -9607,7 +9621,7 @@
       <w:r>
         <w:t xml:space="preserve">Lin Y, Chen X, Wu L, Zhou Y, Lin Y. Widespread transcriptional memory shapes heritable states and functional heterogeneity in cancer and stem cells. Cell Systems. 2026;17: 101621. doi:</w:t>
       </w:r>
-      <w:hyperlink r:id="rId90">
+      <w:hyperlink r:id="rId91">
         <w:r>
           <w:rPr>
             <w:rStyle w:val="Hyperlink"/>
@@ -9616,8 +9630,8 @@
         </w:r>
       </w:hyperlink>
     </w:p>
-    <w:bookmarkEnd w:id="91"/>
-    <w:bookmarkStart w:id="93" w:name="ref-ghosh2025powerseek"/>
+    <w:bookmarkEnd w:id="92"/>
+    <w:bookmarkStart w:id="94" w:name="ref-ghosh2025powerseek"/>
     <w:p>
       <w:pPr>
         <w:pStyle w:val="Bibliography"/>
@@ -9646,7 +9660,7 @@
       <w:r>
         <w:t xml:space="preserve">data using power law signatures. bioRxiv. 2025. doi:</w:t>
       </w:r>
-      <w:hyperlink r:id="rId92">
+      <w:hyperlink r:id="rId93">
         <w:r>
           <w:rPr>
             <w:rStyle w:val="Hyperlink"/>
@@ -9655,8 +9669,8 @@
         </w:r>
       </w:hyperlink>
     </w:p>
-    <w:bookmarkEnd w:id="93"/>
-    <w:bookmarkStart w:id="95" w:name="ref-harmange2023"/>
+    <w:bookmarkEnd w:id="94"/>
+    <w:bookmarkStart w:id="96" w:name="ref-harmange2023"/>
     <w:p>
       <w:pPr>
         <w:pStyle w:val="Bibliography"/>
@@ -9673,7 +9687,7 @@
       <w:r>
         <w:t xml:space="preserve">Harmange G, Hueros RAR, Schaff DL, Emert B, Saint-Antoine M, Kim LC, et al. Disrupting cellular memory to overcome drug resistance. Nature Communications. 2023;14: 7130. doi:</w:t>
       </w:r>
-      <w:hyperlink r:id="rId94">
+      <w:hyperlink r:id="rId95">
         <w:r>
           <w:rPr>
             <w:rStyle w:val="Hyperlink"/>
@@ -9682,8 +9696,8 @@
         </w:r>
       </w:hyperlink>
     </w:p>
-    <w:bookmarkEnd w:id="95"/>
-    <w:bookmarkStart w:id="97" w:name="ref-sukys2025"/>
+    <w:bookmarkEnd w:id="96"/>
+    <w:bookmarkStart w:id="98" w:name="ref-sukys2025"/>
     <w:p>
       <w:pPr>
         <w:pStyle w:val="Bibliography"/>
@@ -9712,7 +9726,7 @@
       <w:r>
         <w:t xml:space="preserve">data. Nucleic Acids Research. 2025;53: gkaf295. doi:</w:t>
       </w:r>
-      <w:hyperlink r:id="rId96">
+      <w:hyperlink r:id="rId97">
         <w:r>
           <w:rPr>
             <w:rStyle w:val="Hyperlink"/>
@@ -9721,8 +9735,8 @@
         </w:r>
       </w:hyperlink>
     </w:p>
-    <w:bookmarkEnd w:id="97"/>
-    <w:bookmarkStart w:id="99" w:name="ref-zhang2025"/>
+    <w:bookmarkEnd w:id="98"/>
+    <w:bookmarkStart w:id="100" w:name="ref-zhang2025"/>
     <w:p>
       <w:pPr>
         <w:pStyle w:val="Bibliography"/>
@@ -9739,7 +9753,7 @@
       <w:r>
         <w:t xml:space="preserve">Zhang Z, Zabaikina I, Nieto C, Vahdat Z, Bokes P, Singh A. Stochastic gene expression in proliferating cells: Differing noise intensity in single-cell and population perspectives. PLoS Computational Biology. 2025;21: e1013014. doi:</w:t>
       </w:r>
-      <w:hyperlink r:id="rId98">
+      <w:hyperlink r:id="rId99">
         <w:r>
           <w:rPr>
             <w:rStyle w:val="Hyperlink"/>
@@ -9748,8 +9762,8 @@
         </w:r>
       </w:hyperlink>
     </w:p>
-    <w:bookmarkEnd w:id="99"/>
-    <w:bookmarkStart w:id="101" w:name="ref-okochi2026scdivide"/>
+    <w:bookmarkEnd w:id="100"/>
+    <w:bookmarkStart w:id="102" w:name="ref-okochi2026scdivide"/>
     <w:p>
       <w:pPr>
         <w:pStyle w:val="Bibliography"/>
@@ -9766,7 +9780,7 @@
       <w:r>
         <w:t xml:space="preserve">Okochi Y, Sawazaki Y, Kondo Y, Naoki H. Inferring division-associated stochasticity from time-series single-cell transcriptomes. bioRxiv. 2026. doi:</w:t>
       </w:r>
-      <w:hyperlink r:id="rId100">
+      <w:hyperlink r:id="rId101">
         <w:r>
           <w:rPr>
             <w:rStyle w:val="Hyperlink"/>
@@ -9775,8 +9789,8 @@
         </w:r>
       </w:hyperlink>
     </w:p>
-    <w:bookmarkEnd w:id="101"/>
-    <w:bookmarkStart w:id="103" w:name="ref-ahlmanneltze2025"/>
+    <w:bookmarkEnd w:id="102"/>
+    <w:bookmarkStart w:id="104" w:name="ref-ahlmanneltze2025"/>
     <w:p>
       <w:pPr>
         <w:pStyle w:val="Bibliography"/>
@@ -9793,7 +9807,7 @@
       <w:r>
         <w:t xml:space="preserve">Ahlmann-Eltze C, Huber W, Anders S. Deep-learning-based gene perturbation effect prediction does not yet outperform simple linear baselines. Nature Methods. 2025;22: 1657–1661. doi:</w:t>
       </w:r>
-      <w:hyperlink r:id="rId102">
+      <w:hyperlink r:id="rId103">
         <w:r>
           <w:rPr>
             <w:rStyle w:val="Hyperlink"/>
@@ -9802,8 +9816,8 @@
         </w:r>
       </w:hyperlink>
     </w:p>
-    <w:bookmarkEnd w:id="103"/>
-    <w:bookmarkStart w:id="105" w:name="ref-vollenweider2026"/>
+    <w:bookmarkEnd w:id="104"/>
+    <w:bookmarkStart w:id="106" w:name="ref-vollenweider2026"/>
     <w:p>
       <w:pPr>
         <w:pStyle w:val="Bibliography"/>
@@ -9820,7 +9834,7 @@
       <w:r>
         <w:t xml:space="preserve">Vollenweider MS, Bühlmann P. Signal, bounds, and baselines: Principles for rigorous evaluation of high-dimensional biological perturbation prediction. bioRxiv. 2026. doi:</w:t>
       </w:r>
-      <w:hyperlink r:id="rId104">
+      <w:hyperlink r:id="rId105">
         <w:r>
           <w:rPr>
             <w:rStyle w:val="Hyperlink"/>
@@ -9829,8 +9843,8 @@
         </w:r>
       </w:hyperlink>
     </w:p>
-    <w:bookmarkEnd w:id="105"/>
-    <w:bookmarkStart w:id="107" w:name="ref-dibaeinia2026context"/>
+    <w:bookmarkEnd w:id="106"/>
+    <w:bookmarkStart w:id="108" w:name="ref-dibaeinia2026context"/>
     <w:p>
       <w:pPr>
         <w:pStyle w:val="Bibliography"/>
@@ -9847,7 +9861,7 @@
       <w:r>
         <w:t xml:space="preserve">Dibaeinia P, Babu S, Knudson M, ElSheikh A, Wen Y, Liu H, et al. Virtual cells need context, not just scale. bioRxiv. 2026. doi:</w:t>
       </w:r>
-      <w:hyperlink r:id="rId106">
+      <w:hyperlink r:id="rId107">
         <w:r>
           <w:rPr>
             <w:rStyle w:val="Hyperlink"/>
@@ -9856,8 +9870,8 @@
         </w:r>
       </w:hyperlink>
     </w:p>
-    <w:bookmarkEnd w:id="107"/>
-    <w:bookmarkStart w:id="109" w:name="ref-bunne2024"/>
+    <w:bookmarkEnd w:id="108"/>
+    <w:bookmarkStart w:id="110" w:name="ref-bunne2024"/>
     <w:p>
       <w:pPr>
         <w:pStyle w:val="Bibliography"/>
@@ -9874,7 +9888,7 @@
       <w:r>
         <w:t xml:space="preserve">Bunne C, Roohani Y, Rosen Y, Gupta A, Zhang X, Roed M, et al. How to build the virtual cell with artificial intelligence: Priorities and opportunities. Cell. 2024;187: 7045–7063. doi:</w:t>
       </w:r>
-      <w:hyperlink r:id="rId108">
+      <w:hyperlink r:id="rId109">
         <w:r>
           <w:rPr>
             <w:rStyle w:val="Hyperlink"/>
@@ -9883,8 +9897,8 @@
         </w:r>
       </w:hyperlink>
     </w:p>
-    <w:bookmarkEnd w:id="109"/>
-    <w:bookmarkStart w:id="111" w:name="ref-zappia2017"/>
+    <w:bookmarkEnd w:id="110"/>
+    <w:bookmarkStart w:id="112" w:name="ref-zappia2017"/>
     <w:p>
       <w:pPr>
         <w:pStyle w:val="Bibliography"/>
@@ -9913,7 +9927,7 @@
       <w:r>
         <w:t xml:space="preserve">sequencing data. Genome Biology. 2017;18: 174. doi:</w:t>
       </w:r>
-      <w:hyperlink r:id="rId110">
+      <w:hyperlink r:id="rId111">
         <w:r>
           <w:rPr>
             <w:rStyle w:val="Hyperlink"/>
@@ -9922,8 +9936,8 @@
         </w:r>
       </w:hyperlink>
     </w:p>
-    <w:bookmarkEnd w:id="111"/>
-    <w:bookmarkStart w:id="113" w:name="ref-song2024scdesign3"/>
+    <w:bookmarkEnd w:id="112"/>
+    <w:bookmarkStart w:id="114" w:name="ref-song2024scdesign3"/>
     <w:p>
       <w:pPr>
         <w:pStyle w:val="Bibliography"/>
@@ -9952,7 +9966,7 @@
       <w:r>
         <w:t xml:space="preserve">generates realistic in silico data for multimodal single-cell and spatial omics. Nature Biotechnology. 2024;42: 247–252. doi:</w:t>
       </w:r>
-      <w:hyperlink r:id="rId112">
+      <w:hyperlink r:id="rId113">
         <w:r>
           <w:rPr>
             <w:rStyle w:val="Hyperlink"/>
@@ -9961,8 +9975,8 @@
         </w:r>
       </w:hyperlink>
     </w:p>
-    <w:bookmarkEnd w:id="113"/>
-    <w:bookmarkStart w:id="115" w:name="ref-zhang2019symsim"/>
+    <w:bookmarkEnd w:id="114"/>
+    <w:bookmarkStart w:id="116" w:name="ref-zhang2019symsim"/>
     <w:p>
       <w:pPr>
         <w:pStyle w:val="Bibliography"/>
@@ -9991,7 +10005,7 @@
       <w:r>
         <w:t xml:space="preserve">sequencing. Nature Communications. 2019;10: 2611. doi:</w:t>
       </w:r>
-      <w:hyperlink r:id="rId114">
+      <w:hyperlink r:id="rId115">
         <w:r>
           <w:rPr>
             <w:rStyle w:val="Hyperlink"/>
@@ -10000,8 +10014,8 @@
         </w:r>
       </w:hyperlink>
     </w:p>
-    <w:bookmarkEnd w:id="115"/>
-    <w:bookmarkStart w:id="117" w:name="ref-dibaeinia2020"/>
+    <w:bookmarkEnd w:id="116"/>
+    <w:bookmarkStart w:id="118" w:name="ref-dibaeinia2020"/>
     <w:p>
       <w:pPr>
         <w:pStyle w:val="Bibliography"/>
@@ -10027,7 +10041,7 @@
       <w:r>
         <w:t xml:space="preserve">: A single-cell expression simulator guided by gene regulatory networks. Cell Systems. 2020;11: 252–271. doi:</w:t>
       </w:r>
-      <w:hyperlink r:id="rId116">
+      <w:hyperlink r:id="rId117">
         <w:r>
           <w:rPr>
             <w:rStyle w:val="Hyperlink"/>
@@ -10036,8 +10050,8 @@
         </w:r>
       </w:hyperlink>
     </w:p>
-    <w:bookmarkEnd w:id="117"/>
-    <w:bookmarkStart w:id="119" w:name="ref-cannoodt2021"/>
+    <w:bookmarkEnd w:id="118"/>
+    <w:bookmarkStart w:id="120" w:name="ref-cannoodt2021"/>
     <w:p>
       <w:pPr>
         <w:pStyle w:val="Bibliography"/>
@@ -10054,7 +10068,7 @@
       <w:r>
         <w:t xml:space="preserve">Cannoodt R, Saelens W, Deconinck L, Saeys Y. Spearheading future omics analyses using dyngen, a multi-modal simulator of single cells. Nature Communications. 2021;12: 3942. doi:</w:t>
       </w:r>
-      <w:hyperlink r:id="rId118">
+      <w:hyperlink r:id="rId119">
         <w:r>
           <w:rPr>
             <w:rStyle w:val="Hyperlink"/>
@@ -10063,8 +10077,8 @@
         </w:r>
       </w:hyperlink>
     </w:p>
-    <w:bookmarkEnd w:id="119"/>
-    <w:bookmarkStart w:id="121" w:name="ref-li2025scmultisim"/>
+    <w:bookmarkEnd w:id="120"/>
+    <w:bookmarkStart w:id="122" w:name="ref-li2025scmultisim"/>
     <w:p>
       <w:pPr>
         <w:pStyle w:val="Bibliography"/>
@@ -10090,7 +10104,7 @@
       <w:r>
         <w:t xml:space="preserve">: Simulation of single-cell multi-omics and spatial data guided by gene regulatory networks and cell–cell interactions. Nature Methods. 2025;22: 982–993. doi:</w:t>
       </w:r>
-      <w:hyperlink r:id="rId120">
+      <w:hyperlink r:id="rId121">
         <w:r>
           <w:rPr>
             <w:rStyle w:val="Hyperlink"/>
@@ -10099,8 +10113,8 @@
         </w:r>
       </w:hyperlink>
     </w:p>
-    <w:bookmarkEnd w:id="121"/>
-    <w:bookmarkStart w:id="123" w:name="ref-zinati2024groundgan"/>
+    <w:bookmarkEnd w:id="122"/>
+    <w:bookmarkStart w:id="124" w:name="ref-zinati2024groundgan"/>
     <w:p>
       <w:pPr>
         <w:pStyle w:val="Bibliography"/>
@@ -10147,7 +10161,7 @@
       <w:r>
         <w:t xml:space="preserve">data using causal generative adversarial networks. Nature Communications. 2024;15: 4055. doi:</w:t>
       </w:r>
-      <w:hyperlink r:id="rId122">
+      <w:hyperlink r:id="rId123">
         <w:r>
           <w:rPr>
             <w:rStyle w:val="Hyperlink"/>
@@ -10156,8 +10170,8 @@
         </w:r>
       </w:hyperlink>
     </w:p>
-    <w:bookmarkEnd w:id="123"/>
-    <w:bookmarkStart w:id="125" w:name="ref-pan2022tedsim"/>
+    <w:bookmarkEnd w:id="124"/>
+    <w:bookmarkStart w:id="126" w:name="ref-pan2022tedsim"/>
     <w:p>
       <w:pPr>
         <w:pStyle w:val="Bibliography"/>
@@ -10195,7 +10209,7 @@
       <w:r>
         <w:t xml:space="preserve">sequencing data and cell division history. Nucleic Acids Research. 2022;50: 4272–4288. doi:</w:t>
       </w:r>
-      <w:hyperlink r:id="rId124">
+      <w:hyperlink r:id="rId125">
         <w:r>
           <w:rPr>
             <w:rStyle w:val="Hyperlink"/>
@@ -10204,8 +10218,8 @@
         </w:r>
       </w:hyperlink>
     </w:p>
-    <w:bookmarkEnd w:id="125"/>
-    <w:bookmarkStart w:id="127" w:name="ref-jones2020cassiopeia"/>
+    <w:bookmarkEnd w:id="126"/>
+    <w:bookmarkStart w:id="128" w:name="ref-jones2020cassiopeia"/>
     <w:p>
       <w:pPr>
         <w:pStyle w:val="Bibliography"/>
@@ -10231,7 +10245,7 @@
       <w:r>
         <w:t xml:space="preserve">. Genome Biology. 2020;21: 92. doi:</w:t>
       </w:r>
-      <w:hyperlink r:id="rId126">
+      <w:hyperlink r:id="rId127">
         <w:r>
           <w:rPr>
             <w:rStyle w:val="Hyperlink"/>
@@ -10240,8 +10254,8 @@
         </w:r>
       </w:hyperlink>
     </w:p>
-    <w:bookmarkEnd w:id="127"/>
-    <w:bookmarkStart w:id="129" w:name="ref-pratapa2020"/>
+    <w:bookmarkEnd w:id="128"/>
+    <w:bookmarkStart w:id="130" w:name="ref-pratapa2020"/>
     <w:p>
       <w:pPr>
         <w:pStyle w:val="Bibliography"/>
@@ -10258,7 +10272,7 @@
       <w:r>
         <w:t xml:space="preserve">Pratapa A, Jalihal AP, Law JN, Bharadwaj A, Murali TM. Benchmarking algorithms for gene regulatory network inference from single-cell transcriptomic data. Nature Methods. 2020;17: 147–154. doi:</w:t>
       </w:r>
-      <w:hyperlink r:id="rId128">
+      <w:hyperlink r:id="rId129">
         <w:r>
           <w:rPr>
             <w:rStyle w:val="Hyperlink"/>
@@ -10267,8 +10281,8 @@
         </w:r>
       </w:hyperlink>
     </w:p>
-    <w:bookmarkEnd w:id="129"/>
-    <w:bookmarkStart w:id="131" w:name="ref-bertaux2018"/>
+    <w:bookmarkEnd w:id="130"/>
+    <w:bookmarkStart w:id="132" w:name="ref-bertaux2018"/>
     <w:p>
       <w:pPr>
         <w:pStyle w:val="Bibliography"/>
@@ -10285,7 +10299,7 @@
       <w:r>
         <w:t xml:space="preserve">Bertaux F, Marguerat S, Shahrezaei V. Division rate, cell size and proteome allocation: Impact on gene expression noise and implications for the dynamics of genetic circuits. Royal Society Open Science. 2018;5: 172234. doi:</w:t>
       </w:r>
-      <w:hyperlink r:id="rId130">
+      <w:hyperlink r:id="rId131">
         <w:r>
           <w:rPr>
             <w:rStyle w:val="Hyperlink"/>
@@ -10294,8 +10308,8 @@
         </w:r>
       </w:hyperlink>
     </w:p>
-    <w:bookmarkEnd w:id="131"/>
-    <w:bookmarkStart w:id="133" w:name="ref-piho2025abm"/>
+    <w:bookmarkEnd w:id="132"/>
+    <w:bookmarkStart w:id="134" w:name="ref-piho2025abm"/>
     <w:p>
       <w:pPr>
         <w:pStyle w:val="Bibliography"/>
@@ -10321,7 +10335,7 @@
       <w:r>
         <w:t xml:space="preserve">: A tool for stochastic simulation of structured population dynamics. PLoS Computational Biology. 2026;22: e1014366. doi:</w:t>
       </w:r>
-      <w:hyperlink r:id="rId132">
+      <w:hyperlink r:id="rId133">
         <w:r>
           <w:rPr>
             <w:rStyle w:val="Hyperlink"/>
@@ -10330,8 +10344,8 @@
         </w:r>
       </w:hyperlink>
     </w:p>
-    <w:bookmarkEnd w:id="133"/>
-    <w:bookmarkStart w:id="135" w:name="ref-piho2024feedback"/>
+    <w:bookmarkEnd w:id="134"/>
+    <w:bookmarkStart w:id="136" w:name="ref-piho2024feedback"/>
     <w:p>
       <w:pPr>
         <w:pStyle w:val="Bibliography"/>
@@ -10348,7 +10362,7 @@
       <w:r>
         <w:t xml:space="preserve">Piho P, Thomas P. Feedback between stochastic gene networks and population dynamics enables cellular decision-making. Science Advances. 2024;10: eadl4895. doi:</w:t>
       </w:r>
-      <w:hyperlink r:id="rId134">
+      <w:hyperlink r:id="rId135">
         <w:r>
           <w:rPr>
             <w:rStyle w:val="Hyperlink"/>
@@ -10357,8 +10371,8 @@
         </w:r>
       </w:hyperlink>
     </w:p>
-    <w:bookmarkEnd w:id="135"/>
-    <w:bookmarkStart w:id="137" w:name="ref-thomas2021"/>
+    <w:bookmarkEnd w:id="136"/>
+    <w:bookmarkStart w:id="138" w:name="ref-thomas2021"/>
     <w:p>
       <w:pPr>
         <w:pStyle w:val="Bibliography"/>
@@ -10375,7 +10389,7 @@
       <w:r>
         <w:t xml:space="preserve">Thomas P, Shahrezaei V. Coordination of gene expression noise with cell size: Analytical results for agent-based models of growing cell populations. Journal of the Royal Society Interface. 2021;18: 20210274. doi:</w:t>
       </w:r>
-      <w:hyperlink r:id="rId136">
+      <w:hyperlink r:id="rId137">
         <w:r>
           <w:rPr>
             <w:rStyle w:val="Hyperlink"/>
@@ -10384,8 +10398,8 @@
         </w:r>
       </w:hyperlink>
     </w:p>
-    <w:bookmarkEnd w:id="137"/>
-    <w:bookmarkStart w:id="139" w:name="ref-ghaffarizadeh2018"/>
+    <w:bookmarkEnd w:id="138"/>
+    <w:bookmarkStart w:id="140" w:name="ref-ghaffarizadeh2018"/>
     <w:p>
       <w:pPr>
         <w:pStyle w:val="Bibliography"/>
@@ -10420,7 +10434,7 @@
       <w:r>
         <w:t xml:space="preserve">multicellular systems. PLoS Computational Biology. 2018;14: e1005991. doi:</w:t>
       </w:r>
-      <w:hyperlink r:id="rId138">
+      <w:hyperlink r:id="rId139">
         <w:r>
           <w:rPr>
             <w:rStyle w:val="Hyperlink"/>
@@ -10429,8 +10443,8 @@
         </w:r>
       </w:hyperlink>
     </w:p>
-    <w:bookmarkEnd w:id="139"/>
-    <w:bookmarkStart w:id="141" w:name="ref-poncedeleon2023"/>
+    <w:bookmarkEnd w:id="140"/>
+    <w:bookmarkStart w:id="142" w:name="ref-poncedeleon2023"/>
     <w:p>
       <w:pPr>
         <w:pStyle w:val="Bibliography"/>
@@ -10471,7 +10485,7 @@
       <w:r>
         <w:t xml:space="preserve">and agent-based modelling frameworks. npj Systems Biology and Applications. 2023;9: 54. doi:</w:t>
       </w:r>
-      <w:hyperlink r:id="rId140">
+      <w:hyperlink r:id="rId141">
         <w:r>
           <w:rPr>
             <w:rStyle w:val="Hyperlink"/>
@@ -10480,8 +10494,8 @@
         </w:r>
       </w:hyperlink>
     </w:p>
-    <w:bookmarkEnd w:id="141"/>
-    <w:bookmarkStart w:id="143" w:name="ref-lasri2022"/>
+    <w:bookmarkEnd w:id="142"/>
+    <w:bookmarkStart w:id="144" w:name="ref-lasri2022"/>
     <w:p>
       <w:pPr>
         <w:pStyle w:val="Bibliography"/>
@@ -10510,7 +10524,7 @@
       <w:r>
         <w:t xml:space="preserve">data generation. BMC Bioinformatics. 2022;23: 236. doi:</w:t>
       </w:r>
-      <w:hyperlink r:id="rId142">
+      <w:hyperlink r:id="rId143">
         <w:r>
           <w:rPr>
             <w:rStyle w:val="Hyperlink"/>
@@ -10519,8 +10533,8 @@
         </w:r>
       </w:hyperlink>
     </w:p>
-    <w:bookmarkEnd w:id="143"/>
-    <w:bookmarkStart w:id="145" w:name="ref-peccoud1995"/>
+    <w:bookmarkEnd w:id="144"/>
+    <w:bookmarkStart w:id="146" w:name="ref-peccoud1995"/>
     <w:p>
       <w:pPr>
         <w:pStyle w:val="Bibliography"/>
@@ -10537,7 +10551,7 @@
       <w:r>
         <w:t xml:space="preserve">Peccoud J, Ycart B. Markovian modeling of gene-product synthesis. Theoretical Population Biology. 1995;48: 222–234. doi:</w:t>
       </w:r>
-      <w:hyperlink r:id="rId144">
+      <w:hyperlink r:id="rId145">
         <w:r>
           <w:rPr>
             <w:rStyle w:val="Hyperlink"/>
@@ -10546,8 +10560,8 @@
         </w:r>
       </w:hyperlink>
     </w:p>
-    <w:bookmarkEnd w:id="145"/>
-    <w:bookmarkStart w:id="147" w:name="ref-beentjes2020"/>
+    <w:bookmarkEnd w:id="146"/>
+    <w:bookmarkStart w:id="148" w:name="ref-beentjes2020"/>
     <w:p>
       <w:pPr>
         <w:pStyle w:val="Bibliography"/>
@@ -10564,7 +10578,7 @@
       <w:r>
         <w:t xml:space="preserve">Beentjes CHL, Perez-Carrasco R, Grima R. Exact solution of stochastic gene expression models with bursting, cell cycle and replication dynamics. Physical Review E. 2020;101: 032403. doi:</w:t>
       </w:r>
-      <w:hyperlink r:id="rId146">
+      <w:hyperlink r:id="rId147">
         <w:r>
           <w:rPr>
             <w:rStyle w:val="Hyperlink"/>
@@ -10573,8 +10587,8 @@
         </w:r>
       </w:hyperlink>
     </w:p>
-    <w:bookmarkEnd w:id="147"/>
-    <w:bookmarkStart w:id="149" w:name="ref-jia2023"/>
+    <w:bookmarkEnd w:id="148"/>
+    <w:bookmarkStart w:id="150" w:name="ref-jia2023"/>
     <w:p>
       <w:pPr>
         <w:pStyle w:val="Bibliography"/>
@@ -10591,7 +10605,7 @@
       <w:r>
         <w:t xml:space="preserve">Jia C, Grima R. Coupling gene expression dynamics to cell size dynamics and cell cycle events: Exact and approximate solutions of the extended telegraph model. iScience. 2023;26: 105746. doi:</w:t>
       </w:r>
-      <w:hyperlink r:id="rId148">
+      <w:hyperlink r:id="rId149">
         <w:r>
           <w:rPr>
             <w:rStyle w:val="Hyperlink"/>
@@ -10600,8 +10614,8 @@
         </w:r>
       </w:hyperlink>
     </w:p>
-    <w:bookmarkEnd w:id="149"/>
-    <w:bookmarkStart w:id="151" w:name="ref-thomas2017"/>
+    <w:bookmarkEnd w:id="150"/>
+    <w:bookmarkStart w:id="152" w:name="ref-thomas2017"/>
     <w:p>
       <w:pPr>
         <w:pStyle w:val="Bibliography"/>
@@ -10618,7 +10632,7 @@
       <w:r>
         <w:t xml:space="preserve">Thomas P. Making sense of snapshot data: Ergodic principle for clonal cell populations. Journal of the Royal Society Interface. 2017;14: 20170467. doi:</w:t>
       </w:r>
-      <w:hyperlink r:id="rId150">
+      <w:hyperlink r:id="rId151">
         <w:r>
           <w:rPr>
             <w:rStyle w:val="Hyperlink"/>
@@ -10627,8 +10641,8 @@
         </w:r>
       </w:hyperlink>
     </w:p>
-    <w:bookmarkEnd w:id="151"/>
-    <w:bookmarkStart w:id="153" w:name="ref-emert2021"/>
+    <w:bookmarkEnd w:id="152"/>
+    <w:bookmarkStart w:id="154" w:name="ref-emert2021"/>
     <w:p>
       <w:pPr>
         <w:pStyle w:val="Bibliography"/>
@@ -10645,7 +10659,7 @@
       <w:r>
         <w:t xml:space="preserve">Emert BL, Cote CJ, Torre EA, Dardani IP, Jiang CL, Jain N, et al. Variability within rare cell states enables multiple paths toward drug resistance. Nature Biotechnology. 2021;39: 865–876. doi:</w:t>
       </w:r>
-      <w:hyperlink r:id="rId152">
+      <w:hyperlink r:id="rId153">
         <w:r>
           <w:rPr>
             <w:rStyle w:val="Hyperlink"/>
@@ -10654,8 +10668,8 @@
         </w:r>
       </w:hyperlink>
     </w:p>
-    <w:bookmarkEnd w:id="153"/>
-    <w:bookmarkStart w:id="155" w:name="ref-torre2021"/>
+    <w:bookmarkEnd w:id="154"/>
+    <w:bookmarkStart w:id="156" w:name="ref-torre2021"/>
     <w:p>
       <w:pPr>
         <w:pStyle w:val="Bibliography"/>
@@ -10672,7 +10686,7 @@
       <w:r>
         <w:t xml:space="preserve">Torre EA, Arai E, Bayatpour S, Jiang CL, Beck LE, Emert BL, et al. Genetic screening for single-cell variability modulators driving therapy resistance. Nature Genetics. 2021;53: 76–85. doi:</w:t>
       </w:r>
-      <w:hyperlink r:id="rId154">
+      <w:hyperlink r:id="rId155">
         <w:r>
           <w:rPr>
             <w:rStyle w:val="Hyperlink"/>
@@ -10681,8 +10695,8 @@
         </w:r>
       </w:hyperlink>
     </w:p>
-    <w:bookmarkEnd w:id="155"/>
-    <w:bookmarkStart w:id="157" w:name="ref-gunnarsson2020"/>
+    <w:bookmarkEnd w:id="156"/>
+    <w:bookmarkStart w:id="158" w:name="ref-gunnarsson2020"/>
     <w:p>
       <w:pPr>
         <w:pStyle w:val="Bibliography"/>
@@ -10699,7 +10713,7 @@
       <w:r>
         <w:t xml:space="preserve">Gunnarsson EB, De S, Leder K, Foo J. Understanding the role of phenotypic switching in cancer drug resistance. Journal of Theoretical Biology. 2020;490: 110162. doi:</w:t>
       </w:r>
-      <w:hyperlink r:id="rId156">
+      <w:hyperlink r:id="rId157">
         <w:r>
           <w:rPr>
             <w:rStyle w:val="Hyperlink"/>
@@ -10708,8 +10722,8 @@
         </w:r>
       </w:hyperlink>
     </w:p>
-    <w:bookmarkEnd w:id="157"/>
-    <w:bookmarkStart w:id="159" w:name="ref-lasri2020"/>
+    <w:bookmarkEnd w:id="158"/>
+    <w:bookmarkStart w:id="160" w:name="ref-lasri2020"/>
     <w:p>
       <w:pPr>
         <w:pStyle w:val="Bibliography"/>
@@ -10744,7 +10758,7 @@
       <w:r>
         <w:t xml:space="preserve">methyltransferase dynamics. Royal Society Open Science. 2020;7: 191243. doi:</w:t>
       </w:r>
-      <w:hyperlink r:id="rId158">
+      <w:hyperlink r:id="rId159">
         <w:r>
           <w:rPr>
             <w:rStyle w:val="Hyperlink"/>
@@ -10753,8 +10767,8 @@
         </w:r>
       </w:hyperlink>
     </w:p>
-    <w:bookmarkEnd w:id="159"/>
-    <w:bookmarkStart w:id="161" w:name="ref-corigliano2025"/>
+    <w:bookmarkEnd w:id="160"/>
+    <w:bookmarkStart w:id="162" w:name="ref-corigliano2025"/>
     <w:p>
       <w:pPr>
         <w:pStyle w:val="Bibliography"/>
@@ -10771,7 +10785,7 @@
       <w:r>
         <w:t xml:space="preserve">Corigliano M, Di Bernardo A, Cosentino Lagomarsino M, Pompei S. Optimal treatment for drug-induced cancer persisters involves release periods and intermediate drug doses. PRX Life. 2025. doi:</w:t>
       </w:r>
-      <w:hyperlink r:id="rId160">
+      <w:hyperlink r:id="rId161">
         <w:r>
           <w:rPr>
             <w:rStyle w:val="Hyperlink"/>
@@ -10780,8 +10794,8 @@
         </w:r>
       </w:hyperlink>
     </w:p>
-    <w:bookmarkEnd w:id="161"/>
-    <w:bookmarkStart w:id="163" w:name="ref-bernton2019"/>
+    <w:bookmarkEnd w:id="162"/>
+    <w:bookmarkStart w:id="164" w:name="ref-bernton2019"/>
     <w:p>
       <w:pPr>
         <w:pStyle w:val="Bibliography"/>
@@ -10822,7 +10836,7 @@
       <w:r>
         <w:t xml:space="preserve">distance. Journal of the Royal Statistical Society: Series B. 2019;81: 235–269. doi:</w:t>
       </w:r>
-      <w:hyperlink r:id="rId162">
+      <w:hyperlink r:id="rId163">
         <w:r>
           <w:rPr>
             <w:rStyle w:val="Hyperlink"/>
@@ -10831,8 +10845,8 @@
         </w:r>
       </w:hyperlink>
     </w:p>
-    <w:bookmarkEnd w:id="163"/>
-    <w:bookmarkStart w:id="165" w:name="ref-sandler2015"/>
+    <w:bookmarkEnd w:id="164"/>
+    <w:bookmarkStart w:id="166" w:name="ref-sandler2015"/>
     <w:p>
       <w:pPr>
         <w:pStyle w:val="Bibliography"/>
@@ -10849,7 +10863,7 @@
       <w:r>
         <w:t xml:space="preserve">Sandler O, Mizrahi SP, Weiss N, Agam O, Simon I, Balaban NQ. Lineage correlations of single cell division time as a probe of cell-cycle dynamics. Nature. 2015;519: 468–471. doi:</w:t>
       </w:r>
-      <w:hyperlink r:id="rId164">
+      <w:hyperlink r:id="rId165">
         <w:r>
           <w:rPr>
             <w:rStyle w:val="Hyperlink"/>
@@ -10858,8 +10872,8 @@
         </w:r>
       </w:hyperlink>
     </w:p>
-    <w:bookmarkEnd w:id="165"/>
-    <w:bookmarkStart w:id="167" w:name="ref-kuchen2020"/>
+    <w:bookmarkEnd w:id="166"/>
+    <w:bookmarkStart w:id="168" w:name="ref-kuchen2020"/>
     <w:p>
       <w:pPr>
         <w:pStyle w:val="Bibliography"/>
@@ -10876,7 +10890,7 @@
       <w:r>
         <w:t xml:space="preserve">Kuchen EE, Becker NB, Claudino N, Höfer T. Hidden long-range memories of growth and cycle speed correlate cell cycles in lineage trees. eLife. 2020;9: e51002. doi:</w:t>
       </w:r>
-      <w:hyperlink r:id="rId166">
+      <w:hyperlink r:id="rId167">
         <w:r>
           <w:rPr>
             <w:rStyle w:val="Hyperlink"/>
@@ -10885,8 +10899,8 @@
         </w:r>
       </w:hyperlink>
     </w:p>
-    <w:bookmarkEnd w:id="167"/>
-    <w:bookmarkStart w:id="169" w:name="ref-chakrabarti2018"/>
+    <w:bookmarkEnd w:id="168"/>
+    <w:bookmarkStart w:id="170" w:name="ref-chakrabarti2018"/>
     <w:p>
       <w:pPr>
         <w:pStyle w:val="Bibliography"/>
@@ -10903,7 +10917,7 @@
       <w:r>
         <w:t xml:space="preserve">Chakrabarti S, Paek AL, Reyes J, Lasick KA, Lahav G, Michor F. Hidden heterogeneity and circadian-controlled cell fate inferred from single cell lineages. Nature Communications. 2018;9: 5372. doi:</w:t>
       </w:r>
-      <w:hyperlink r:id="rId168">
+      <w:hyperlink r:id="rId169">
         <w:r>
           <w:rPr>
             <w:rStyle w:val="Hyperlink"/>
@@ -10912,8 +10926,8 @@
         </w:r>
       </w:hyperlink>
     </w:p>
-    <w:bookmarkEnd w:id="169"/>
-    <w:bookmarkStart w:id="171" w:name="ref-algazi2020"/>
+    <w:bookmarkEnd w:id="170"/>
+    <w:bookmarkStart w:id="172" w:name="ref-algazi2020"/>
     <w:p>
       <w:pPr>
         <w:pStyle w:val="Bibliography"/>
@@ -10963,7 +10977,7 @@
       <w:r>
         <w:t xml:space="preserve">-mutated melanoma: A randomized phase 2 trial. Nature Medicine. 2020;26: 1564–1568. doi:</w:t>
       </w:r>
-      <w:hyperlink r:id="rId170">
+      <w:hyperlink r:id="rId171">
         <w:r>
           <w:rPr>
             <w:rStyle w:val="Hyperlink"/>
@@ -10972,8 +10986,8 @@
         </w:r>
       </w:hyperlink>
     </w:p>
-    <w:bookmarkEnd w:id="171"/>
-    <w:bookmarkStart w:id="173" w:name="ref-zhang2017adaptive"/>
+    <w:bookmarkEnd w:id="172"/>
+    <w:bookmarkStart w:id="174" w:name="ref-zhang2017adaptive"/>
     <w:p>
       <w:pPr>
         <w:pStyle w:val="Bibliography"/>
@@ -10990,7 +11004,7 @@
       <w:r>
         <w:t xml:space="preserve">Zhang J, Cunningham JJ, Brown JS, Gatenby RA. Integrating evolutionary dynamics into treatment of metastatic castrate-resistant prostate cancer. Nature Communications. 2017;8: 1816. doi:</w:t>
       </w:r>
-      <w:hyperlink r:id="rId172">
+      <w:hyperlink r:id="rId173">
         <w:r>
           <w:rPr>
             <w:rStyle w:val="Hyperlink"/>
@@ -10999,8 +11013,8 @@
         </w:r>
       </w:hyperlink>
     </w:p>
-    <w:bookmarkEnd w:id="173"/>
-    <w:bookmarkStart w:id="175" w:name="ref-dasthakur2013"/>
+    <w:bookmarkEnd w:id="174"/>
+    <w:bookmarkStart w:id="176" w:name="ref-dasthakur2013"/>
     <w:p>
       <w:pPr>
         <w:pStyle w:val="Bibliography"/>
@@ -11017,7 +11031,7 @@
       <w:r>
         <w:t xml:space="preserve">Das Thakur M, Salangsang F, Landman AS, Sellers WR, Pryer NK, Levesque MP, et al. Modelling vemurafenib resistance in melanoma reveals a strategy to forestall drug resistance. Nature. 2013;494: 251–255. doi:</w:t>
       </w:r>
-      <w:hyperlink r:id="rId174">
+      <w:hyperlink r:id="rId175">
         <w:r>
           <w:rPr>
             <w:rStyle w:val="Hyperlink"/>
@@ -11026,8 +11040,8 @@
         </w:r>
       </w:hyperlink>
     </w:p>
-    <w:bookmarkEnd w:id="175"/>
-    <w:bookmarkStart w:id="177" w:name="ref-strobl2021"/>
+    <w:bookmarkEnd w:id="176"/>
+    <w:bookmarkStart w:id="178" w:name="ref-strobl2021"/>
     <w:p>
       <w:pPr>
         <w:pStyle w:val="Bibliography"/>
@@ -11044,7 +11058,7 @@
       <w:r>
         <w:t xml:space="preserve">Strobl MAR, West J, Viossat Y, Damaghi M, Robertson-Tessi M, Brown JS, et al. Turnover modulates the need for a cost of resistance in adaptive therapy. Cancer Research. 2021;81: 1135–1147. doi:</w:t>
       </w:r>
-      <w:hyperlink r:id="rId176">
+      <w:hyperlink r:id="rId177">
         <w:r>
           <w:rPr>
             <w:rStyle w:val="Hyperlink"/>
@@ -11053,8 +11067,8 @@
         </w:r>
       </w:hyperlink>
     </w:p>
-    <w:bookmarkEnd w:id="177"/>
-    <w:bookmarkStart w:id="179" w:name="ref-gilbert2013"/>
+    <w:bookmarkEnd w:id="178"/>
+    <w:bookmarkStart w:id="180" w:name="ref-gilbert2013"/>
     <w:p>
       <w:pPr>
         <w:pStyle w:val="Bibliography"/>
@@ -11083,7 +11097,7 @@
       <w:r>
         <w:t xml:space="preserve">clinical trial. Journal of Clinical Oncology. 2013;31: 4085–4091. doi:</w:t>
       </w:r>
-      <w:hyperlink r:id="rId178">
+      <w:hyperlink r:id="rId179">
         <w:r>
           <w:rPr>
             <w:rStyle w:val="Hyperlink"/>
@@ -11092,8 +11106,8 @@
         </w:r>
       </w:hyperlink>
     </w:p>
-    <w:bookmarkEnd w:id="179"/>
-    <w:bookmarkStart w:id="181" w:name="ref-ostermann2004"/>
+    <w:bookmarkEnd w:id="180"/>
+    <w:bookmarkStart w:id="182" w:name="ref-ostermann2004"/>
     <w:p>
       <w:pPr>
         <w:pStyle w:val="Bibliography"/>
@@ -11110,7 +11124,7 @@
       <w:r>
         <w:t xml:space="preserve">Ostermann S, Csajka C, Buclin T, Leyvraz S, Lejeune F, Decosterd LA, et al. Plasma and cerebrospinal fluid population pharmacokinetics of temozolomide in malignant glioma patients. Clinical Cancer Research. 2004;10: 3728–3736. doi:</w:t>
       </w:r>
-      <w:hyperlink r:id="rId180">
+      <w:hyperlink r:id="rId181">
         <w:r>
           <w:rPr>
             <w:rStyle w:val="Hyperlink"/>
@@ -11119,8 +11133,8 @@
         </w:r>
       </w:hyperlink>
     </w:p>
-    <w:bookmarkEnd w:id="181"/>
-    <w:bookmarkStart w:id="183" w:name="ref-rudek2004"/>
+    <w:bookmarkEnd w:id="182"/>
+    <w:bookmarkStart w:id="184" w:name="ref-rudek2004"/>
     <w:p>
       <w:pPr>
         <w:pStyle w:val="Bibliography"/>
@@ -11149,7 +11163,7 @@
       <w:r>
         <w:t xml:space="preserve">and pharmacokinetic study. Pharmacotherapy. 2004;24: 16–25. doi:</w:t>
       </w:r>
-      <w:hyperlink r:id="rId182">
+      <w:hyperlink r:id="rId183">
         <w:r>
           <w:rPr>
             <w:rStyle w:val="Hyperlink"/>
@@ -11158,8 +11172,8 @@
         </w:r>
       </w:hyperlink>
     </w:p>
-    <w:bookmarkEnd w:id="183"/>
-    <w:bookmarkStart w:id="185" w:name="ref-tolcher2003"/>
+    <w:bookmarkEnd w:id="184"/>
+    <w:bookmarkStart w:id="186" w:name="ref-tolcher2003"/>
     <w:p>
       <w:pPr>
         <w:pStyle w:val="Bibliography"/>
@@ -11188,7 +11202,7 @@
       <w:r>
         <w:t xml:space="preserve">alkyltransferase activity with protracted temozolomide schedules. British Journal of Cancer. 2003;88: 1004–1011. doi:</w:t>
       </w:r>
-      <w:hyperlink r:id="rId184">
+      <w:hyperlink r:id="rId185">
         <w:r>
           <w:rPr>
             <w:rStyle w:val="Hyperlink"/>
@@ -11197,8 +11211,8 @@
         </w:r>
       </w:hyperlink>
     </w:p>
-    <w:bookmarkEnd w:id="185"/>
-    <w:bookmarkStart w:id="187" w:name="ref-middleton2000"/>
+    <w:bookmarkEnd w:id="186"/>
+    <w:bookmarkStart w:id="188" w:name="ref-middleton2000"/>
     <w:p>
       <w:pPr>
         <w:pStyle w:val="Bibliography"/>
@@ -11239,7 +11253,7 @@
       <w:r>
         <w:t xml:space="preserve">study. International Journal of Cancer. 2000;88: 469–473. doi:</w:t>
       </w:r>
-      <w:hyperlink r:id="rId186">
+      <w:hyperlink r:id="rId187">
         <w:r>
           <w:rPr>
             <w:rStyle w:val="Hyperlink"/>
@@ -11248,8 +11262,8 @@
         </w:r>
       </w:hyperlink>
     </w:p>
-    <w:bookmarkEnd w:id="187"/>
-    <w:bookmarkStart w:id="189" w:name="ref-robinson2010"/>
+    <w:bookmarkEnd w:id="188"/>
+    <w:bookmarkStart w:id="190" w:name="ref-robinson2010"/>
     <w:p>
       <w:pPr>
         <w:pStyle w:val="Bibliography"/>
@@ -11278,7 +11292,7 @@
       <w:r>
         <w:t xml:space="preserve">methyltransferase activity and survival. British Journal of Cancer. 2010;103: 498–504. doi:</w:t>
       </w:r>
-      <w:hyperlink r:id="rId188">
+      <w:hyperlink r:id="rId189">
         <w:r>
           <w:rPr>
             <w:rStyle w:val="Hyperlink"/>
@@ -11287,8 +11301,8 @@
         </w:r>
       </w:hyperlink>
     </w:p>
-    <w:bookmarkEnd w:id="189"/>
-    <w:bookmarkStart w:id="191" w:name="ref-gillespie1977"/>
+    <w:bookmarkEnd w:id="190"/>
+    <w:bookmarkStart w:id="192" w:name="ref-gillespie1977"/>
     <w:p>
       <w:pPr>
         <w:pStyle w:val="Bibliography"/>
@@ -11305,7 +11319,7 @@
       <w:r>
         <w:t xml:space="preserve">Gillespie DT. Exact stochastic simulation of coupled chemical reactions. The Journal of Physical Chemistry. 1977;81: 2340–2361. doi:</w:t>
       </w:r>
-      <w:hyperlink r:id="rId190">
+      <w:hyperlink r:id="rId191">
         <w:r>
           <w:rPr>
             <w:rStyle w:val="Hyperlink"/>
@@ -11314,8 +11328,8 @@
         </w:r>
       </w:hyperlink>
     </w:p>
-    <w:bookmarkEnd w:id="191"/>
-    <w:bookmarkStart w:id="193" w:name="ref-gillespie2001"/>
+    <w:bookmarkEnd w:id="192"/>
+    <w:bookmarkStart w:id="194" w:name="ref-gillespie2001"/>
     <w:p>
       <w:pPr>
         <w:pStyle w:val="Bibliography"/>
@@ -11332,7 +11346,7 @@
       <w:r>
         <w:t xml:space="preserve">Gillespie DT. Approximate accelerated stochastic simulation of chemically reacting systems. The Journal of Chemical Physics. 2001;115: 1716–1733. doi:</w:t>
       </w:r>
-      <w:hyperlink r:id="rId192">
+      <w:hyperlink r:id="rId193">
         <w:r>
           <w:rPr>
             <w:rStyle w:val="Hyperlink"/>
@@ -11341,8 +11355,8 @@
         </w:r>
       </w:hyperlink>
     </w:p>
-    <w:bookmarkEnd w:id="193"/>
-    <w:bookmarkStart w:id="195" w:name="ref-cao2006"/>
+    <w:bookmarkEnd w:id="194"/>
+    <w:bookmarkStart w:id="196" w:name="ref-cao2006"/>
     <w:p>
       <w:pPr>
         <w:pStyle w:val="Bibliography"/>
@@ -11359,7 +11373,7 @@
       <w:r>
         <w:t xml:space="preserve">Cao Y, Gillespie DT, Petzold LR. Efficient step size selection for the tau-leaping simulation method. The Journal of Chemical Physics. 2006;124: 044109. doi:</w:t>
       </w:r>
-      <w:hyperlink r:id="rId194">
+      <w:hyperlink r:id="rId195">
         <w:r>
           <w:rPr>
             <w:rStyle w:val="Hyperlink"/>
@@ -11368,8 +11382,8 @@
         </w:r>
       </w:hyperlink>
     </w:p>
-    <w:bookmarkEnd w:id="195"/>
-    <w:bookmarkStart w:id="197" w:name="ref-cao2005"/>
+    <w:bookmarkEnd w:id="196"/>
+    <w:bookmarkStart w:id="198" w:name="ref-cao2005"/>
     <w:p>
       <w:pPr>
         <w:pStyle w:val="Bibliography"/>
@@ -11398,7 +11412,7 @@
       <w:r>
         <w:t xml:space="preserve">tau-leaping. The Journal of Chemical Physics. 2005;123: 054104. doi:</w:t>
       </w:r>
-      <w:hyperlink r:id="rId196">
+      <w:hyperlink r:id="rId197">
         <w:r>
           <w:rPr>
             <w:rStyle w:val="Hyperlink"/>
@@ -11407,8 +11421,8 @@
         </w:r>
       </w:hyperlink>
     </w:p>
-    <w:bookmarkEnd w:id="197"/>
-    <w:bookmarkStart w:id="199" w:name="ref-shaffer2020"/>
+    <w:bookmarkEnd w:id="198"/>
+    <w:bookmarkStart w:id="200" w:name="ref-shaffer2020"/>
     <w:p>
       <w:pPr>
         <w:pStyle w:val="Bibliography"/>
@@ -11425,7 +11439,7 @@
       <w:r>
         <w:t xml:space="preserve">Shaffer SM, Emert BL, Reyes Hueros RA, Cote C, Harmange G, Schaff DL, et al. Memory sequencing reveals heritable single-cell gene expression programs associated with distinct cellular behaviors. Cell. 2020;182: 947–959. doi:</w:t>
       </w:r>
-      <w:hyperlink r:id="rId198">
+      <w:hyperlink r:id="rId199">
         <w:r>
           <w:rPr>
             <w:rStyle w:val="Hyperlink"/>
@@ -11434,8 +11448,8 @@
         </w:r>
       </w:hyperlink>
     </w:p>
-    <w:bookmarkEnd w:id="199"/>
-    <w:bookmarkStart w:id="201" w:name="ref-toni2009"/>
+    <w:bookmarkEnd w:id="200"/>
+    <w:bookmarkStart w:id="202" w:name="ref-toni2009"/>
     <w:p>
       <w:pPr>
         <w:pStyle w:val="Bibliography"/>
@@ -11464,7 +11478,7 @@
       <w:r>
         <w:t xml:space="preserve">computation scheme for parameter inference and model selection in dynamical systems. Journal of the Royal Society Interface. 2009;6: 187–202. doi:</w:t>
       </w:r>
-      <w:hyperlink r:id="rId200">
+      <w:hyperlink r:id="rId201">
         <w:r>
           <w:rPr>
             <w:rStyle w:val="Hyperlink"/>
@@ -11473,8 +11487,8 @@
         </w:r>
       </w:hyperlink>
     </w:p>
-    <w:bookmarkEnd w:id="201"/>
-    <w:bookmarkStart w:id="203" w:name="ref-ellingson2016"/>
+    <w:bookmarkEnd w:id="202"/>
+    <w:bookmarkStart w:id="204" w:name="ref-ellingson2016"/>
     <w:p>
       <w:pPr>
         <w:pStyle w:val="Bibliography"/>
@@ -11491,7 +11505,7 @@
       <w:r>
         <w:t xml:space="preserve">Ellingson BM, Nguyen HN, Lai A, Nechifor RE, Zaw O, Pope WB, et al. Contrast-enhancing tumor growth dynamics of preoperative, treatment-naive human glioblastoma. Cancer. 2016;122: 1718–1727. doi:</w:t>
       </w:r>
-      <w:hyperlink r:id="rId202">
+      <w:hyperlink r:id="rId203">
         <w:r>
           <w:rPr>
             <w:rStyle w:val="Hyperlink"/>
@@ -11500,8 +11514,8 @@
         </w:r>
       </w:hyperlink>
     </w:p>
-    <w:bookmarkEnd w:id="203"/>
-    <w:bookmarkStart w:id="205" w:name="ref-stensjoen2015"/>
+    <w:bookmarkEnd w:id="204"/>
+    <w:bookmarkStart w:id="206" w:name="ref-stensjoen2015"/>
     <w:p>
       <w:pPr>
         <w:pStyle w:val="Bibliography"/>
@@ -11518,7 +11532,7 @@
       <w:r>
         <w:t xml:space="preserve">Stensjøen AL, Solheim O, Kvistad KA, Håberg AK, Salvesen Ø, Berntsen EM. Growth dynamics of untreated glioblastomas in vivo. Neuro-Oncology. 2015;17: 1402–1411. doi:</w:t>
       </w:r>
-      <w:hyperlink r:id="rId204">
+      <w:hyperlink r:id="rId205">
         <w:r>
           <w:rPr>
             <w:rStyle w:val="Hyperlink"/>
@@ -11527,8 +11541,8 @@
         </w:r>
       </w:hyperlink>
     </w:p>
-    <w:bookmarkEnd w:id="205"/>
-    <w:bookmarkStart w:id="207" w:name="ref-friedman2006"/>
+    <w:bookmarkEnd w:id="206"/>
+    <w:bookmarkStart w:id="208" w:name="ref-friedman2006"/>
     <w:p>
       <w:pPr>
         <w:pStyle w:val="Bibliography"/>
@@ -11545,7 +11559,7 @@
       <w:r>
         <w:t xml:space="preserve">Friedman N, Cai L, Xie XS. Linking stochastic dynamics to population distribution: An analytical framework of gene expression. Physical Review Letters. 2006;97: 168302. doi:</w:t>
       </w:r>
-      <w:hyperlink r:id="rId206">
+      <w:hyperlink r:id="rId207">
         <w:r>
           <w:rPr>
             <w:rStyle w:val="Hyperlink"/>
@@ -11554,8 +11568,8 @@
         </w:r>
       </w:hyperlink>
     </w:p>
-    <w:bookmarkEnd w:id="207"/>
-    <w:bookmarkStart w:id="209" w:name="ref-shahrezaei2008"/>
+    <w:bookmarkEnd w:id="208"/>
+    <w:bookmarkStart w:id="210" w:name="ref-shahrezaei2008"/>
     <w:p>
       <w:pPr>
         <w:pStyle w:val="Bibliography"/>
@@ -11572,7 +11586,7 @@
       <w:r>
         <w:t xml:space="preserve">Shahrezaei V, Swain PS. Analytical distributions for stochastic gene expression. Proceedings of the National Academy of Sciences. 2008;105: 17256–17261. doi:</w:t>
       </w:r>
-      <w:hyperlink r:id="rId208">
+      <w:hyperlink r:id="rId209">
         <w:r>
           <w:rPr>
             <w:rStyle w:val="Hyperlink"/>
@@ -11581,8 +11595,8 @@
         </w:r>
       </w:hyperlink>
     </w:p>
-    <w:bookmarkEnd w:id="209"/>
-    <w:bookmarkStart w:id="211" w:name="ref-sciml"/>
+    <w:bookmarkEnd w:id="210"/>
+    <w:bookmarkStart w:id="212" w:name="ref-sciml"/>
     <w:p>
       <w:pPr>
         <w:pStyle w:val="Bibliography"/>
@@ -11620,7 +11634,7 @@
       <w:r>
         <w:t xml:space="preserve">. Journal of Open Research Software. 2017;5: 15. doi:</w:t>
       </w:r>
-      <w:hyperlink r:id="rId210">
+      <w:hyperlink r:id="rId211">
         <w:r>
           <w:rPr>
             <w:rStyle w:val="Hyperlink"/>
@@ -11629,8 +11643,8 @@
         </w:r>
       </w:hyperlink>
     </w:p>
-    <w:bookmarkEnd w:id="211"/>
-    <w:bookmarkStart w:id="213" w:name="ref-huh2011"/>
+    <w:bookmarkEnd w:id="212"/>
+    <w:bookmarkStart w:id="214" w:name="ref-huh2011"/>
     <w:p>
       <w:pPr>
         <w:pStyle w:val="Bibliography"/>
@@ -11647,7 +11661,7 @@
       <w:r>
         <w:t xml:space="preserve">Huh D, Paulsson J. Non-genetic heterogeneity from stochastic partitioning at cell division. Nature Genetics. 2011;43: 95–100. doi:</w:t>
       </w:r>
-      <w:hyperlink r:id="rId212">
+      <w:hyperlink r:id="rId213">
         <w:r>
           <w:rPr>
             <w:rStyle w:val="Hyperlink"/>
@@ -11656,8 +11670,8 @@
         </w:r>
       </w:hyperlink>
     </w:p>
-    <w:bookmarkEnd w:id="213"/>
-    <w:bookmarkStart w:id="215" w:name="ref-huynhthu2010"/>
+    <w:bookmarkEnd w:id="214"/>
+    <w:bookmarkStart w:id="216" w:name="ref-huynhthu2010"/>
     <w:p>
       <w:pPr>
         <w:pStyle w:val="Bibliography"/>
@@ -11674,7 +11688,7 @@
       <w:r>
         <w:t xml:space="preserve">Huynh-Thu VA, Irrthum A, Wehenkel L, Geurts P. Inferring regulatory networks from expression data using tree-based methods. PLoS ONE. 2010;5: e12776. doi:</w:t>
       </w:r>
-      <w:hyperlink r:id="rId214">
+      <w:hyperlink r:id="rId215">
         <w:r>
           <w:rPr>
             <w:rStyle w:val="Hyperlink"/>
@@ -11683,8 +11697,8 @@
         </w:r>
       </w:hyperlink>
     </w:p>
-    <w:bookmarkEnd w:id="215"/>
-    <w:bookmarkStart w:id="217" w:name="ref-vandijk2018"/>
+    <w:bookmarkEnd w:id="216"/>
+    <w:bookmarkStart w:id="218" w:name="ref-vandijk2018"/>
     <w:p>
       <w:pPr>
         <w:pStyle w:val="Bibliography"/>
@@ -11701,7 +11715,7 @@
       <w:r>
         <w:t xml:space="preserve">Dijk D van, Sharma R, Nainys J, Yim K, Kathail P, Carr AJ, et al. Recovering gene interactions from single-cell data using data diffusion. Cell. 2018;174: 716–729. doi:</w:t>
       </w:r>
-      <w:hyperlink r:id="rId216">
+      <w:hyperlink r:id="rId217">
         <w:r>
           <w:rPr>
             <w:rStyle w:val="Hyperlink"/>
@@ -11710,8 +11724,8 @@
         </w:r>
       </w:hyperlink>
     </w:p>
-    <w:bookmarkEnd w:id="217"/>
-    <w:bookmarkStart w:id="219" w:name="ref-wagner2018"/>
+    <w:bookmarkEnd w:id="218"/>
+    <w:bookmarkStart w:id="220" w:name="ref-wagner2018"/>
     <w:p>
       <w:pPr>
         <w:pStyle w:val="Bibliography"/>
@@ -11740,7 +11754,7 @@
       <w:r>
         <w:t xml:space="preserve">data. bioRxiv. 2018. doi:</w:t>
       </w:r>
-      <w:hyperlink r:id="rId218">
+      <w:hyperlink r:id="rId219">
         <w:r>
           <w:rPr>
             <w:rStyle w:val="Hyperlink"/>
@@ -11749,9 +11763,9 @@
         </w:r>
       </w:hyperlink>
     </w:p>
-    <w:bookmarkEnd w:id="219"/>
     <w:bookmarkEnd w:id="220"/>
     <w:bookmarkEnd w:id="221"/>
+    <w:bookmarkEnd w:id="222"/>
     <w:sectPr/>
   </w:body>
 </w:document>

</xml_diff>